<commit_message>
docs: the Word / PDF exports regenerated (the File Viewer's RAM: volume; the theme's own fonts, Segoe UI and Consolas, in the PDFs)
Co-Authored-By: Claude Opus 5.5 <noreply@anthropic.com>
</commit_message>
<xml_diff>
--- a/docs/exports/01-PROJECT-OVERVIEW.docx
+++ b/docs/exports/01-PROJECT-OVERVIEW.docx
@@ -18,7 +18,7 @@
         <w:t xml:space="preserve">Onyx · multi-process OS on Raspberry Pi 4</w:t>
       </w:r>
     </w:p>
-    <w:bookmarkStart w:id="22" w:name="X14dbb8d34989bbb6ce0a693749d87edcb6cab80"/>
+    <w:bookmarkStart w:id="23" w:name="X14dbb8d34989bbb6ce0a693749d87edcb6cab80"/>
     <w:p>
       <w:pPr>
         <w:pStyle w:val="Heading2"/>
@@ -162,13 +162,45 @@
         <w:t xml:space="preserve"> </w:t>
       </w:r>
       <w:r>
-        <w:t xml:space="preserve">made up of a software compositor, a taskbar, a launcher, a terminal,</w:t>
-      </w:r>
-      <w:r>
-        <w:t xml:space="preserve"> </w:t>
-      </w:r>
-      <w:r>
-        <w:t xml:space="preserve">a file manager, and about thirty applications.</w:t>
+        <w:t xml:space="preserve">— a</w:t>
+      </w:r>
+      <w:r>
+        <w:t xml:space="preserve"> </w:t>
+      </w:r>
+      <w:r>
+        <w:t xml:space="preserve">compositor, a menu bar, a dock, a terminal, a file manager — and some ninety applications</w:t>
+      </w:r>
+      <w:r>
+        <w:t xml:space="preserve"> </w:t>
+      </w:r>
+      <w:r>
+        <w:t xml:space="preserve">and services (</w:t>
+      </w:r>
+      <w:r>
+        <w:rPr>
+          <w:rStyle w:val="VerbatimChar"/>
+        </w:rPr>
+        <w:t xml:space="preserve">sdcard/apps</w:t>
+      </w:r>
+      <w:r>
+        <w:t xml:space="preserve">), from an office suite and a web browser to emulators.</w:t>
+      </w:r>
+      <w:r>
+        <w:t xml:space="preserve"> </w:t>
+      </w:r>
+      <w:r>
+        <w:t xml:space="preserve">Our own code is under the MIT licence (</w:t>
+      </w:r>
+      <w:hyperlink r:id="rId19">
+        <w:r>
+          <w:rPr>
+            <w:rStyle w:val="Hyperlink"/>
+          </w:rPr>
+          <w:t xml:space="preserve">LICENSING.md</w:t>
+        </w:r>
+      </w:hyperlink>
+      <w:r>
+        <w:t xml:space="preserve">).</w:t>
       </w:r>
     </w:p>
     <w:p>
@@ -204,18 +236,18 @@
           <wp:inline>
             <wp:extent cx="5334000" cy="4000500"/>
             <wp:effectExtent b="0" l="0" r="0" t="0"/>
-            <wp:docPr descr="The Onyx desktop" title="" id="20" name="Picture"/>
+            <wp:docPr descr="The Onyx desktop" title="" id="21" name="Picture"/>
             <a:graphic>
               <a:graphicData uri="http://schemas.openxmlformats.org/drawingml/2006/picture">
                 <pic:pic>
                   <pic:nvPicPr>
-                    <pic:cNvPr descr="../screenshots/desktop.png" id="21" name="Picture"/>
+                    <pic:cNvPr descr="../screenshots/desktop.png" id="22" name="Picture"/>
                     <pic:cNvPicPr>
                       <a:picLocks noChangeArrowheads="1" noChangeAspect="1"/>
                     </pic:cNvPicPr>
                   </pic:nvPicPr>
                   <pic:blipFill>
-                    <a:blip r:embed="rId19"/>
+                    <a:blip r:embed="rId20"/>
                     <a:stretch>
                       <a:fillRect/>
                     </a:stretch>
@@ -280,8 +312,8 @@
         <w:t xml:space="preserve">with its Internet drawer open. (The real apps, run on a PC by the desktop simulator.)</w:t>
       </w:r>
     </w:p>
-    <w:bookmarkEnd w:id="22"/>
-    <w:bookmarkStart w:id="24" w:name="Xd640424531133ed57c940435731be17c3880fdc"/>
+    <w:bookmarkEnd w:id="23"/>
+    <w:bookmarkStart w:id="25" w:name="Xd640424531133ed57c940435731be17c3880fdc"/>
     <w:p>
       <w:pPr>
         <w:pStyle w:val="Heading2"/>
@@ -636,7 +668,7 @@
             <w:r>
               <w:t xml:space="preserve"> </w:t>
             </w:r>
-            <w:hyperlink r:id="rId23">
+            <w:hyperlink r:id="rId24">
               <w:r>
                 <w:rPr>
                   <w:rStyle w:val="Hyperlink"/>
@@ -759,8 +791,8 @@
         <w:t xml:space="preserve">sources.</w:t>
       </w:r>
     </w:p>
-    <w:bookmarkEnd w:id="24"/>
-    <w:bookmarkStart w:id="26" w:name="Xf0d948a12025d44e9afbc6dcf23238f6e9c5d4e"/>
+    <w:bookmarkEnd w:id="25"/>
+    <w:bookmarkStart w:id="28" w:name="Xf0d948a12025d44e9afbc6dcf23238f6e9c5d4e"/>
     <w:p>
       <w:pPr>
         <w:pStyle w:val="Heading2"/>
@@ -829,82 +861,73 @@
           <w:b/>
           <w:bCs/>
         </w:rPr>
-        <w:t xml:space="preserve">"Option C" execution model.</w:t>
-      </w:r>
-      <w:r>
-        <w:t xml:space="preserve"> </w:t>
-      </w:r>
-      <w:r>
-        <w:t xml:space="preserve">Applications run in</w:t>
-      </w:r>
-      <w:r>
-        <w:t xml:space="preserve"> </w:t>
-      </w:r>
-      <w:r>
-        <w:rPr>
-          <w:b/>
-          <w:bCs/>
-        </w:rPr>
-        <w:t xml:space="preserve">EL1</w:t>
-      </w:r>
-      <w:r>
-        <w:t xml:space="preserve"> </w:t>
-      </w:r>
-      <w:r>
-        <w:t xml:space="preserve">(privileged)</w:t>
-      </w:r>
-      <w:r>
-        <w:t xml:space="preserve"> </w:t>
-      </w:r>
-      <w:r>
-        <w:t xml:space="preserve">and call the kernel's functions directly (no</w:t>
-      </w:r>
-      <w:r>
-        <w:t xml:space="preserve"> </w:t>
-      </w:r>
-      <w:r>
-        <w:rPr>
-          <w:rStyle w:val="VerbatimChar"/>
-        </w:rPr>
-        <w:t xml:space="preserve">SVC</w:t>
-      </w:r>
-      <w:r>
-        <w:t xml:space="preserve"> </w:t>
-      </w:r>
-      <w:r>
-        <w:t xml:space="preserve">trap in the common</w:t>
-      </w:r>
-      <w:r>
-        <w:t xml:space="preserve"> </w:t>
-      </w:r>
-      <w:r>
-        <w:t xml:space="preserve">path). The trade-off: apps are isolated</w:t>
-      </w:r>
-      <w:r>
-        <w:t xml:space="preserve"> </w:t>
-      </w:r>
-      <w:r>
-        <w:rPr>
-          <w:b/>
-          <w:bCs/>
-        </w:rPr>
-        <w:t xml:space="preserve">from one another</w:t>
-      </w:r>
-      <w:r>
-        <w:t xml:space="preserve">, but</w:t>
-      </w:r>
-      <w:r>
-        <w:t xml:space="preserve"> </w:t>
-      </w:r>
-      <w:r>
-        <w:rPr>
-          <w:b/>
-          <w:bCs/>
-        </w:rPr>
-        <w:t xml:space="preserve">not from the kernel</w:t>
-      </w:r>
-      <w:r>
-        <w:t xml:space="preserve">.</w:t>
+        <w:t xml:space="preserve">Protected apps (EL0).</w:t>
+      </w:r>
+      <w:r>
+        <w:t xml:space="preserve"> </w:t>
+      </w:r>
+      <w:r>
+        <w:t xml:space="preserve">Applications run at</w:t>
+      </w:r>
+      <w:r>
+        <w:t xml:space="preserve"> </w:t>
+      </w:r>
+      <w:r>
+        <w:rPr>
+          <w:b/>
+          <w:bCs/>
+        </w:rPr>
+        <w:t xml:space="preserve">EL0</w:t>
+      </w:r>
+      <w:r>
+        <w:t xml:space="preserve">, the unprivileged level, and</w:t>
+      </w:r>
+      <w:r>
+        <w:t xml:space="preserve"> </w:t>
+      </w:r>
+      <w:r>
+        <w:t xml:space="preserve">call the kernel by</w:t>
+      </w:r>
+      <w:r>
+        <w:t xml:space="preserve"> </w:t>
+      </w:r>
+      <w:r>
+        <w:rPr>
+          <w:b/>
+          <w:bCs/>
+        </w:rPr>
+        <w:t xml:space="preserve">system calls</w:t>
+      </w:r>
+      <w:r>
+        <w:t xml:space="preserve"> </w:t>
+      </w:r>
+      <w:r>
+        <w:t xml:space="preserve">(</w:t>
+      </w:r>
+      <w:r>
+        <w:rPr>
+          <w:rStyle w:val="VerbatimChar"/>
+        </w:rPr>
+        <w:t xml:space="preserve">svc</w:t>
+      </w:r>
+      <w:r>
+        <w:t xml:space="preserve">): they are isolated from one another</w:t>
+      </w:r>
+      <w:r>
+        <w:t xml:space="preserve"> </w:t>
+      </w:r>
+      <w:r>
+        <w:rPr>
+          <w:b/>
+          <w:bCs/>
+        </w:rPr>
+        <w:t xml:space="preserve">and</w:t>
+      </w:r>
+      <w:r>
+        <w:t xml:space="preserve"> </w:t>
+      </w:r>
+      <w:r>
+        <w:t xml:space="preserve">from the kernel and the hardware. An app that crashes is killed; the system goes on.</w:t>
       </w:r>
       <w:r>
         <w:t xml:space="preserve"> </w:t>
@@ -947,7 +970,7 @@
         <w:t xml:space="preserve"> </w:t>
       </w:r>
       <w:r>
-        <w:t xml:space="preserve">The kernel publishes a</w:t>
+        <w:t xml:space="preserve">Each application sees a</w:t>
       </w:r>
       <w:r>
         <w:t xml:space="preserve"> </w:t>
@@ -977,37 +1000,23 @@
         <w:t xml:space="preserve"> </w:t>
       </w:r>
       <w:r>
-        <w:t xml:space="preserve">at a fixed virtual address, mapped read-only into each</w:t>
-      </w:r>
-      <w:r>
-        <w:t xml:space="preserve"> </w:t>
-      </w:r>
-      <w:r>
-        <w:t xml:space="preserve">application. Applications call the kernel through this table →</w:t>
-      </w:r>
-      <w:r>
-        <w:t xml:space="preserve"> </w:t>
-      </w:r>
-      <w:r>
-        <w:rPr>
-          <w:b/>
-          <w:bCs/>
-        </w:rPr>
-        <w:t xml:space="preserve">an application</w:t>
-      </w:r>
-      <w:r>
-        <w:rPr>
-          <w:b/>
-          <w:bCs/>
-        </w:rPr>
-        <w:t xml:space="preserve"> </w:t>
-      </w:r>
-      <w:r>
-        <w:rPr>
-          <w:b/>
-          <w:bCs/>
-        </w:rPr>
-        <w:t xml:space="preserve">binary keeps working without recompilation</w:t>
+        <w:t xml:space="preserve">at a fixed virtual address (14 GB), mapped read-only; each entry is a small</w:t>
+      </w:r>
+      <w:r>
+        <w:t xml:space="preserve"> </w:t>
+      </w:r>
+      <w:r>
+        <w:t xml:space="preserve">stub that makes the system call. Applications call the kernel through this table →</w:t>
+      </w:r>
+      <w:r>
+        <w:t xml:space="preserve"> </w:t>
+      </w:r>
+      <w:r>
+        <w:rPr>
+          <w:b/>
+          <w:bCs/>
+        </w:rPr>
+        <w:t xml:space="preserve">an application binary keeps working without recompilation</w:t>
       </w:r>
       <w:r>
         <w:t xml:space="preserve"> </w:t>
@@ -1042,7 +1051,7 @@
           <w:b/>
           <w:bCs/>
         </w:rPr>
-        <w:t xml:space="preserve">21</w:t>
+        <w:t xml:space="preserve">74</w:t>
       </w:r>
       <w:r>
         <w:t xml:space="preserve">).</w:t>
@@ -1061,31 +1070,37 @@
           <w:b/>
           <w:bCs/>
         </w:rPr>
-        <w:t xml:space="preserve">Full graphical desktop.</w:t>
-      </w:r>
-      <w:r>
-        <w:t xml:space="preserve"> </w:t>
-      </w:r>
-      <w:r>
-        <w:t xml:space="preserve">32-bit software compositor, window manager,</w:t>
-      </w:r>
-      <w:r>
-        <w:t xml:space="preserve"> </w:t>
-      </w:r>
-      <w:r>
-        <w:t xml:space="preserve">toolkit of kernel-drawn widgets (buttons, checkboxes, sliders,</w:t>
-      </w:r>
-      <w:r>
-        <w:t xml:space="preserve"> </w:t>
-      </w:r>
-      <w:r>
-        <w:t xml:space="preserve">text fields, scroll bars, icons…), windows with themeable decoration,</w:t>
-      </w:r>
-      <w:r>
-        <w:t xml:space="preserve"> </w:t>
-      </w:r>
-      <w:r>
-        <w:t xml:space="preserve">wallpaper, mouse cursor.</w:t>
+        <w:t xml:space="preserve">Threads, app cores, RAM volume.</w:t>
+      </w:r>
+      <w:r>
+        <w:t xml:space="preserve"> </w:t>
+      </w:r>
+      <w:r>
+        <w:t xml:space="preserve">An app may run threads (mutexes, events, a futex,</w:t>
+      </w:r>
+      <w:r>
+        <w:t xml:space="preserve"> </w:t>
+      </w:r>
+      <w:r>
+        <w:t xml:space="preserve">"real time" priority), take a whole CPU core for its own code (the emulators, Doom), and</w:t>
+      </w:r>
+      <w:r>
+        <w:t xml:space="preserve"> </w:t>
+      </w:r>
+      <w:r>
+        <w:t xml:space="preserve">keep files in memory on</w:t>
+      </w:r>
+      <w:r>
+        <w:t xml:space="preserve"> </w:t>
+      </w:r>
+      <w:r>
+        <w:rPr>
+          <w:rStyle w:val="VerbatimChar"/>
+        </w:rPr>
+        <w:t xml:space="preserve">RAM:</w:t>
+      </w:r>
+      <w:r>
+        <w:t xml:space="preserve">.</w:t>
       </w:r>
     </w:p>
     <w:p>
@@ -1101,29 +1116,19 @@
           <w:b/>
           <w:bCs/>
         </w:rPr>
-        <w:t xml:space="preserve">Onyx shell.</w:t>
-      </w:r>
-      <w:r>
-        <w:t xml:space="preserve"> </w:t>
-      </w:r>
-      <w:r>
-        <w:t xml:space="preserve">Panel/launcher (panel), app list, interactive terminal</w:t>
-      </w:r>
-      <w:r>
-        <w:t xml:space="preserve"> </w:t>
-      </w:r>
-      <w:r>
-        <w:t xml:space="preserve">with</w:t>
-      </w:r>
-      <w:r>
-        <w:t xml:space="preserve"> </w:t>
-      </w:r>
-      <w:r>
-        <w:rPr>
-          <w:b/>
-          <w:bCs/>
-        </w:rPr>
-        <w:t xml:space="preserve">pipes and redirection</w:t>
+        <w:t xml:space="preserve">The GPU.</w:t>
+      </w:r>
+      <w:r>
+        <w:t xml:space="preserve"> </w:t>
+      </w:r>
+      <w:r>
+        <w:t xml:space="preserve">The VideoCore VI's 3D unit (V3D) is driven by the kernel for the apps: 3D</w:t>
+      </w:r>
+      <w:r>
+        <w:t xml:space="preserve"> </w:t>
+      </w:r>
+      <w:r>
+        <w:t xml:space="preserve">(the N64 and GameCube emulators, the BASIC's 3D), and the compositing of layers</w:t>
       </w:r>
       <w:r>
         <w:t xml:space="preserve"> </w:t>
@@ -1135,64 +1140,10 @@
         <w:rPr>
           <w:rStyle w:val="VerbatimChar"/>
         </w:rPr>
-        <w:t xml:space="preserve">|</w:t>
-      </w:r>
-      <w:r>
-        <w:t xml:space="preserve">,</w:t>
-      </w:r>
-      <w:r>
-        <w:t xml:space="preserve"> </w:t>
-      </w:r>
-      <w:r>
-        <w:rPr>
-          <w:rStyle w:val="VerbatimChar"/>
-        </w:rPr>
-        <w:t xml:space="preserve">&gt;</w:t>
-      </w:r>
-      <w:r>
-        <w:t xml:space="preserve">,</w:t>
-      </w:r>
-      <w:r>
-        <w:t xml:space="preserve"> </w:t>
-      </w:r>
-      <w:r>
-        <w:rPr>
-          <w:rStyle w:val="VerbatimChar"/>
-        </w:rPr>
-        <w:t xml:space="preserve">&gt;&gt;</w:t>
-      </w:r>
-      <w:r>
-        <w:t xml:space="preserve">,</w:t>
-      </w:r>
-      <w:r>
-        <w:t xml:space="preserve"> </w:t>
-      </w:r>
-      <w:r>
-        <w:rPr>
-          <w:rStyle w:val="VerbatimChar"/>
-        </w:rPr>
-        <w:t xml:space="preserve">&lt;</w:t>
-      </w:r>
-      <w:r>
-        <w:t xml:space="preserve">), file manager, and a</w:t>
-      </w:r>
-      <w:r>
-        <w:t xml:space="preserve"> </w:t>
-      </w:r>
-      <w:r>
-        <w:t xml:space="preserve">collection of command-line tools in</w:t>
-      </w:r>
-      <w:r>
-        <w:t xml:space="preserve"> </w:t>
-      </w:r>
-      <w:r>
-        <w:rPr>
-          <w:rStyle w:val="VerbatimChar"/>
-        </w:rPr>
-        <w:t xml:space="preserve">/bin</w:t>
-      </w:r>
-      <w:r>
-        <w:t xml:space="preserve">.</w:t>
+        <w:t xml:space="preserve">user/gpucomp</w:t>
+      </w:r>
+      <w:r>
+        <w:t xml:space="preserve">: Paint's blend modes, Jet Browser).</w:t>
       </w:r>
     </w:p>
     <w:p>
@@ -1208,31 +1159,31 @@
           <w:b/>
           <w:bCs/>
         </w:rPr>
-        <w:t xml:space="preserve">Application catalog.</w:t>
-      </w:r>
-      <w:r>
-        <w:t xml:space="preserve"> </w:t>
-      </w:r>
-      <w:r>
-        <w:t xml:space="preserve">Text editor, spreadsheet, scientific calculator,</w:t>
-      </w:r>
-      <w:r>
-        <w:t xml:space="preserve"> </w:t>
-      </w:r>
-      <w:r>
-        <w:t xml:space="preserve">drawing program, fractal browser, calendar, task manager,</w:t>
-      </w:r>
-      <w:r>
-        <w:t xml:space="preserve"> </w:t>
-      </w:r>
-      <w:r>
-        <w:t xml:space="preserve">theme editor, and many games (Tetris, Snake, 2048, Minesweeper, Sokoban, Pong,</w:t>
-      </w:r>
-      <w:r>
-        <w:t xml:space="preserve"> </w:t>
-      </w:r>
-      <w:r>
-        <w:t xml:space="preserve">Game of Life, SameGame).</w:t>
+        <w:t xml:space="preserve">Full graphical desktop.</w:t>
+      </w:r>
+      <w:r>
+        <w:t xml:space="preserve"> </w:t>
+      </w:r>
+      <w:r>
+        <w:t xml:space="preserve">32-bit software compositor, window manager,</w:t>
+      </w:r>
+      <w:r>
+        <w:t xml:space="preserve"> </w:t>
+      </w:r>
+      <w:r>
+        <w:t xml:space="preserve">toolkit of kernel-drawn widgets (buttons, checkboxes, sliders,</w:t>
+      </w:r>
+      <w:r>
+        <w:t xml:space="preserve"> </w:t>
+      </w:r>
+      <w:r>
+        <w:t xml:space="preserve">text fields, scroll bars, icons…), windows with themeable decoration,</w:t>
+      </w:r>
+      <w:r>
+        <w:t xml:space="preserve"> </w:t>
+      </w:r>
+      <w:r>
+        <w:t xml:space="preserve">wallpaper, mouse cursor.</w:t>
       </w:r>
     </w:p>
     <w:p>
@@ -1248,19 +1199,110 @@
           <w:b/>
           <w:bCs/>
         </w:rPr>
-        <w:t xml:space="preserve">USB input devices.</w:t>
-      </w:r>
-      <w:r>
-        <w:t xml:space="preserve"> </w:t>
-      </w:r>
-      <w:r>
-        <w:t xml:space="preserve">Keyboard and mouse (HID), with hot-swappable keyboard</w:t>
-      </w:r>
-      <w:r>
-        <w:t xml:space="preserve"> </w:t>
-      </w:r>
-      <w:r>
-        <w:t xml:space="preserve">layout switching (US, UK, DE, FR, ES, IT, Dvorak).</w:t>
+        <w:t xml:space="preserve">Onyx shell.</w:t>
+      </w:r>
+      <w:r>
+        <w:t xml:space="preserve"> </w:t>
+      </w:r>
+      <w:r>
+        <w:t xml:space="preserve">A menu bar (the active app's menus, the clock, the Wi-Fi and volume</w:t>
+      </w:r>
+      <w:r>
+        <w:t xml:space="preserve"> </w:t>
+      </w:r>
+      <w:r>
+        <w:t xml:space="preserve">menus), a dock (drawers of apps, workspaces), notifications, a shared clipboard with a</w:t>
+      </w:r>
+      <w:r>
+        <w:t xml:space="preserve"> </w:t>
+      </w:r>
+      <w:r>
+        <w:t xml:space="preserve">history, an interactive terminal with</w:t>
+      </w:r>
+      <w:r>
+        <w:t xml:space="preserve"> </w:t>
+      </w:r>
+      <w:r>
+        <w:rPr>
+          <w:b/>
+          <w:bCs/>
+        </w:rPr>
+        <w:t xml:space="preserve">pipes and redirection</w:t>
+      </w:r>
+      <w:r>
+        <w:t xml:space="preserve"> </w:t>
+      </w:r>
+      <w:r>
+        <w:t xml:space="preserve">(</w:t>
+      </w:r>
+      <w:r>
+        <w:rPr>
+          <w:rStyle w:val="VerbatimChar"/>
+        </w:rPr>
+        <w:t xml:space="preserve">|</w:t>
+      </w:r>
+      <w:r>
+        <w:t xml:space="preserve">,</w:t>
+      </w:r>
+      <w:r>
+        <w:t xml:space="preserve"> </w:t>
+      </w:r>
+      <w:r>
+        <w:rPr>
+          <w:rStyle w:val="VerbatimChar"/>
+        </w:rPr>
+        <w:t xml:space="preserve">&gt;</w:t>
+      </w:r>
+      <w:r>
+        <w:t xml:space="preserve">,</w:t>
+      </w:r>
+      <w:r>
+        <w:t xml:space="preserve"> </w:t>
+      </w:r>
+      <w:r>
+        <w:rPr>
+          <w:rStyle w:val="VerbatimChar"/>
+        </w:rPr>
+        <w:t xml:space="preserve">&gt;&gt;</w:t>
+      </w:r>
+      <w:r>
+        <w:t xml:space="preserve">,</w:t>
+      </w:r>
+      <w:r>
+        <w:t xml:space="preserve"> </w:t>
+      </w:r>
+      <w:r>
+        <w:rPr>
+          <w:rStyle w:val="VerbatimChar"/>
+        </w:rPr>
+        <w:t xml:space="preserve">&lt;</w:t>
+      </w:r>
+      <w:r>
+        <w:t xml:space="preserve">), a</w:t>
+      </w:r>
+      <w:r>
+        <w:t xml:space="preserve"> </w:t>
+      </w:r>
+      <w:r>
+        <w:t xml:space="preserve">column file browser, a Control Panel, a first-run wizard (Setup), and some sixty</w:t>
+      </w:r>
+      <w:r>
+        <w:t xml:space="preserve"> </w:t>
+      </w:r>
+      <w:r>
+        <w:t xml:space="preserve">command-line tools in</w:t>
+      </w:r>
+      <w:r>
+        <w:t xml:space="preserve"> </w:t>
+      </w:r>
+      <w:r>
+        <w:rPr>
+          <w:rStyle w:val="VerbatimChar"/>
+        </w:rPr>
+        <w:t xml:space="preserve">/bin</w:t>
+      </w:r>
+      <w:r>
+        <w:t xml:space="preserve">.</w:t>
       </w:r>
     </w:p>
     <w:p>
@@ -1276,44 +1318,66 @@
           <w:b/>
           <w:bCs/>
         </w:rPr>
-        <w:t xml:space="preserve">Networking (WLAN).</w:t>
-      </w:r>
-      <w:r>
-        <w:t xml:space="preserve"> </w:t>
-      </w:r>
-      <w:r>
-        <w:t xml:space="preserve">TCP/IP stack + on-board Wi-Fi (BCM4343 /</w:t>
-      </w:r>
-      <w:r>
-        <w:t xml:space="preserve"> </w:t>
-      </w:r>
-      <w:r>
-        <w:rPr>
-          <w:rStyle w:val="VerbatimChar"/>
-        </w:rPr>
-        <w:t xml:space="preserve">wpa_supplicant</w:t>
-      </w:r>
-      <w:r>
-        <w:t xml:space="preserve">)</w:t>
-      </w:r>
-      <w:r>
-        <w:t xml:space="preserve"> </w:t>
-      </w:r>
-      <w:r>
-        <w:t xml:space="preserve">brought up on the primary core, TCP sockets exposed to apps through the ABI, an</w:t>
-      </w:r>
-      <w:r>
-        <w:t xml:space="preserve"> </w:t>
-      </w:r>
-      <w:r>
-        <w:rPr>
-          <w:b/>
-          <w:bCs/>
-        </w:rPr>
-        <w:t xml:space="preserve">IRC client</w:t>
-      </w:r>
-      <w:r>
-        <w:t xml:space="preserve">, and NTP clock synchronisation.</w:t>
+        <w:t xml:space="preserve">Application catalog</w:t>
+      </w:r>
+      <w:r>
+        <w:t xml:space="preserve"> </w:t>
+      </w:r>
+      <w:r>
+        <w:t xml:space="preserve">(</w:t>
+      </w:r>
+      <w:hyperlink r:id="rId26">
+        <w:r>
+          <w:rPr>
+            <w:rStyle w:val="Hyperlink"/>
+          </w:rPr>
+          <w:t xml:space="preserve">User guide §12</w:t>
+        </w:r>
+      </w:hyperlink>
+      <w:r>
+        <w:t xml:space="preserve">). Office:</w:t>
+      </w:r>
+      <w:r>
+        <w:t xml:space="preserve"> </w:t>
+      </w:r>
+      <w:r>
+        <w:t xml:space="preserve">Writer (word processor, PDF export), Spreadsheet, Cardfile (a small database), Ledger</w:t>
+      </w:r>
+      <w:r>
+        <w:t xml:space="preserve"> </w:t>
+      </w:r>
+      <w:r>
+        <w:t xml:space="preserve">(accounting), Calendar, PDF Viewer (MuPDF), RTF reader, Archiver. Internet: Jet Browser,</w:t>
+      </w:r>
+      <w:r>
+        <w:t xml:space="preserve"> </w:t>
+      </w:r>
+      <w:r>
+        <w:t xml:space="preserve">Mail, IRC, Courier (HTTP client), Lisa (an AI chat). Media: Paint, Photos, the Media</w:t>
+      </w:r>
+      <w:r>
+        <w:t xml:space="preserve"> </w:t>
+      </w:r>
+      <w:r>
+        <w:t xml:space="preserve">Player (music and video), Screenshot, Koton (a music studio with plugins), FM Tracker.</w:t>
+      </w:r>
+      <w:r>
+        <w:t xml:space="preserve"> </w:t>
+      </w:r>
+      <w:r>
+        <w:t xml:space="preserve">Emulators: Game Boy / Color, GBA, NES, SNES, N64, GameCube, with a Game Library. Games</w:t>
+      </w:r>
+      <w:r>
+        <w:t xml:space="preserve"> </w:t>
+      </w:r>
+      <w:r>
+        <w:t xml:space="preserve">(Doom on Freedoom, Tetris, Solitaire, FreeCell, Invaders, Arkanoid…), a BASIC with its</w:t>
+      </w:r>
+      <w:r>
+        <w:t xml:space="preserve"> </w:t>
+      </w:r>
+      <w:r>
+        <w:t xml:space="preserve">editor (QBasic), the Package Manager, a Task Manager, demos.</w:t>
       </w:r>
     </w:p>
     <w:p>
@@ -1329,6 +1393,162 @@
           <w:b/>
           <w:bCs/>
         </w:rPr>
+        <w:t xml:space="preserve">USB input devices.</w:t>
+      </w:r>
+      <w:r>
+        <w:t xml:space="preserve"> </w:t>
+      </w:r>
+      <w:r>
+        <w:t xml:space="preserve">Keyboard and mouse (HID), USB gamepads and MIDI keyboards, with</w:t>
+      </w:r>
+      <w:r>
+        <w:t xml:space="preserve"> </w:t>
+      </w:r>
+      <w:r>
+        <w:t xml:space="preserve">keyboard layouts loaded from the card (US, UK, DE, FR, BE, ES, IT, Dvorak).</w:t>
+      </w:r>
+    </w:p>
+    <w:p>
+      <w:pPr>
+        <w:pStyle w:val="Compact"/>
+        <w:numPr>
+          <w:ilvl w:val="0"/>
+          <w:numId w:val="1001"/>
+        </w:numPr>
+      </w:pPr>
+      <w:r>
+        <w:rPr>
+          <w:b/>
+          <w:bCs/>
+        </w:rPr>
+        <w:t xml:space="preserve">Networking (WLAN).</w:t>
+      </w:r>
+      <w:r>
+        <w:t xml:space="preserve"> </w:t>
+      </w:r>
+      <w:r>
+        <w:t xml:space="preserve">TCP/IP stack + on-board Wi-Fi (BCM4343 /</w:t>
+      </w:r>
+      <w:r>
+        <w:t xml:space="preserve"> </w:t>
+      </w:r>
+      <w:r>
+        <w:rPr>
+          <w:rStyle w:val="VerbatimChar"/>
+        </w:rPr>
+        <w:t xml:space="preserve">wpa_supplicant</w:t>
+      </w:r>
+      <w:r>
+        <w:t xml:space="preserve">), on</w:t>
+      </w:r>
+      <w:r>
+        <w:t xml:space="preserve"> </w:t>
+      </w:r>
+      <w:r>
+        <w:t xml:space="preserve">core 3 (</w:t>
+      </w:r>
+      <w:r>
+        <w:rPr>
+          <w:rStyle w:val="VerbatimChar"/>
+        </w:rPr>
+        <w:t xml:space="preserve">netcore=1</w:t>
+      </w:r>
+      <w:r>
+        <w:t xml:space="preserve">, the shipped card) or core 0; TCP sockets exposed to apps through the</w:t>
+      </w:r>
+      <w:r>
+        <w:t xml:space="preserve"> </w:t>
+      </w:r>
+      <w:r>
+        <w:t xml:space="preserve">ABI, TLS in user space, NTP clock synchronisation, and remote access: a telnet shell, VNC,</w:t>
+      </w:r>
+      <w:r>
+        <w:t xml:space="preserve"> </w:t>
+      </w:r>
+      <w:r>
+        <w:t xml:space="preserve">a window-level remote desktop for Windows (</w:t>
+      </w:r>
+      <w:r>
+        <w:rPr>
+          <w:rStyle w:val="VerbatimChar"/>
+        </w:rPr>
+        <w:t xml:space="preserve">rdpd</w:t>
+      </w:r>
+      <w:r>
+        <w:t xml:space="preserve"> </w:t>
+      </w:r>
+      <w:r>
+        <w:t xml:space="preserve">+ Onyx Remote), an FTP server.</w:t>
+      </w:r>
+    </w:p>
+    <w:p>
+      <w:pPr>
+        <w:pStyle w:val="Compact"/>
+        <w:numPr>
+          <w:ilvl w:val="0"/>
+          <w:numId w:val="1001"/>
+        </w:numPr>
+      </w:pPr>
+      <w:r>
+        <w:rPr>
+          <w:b/>
+          <w:bCs/>
+        </w:rPr>
+        <w:t xml:space="preserve">Packages.</w:t>
+      </w:r>
+      <w:r>
+        <w:t xml:space="preserve"> </w:t>
+      </w:r>
+      <w:r>
+        <w:t xml:space="preserve">Every app is a signed package of the</w:t>
+      </w:r>
+      <w:r>
+        <w:t xml:space="preserve"> </w:t>
+      </w:r>
+      <w:r>
+        <w:rPr>
+          <w:rStyle w:val="VerbatimChar"/>
+        </w:rPr>
+        <w:t xml:space="preserve">onyx-packages</w:t>
+      </w:r>
+      <w:r>
+        <w:t xml:space="preserve"> </w:t>
+      </w:r>
+      <w:r>
+        <w:t xml:space="preserve">repository:</w:t>
+      </w:r>
+      <w:r>
+        <w:t xml:space="preserve"> </w:t>
+      </w:r>
+      <w:r>
+        <w:rPr>
+          <w:rStyle w:val="VerbatimChar"/>
+        </w:rPr>
+        <w:t xml:space="preserve">pkg</w:t>
+      </w:r>
+      <w:r>
+        <w:t xml:space="preserve">, the</w:t>
+      </w:r>
+      <w:r>
+        <w:t xml:space="preserve"> </w:t>
+      </w:r>
+      <w:r>
+        <w:t xml:space="preserve">Package Manager and an update daemon keep a card up to date.</w:t>
+      </w:r>
+    </w:p>
+    <w:p>
+      <w:pPr>
+        <w:pStyle w:val="Compact"/>
+        <w:numPr>
+          <w:ilvl w:val="0"/>
+          <w:numId w:val="1001"/>
+        </w:numPr>
+      </w:pPr>
+      <w:r>
+        <w:rPr>
+          <w:b/>
+          <w:bCs/>
+        </w:rPr>
         <w:t xml:space="preserve">A modern web browser.</w:t>
       </w:r>
       <w:r>
@@ -1463,7 +1683,7 @@
       <w:r>
         <w:t xml:space="preserve"> </w:t>
       </w:r>
-      <w:hyperlink r:id="rId25">
+      <w:hyperlink r:id="rId27">
         <w:r>
           <w:rPr>
             <w:rStyle w:val="Hyperlink"/>
@@ -1472,17 +1692,38 @@
         </w:r>
       </w:hyperlink>
       <w:r>
-        <w:t xml:space="preserve">. (A dedicated network core is a</w:t>
-      </w:r>
-      <w:r>
-        <w:t xml:space="preserve"> </w:t>
-      </w:r>
-      <w:r>
-        <w:t xml:space="preserve">planned next step.)</w:t>
-      </w:r>
-    </w:p>
-    <w:bookmarkEnd w:id="26"/>
-    <w:bookmarkStart w:id="27" w:name="X66f2bb71df6feea41223d9c271803389d6670e0"/>
+        <w:t xml:space="preserve">. Video and audio too</w:t>
+      </w:r>
+      <w:r>
+        <w:t xml:space="preserve"> </w:t>
+      </w:r>
+      <w:r>
+        <w:t xml:space="preserve">(</w:t>
+      </w:r>
+      <w:r>
+        <w:rPr>
+          <w:rStyle w:val="VerbatimChar"/>
+        </w:rPr>
+        <w:t xml:space="preserve">&lt;video&gt;</w:t>
+      </w:r>
+      <w:r>
+        <w:t xml:space="preserve">,</w:t>
+      </w:r>
+      <w:r>
+        <w:t xml:space="preserve"> </w:t>
+      </w:r>
+      <w:r>
+        <w:rPr>
+          <w:rStyle w:val="VerbatimChar"/>
+        </w:rPr>
+        <w:t xml:space="preserve">&lt;audio&gt;</w:t>
+      </w:r>
+      <w:r>
+        <w:t xml:space="preserve">, MSE).</w:t>
+      </w:r>
+    </w:p>
+    <w:bookmarkEnd w:id="28"/>
+    <w:bookmarkStart w:id="29" w:name="X66f2bb71df6feea41223d9c271803389d6670e0"/>
     <w:p>
       <w:pPr>
         <w:pStyle w:val="Heading2"/>
@@ -1508,7 +1749,7 @@
         <w:rPr>
           <w:rStyle w:val="VerbatimChar"/>
         </w:rPr>
-        <w:t xml:space="preserve">│  Applications (ELF EL1, isolated by ASID)                        │</w:t>
+        <w:t xml:space="preserve">│  Applications (ELF EL0, isolated by ASID)                        │</w:t>
       </w:r>
       <w:r>
         <w:br/>
@@ -1517,7 +1758,7 @@
         <w:rPr>
           <w:rStyle w:val="VerbatimChar"/>
         </w:rPr>
-        <w:t xml:space="preserve">│  panel · applist · terminal · fileviewer · tinypad · games · bin │</w:t>
+        <w:t xml:space="preserve">│  menubar · dock · terminal · fileviewer · writer · jet · bin …   │</w:t>
       </w:r>
       <w:r>
         <w:br/>
@@ -1544,7 +1785,7 @@
         <w:rPr>
           <w:rStyle w:val="VerbatimChar"/>
         </w:rPr>
-        <w:t xml:space="preserve">│       ▼   kapi ABI table  (at 14 GB, read-only in every app)     │   ← stable contract</w:t>
+        <w:t xml:space="preserve">│       ▼   kapi table at 14 GB (read-only) → stubs: svc #0        │   ← stable contract</w:t>
       </w:r>
       <w:r>
         <w:br/>
@@ -1553,6 +1794,87 @@
         <w:rPr>
           <w:rStyle w:val="VerbatimChar"/>
         </w:rPr>
+        <w:t xml:space="preserve">╞═══════╪══════════════════ EL0 / EL1 ═════════════════════════════╡</w:t>
+      </w:r>
+      <w:r>
+        <w:br/>
+      </w:r>
+      <w:r>
+        <w:rPr>
+          <w:rStyle w:val="VerbatimChar"/>
+        </w:rPr>
+        <w:t xml:space="preserve">│  ONYX KERNEL (EL1)                                               │</w:t>
+      </w:r>
+      <w:r>
+        <w:br/>
+      </w:r>
+      <w:r>
+        <w:rPr>
+          <w:rStyle w:val="VerbatimChar"/>
+        </w:rPr>
+        <w:t xml:space="preserve">│   • mm/      per-process address spaces, MMU, ASID               │</w:t>
+      </w:r>
+      <w:r>
+        <w:br/>
+      </w:r>
+      <w:r>
+        <w:rPr>
+          <w:rStyle w:val="VerbatimChar"/>
+        </w:rPr>
+        <w:t xml:space="preserve">│   • sched/   preemptive scheduler (replaces Circle's)            │</w:t>
+      </w:r>
+      <w:r>
+        <w:br/>
+      </w:r>
+      <w:r>
+        <w:rPr>
+          <w:rStyle w:val="VerbatimChar"/>
+        </w:rPr>
+        <w:t xml:space="preserve">│   • arch/    VBAR_EL1 vectors, trap frame, EL0 entry/exit        │</w:t>
+      </w:r>
+      <w:r>
+        <w:br/>
+      </w:r>
+      <w:r>
+        <w:rPr>
+          <w:rStyle w:val="VerbatimChar"/>
+        </w:rPr>
+        <w:t xml:space="preserve">│   • proc/    ELF64 loader                                        │</w:t>
+      </w:r>
+      <w:r>
+        <w:br/>
+      </w:r>
+      <w:r>
+        <w:rPr>
+          <w:rStyle w:val="VerbatimChar"/>
+        </w:rPr>
+        <w:t xml:space="preserve">│   • sys/     kapi impl., system calls, handles, streams, threads,│</w:t>
+      </w:r>
+      <w:r>
+        <w:br/>
+      </w:r>
+      <w:r>
+        <w:rPr>
+          <w:rStyle w:val="VerbatimChar"/>
+        </w:rPr>
+        <w:t xml:space="preserve">│              network, sound, app cores, GPU (V3D), RAM: volume   │</w:t>
+      </w:r>
+      <w:r>
+        <w:br/>
+      </w:r>
+      <w:r>
+        <w:rPr>
+          <w:rStyle w:val="VerbatimChar"/>
+        </w:rPr>
+        <w:t xml:space="preserve">│   • gui/     GImage (software renderer), compositor+WM, cursor   │</w:t>
+      </w:r>
+      <w:r>
+        <w:br/>
+      </w:r>
+      <w:r>
+        <w:rPr>
+          <w:rStyle w:val="VerbatimChar"/>
+        </w:rPr>
         <w:t xml:space="preserve">├──────────────────────────────────────────────────────────────────┤</w:t>
       </w:r>
       <w:r>
@@ -1562,7 +1884,7 @@
         <w:rPr>
           <w:rStyle w:val="VerbatimChar"/>
         </w:rPr>
-        <w:t xml:space="preserve">│  ONYX KERNEL (EL1)                                             │</w:t>
+        <w:t xml:space="preserve">│  CIRCLE  (HAL + drivers; our fork, a few patches: docs/05)       │</w:t>
       </w:r>
       <w:r>
         <w:br/>
@@ -1571,7 +1893,7 @@
         <w:rPr>
           <w:rStyle w:val="VerbatimChar"/>
         </w:rPr>
-        <w:t xml:space="preserve">│   • mm/      per-process address spaces, MMU, ASID               │</w:t>
+        <w:t xml:space="preserve">│   palloc · GIC · timer · EMMC+FatFs · USB · WLAN · TCP/IP · fb   │</w:t>
       </w:r>
       <w:r>
         <w:br/>
@@ -1580,7 +1902,7 @@
         <w:rPr>
           <w:rStyle w:val="VerbatimChar"/>
         </w:rPr>
-        <w:t xml:space="preserve">│   • sched/   preemptive scheduler (replaces Circle's)            │</w:t>
+        <w:t xml:space="preserve">├──────────────────────────────────────────────────────────────────┤</w:t>
       </w:r>
       <w:r>
         <w:br/>
@@ -1589,7 +1911,7 @@
         <w:rPr>
           <w:rStyle w:val="VerbatimChar"/>
         </w:rPr>
-        <w:t xml:space="preserve">│   • arch/    VBAR_EL1 exception vectors, trap frame              │</w:t>
+        <w:t xml:space="preserve">│  Raspberry Pi 4  (BCM2711, 4× Cortex-A72, ARMv8-A)               │</w:t>
       </w:r>
       <w:r>
         <w:br/>
@@ -1598,98 +1920,17 @@
         <w:rPr>
           <w:rStyle w:val="VerbatimChar"/>
         </w:rPr>
-        <w:t xml:space="preserve">│   • proc/    ELF64 loader                                        │</w:t>
-      </w:r>
-      <w:r>
-        <w:br/>
-      </w:r>
-      <w:r>
-        <w:rPr>
-          <w:rStyle w:val="VerbatimChar"/>
-        </w:rPr>
-        <w:t xml:space="preserve">│   • sys/     kapi impl., stream/stdio, debug console             │</w:t>
-      </w:r>
-      <w:r>
-        <w:br/>
-      </w:r>
-      <w:r>
-        <w:rPr>
-          <w:rStyle w:val="VerbatimChar"/>
-        </w:rPr>
-        <w:t xml:space="preserve">│   • gui/     GImage (software renderer), compositor+WM, cursor,  │</w:t>
-      </w:r>
-      <w:r>
-        <w:br/>
-      </w:r>
-      <w:r>
-        <w:rPr>
-          <w:rStyle w:val="VerbatimChar"/>
-        </w:rPr>
-        <w:t xml:space="preserve">│              modal dialogs                                       │</w:t>
-      </w:r>
-      <w:r>
-        <w:br/>
-      </w:r>
-      <w:r>
-        <w:rPr>
-          <w:rStyle w:val="VerbatimChar"/>
-        </w:rPr>
-        <w:t xml:space="preserve">├──────────────────────────────────────────────────────────────────┤</w:t>
-      </w:r>
-      <w:r>
-        <w:br/>
-      </w:r>
-      <w:r>
-        <w:rPr>
-          <w:rStyle w:val="VerbatimChar"/>
-        </w:rPr>
-        <w:t xml:space="preserve">│  CIRCLE  (HAL + drivers, reused as-is)                           │</w:t>
-      </w:r>
-      <w:r>
-        <w:br/>
-      </w:r>
-      <w:r>
-        <w:rPr>
-          <w:rStyle w:val="VerbatimChar"/>
-        </w:rPr>
-        <w:t xml:space="preserve">│   palloc · GIC · timer · EMMC+FatFs · USB HID · framebuffer 2D     │</w:t>
-      </w:r>
-      <w:r>
-        <w:br/>
-      </w:r>
-      <w:r>
-        <w:rPr>
-          <w:rStyle w:val="VerbatimChar"/>
-        </w:rPr>
-        <w:t xml:space="preserve">├──────────────────────────────────────────────────────────────────┤</w:t>
-      </w:r>
-      <w:r>
-        <w:br/>
-      </w:r>
-      <w:r>
-        <w:rPr>
-          <w:rStyle w:val="VerbatimChar"/>
-        </w:rPr>
-        <w:t xml:space="preserve">│  Raspberry Pi 4  (BCM2711, 4× Cortex-A72, ARMv8-A)                 │</w:t>
-      </w:r>
-      <w:r>
-        <w:br/>
-      </w:r>
-      <w:r>
-        <w:rPr>
-          <w:rStyle w:val="VerbatimChar"/>
-        </w:rPr>
         <w:t xml:space="preserve">└──────────────────────────────────────────────────────────────────┘</w:t>
       </w:r>
     </w:p>
-    <w:bookmarkEnd w:id="27"/>
-    <w:bookmarkStart w:id="28" w:name="X4f15d84e61999e5f959f5f631aad5e48a6ab540"/>
+    <w:bookmarkEnd w:id="29"/>
+    <w:bookmarkStart w:id="31" w:name="Xe020df86a20dd184672bf24142e3014208d91a9"/>
     <w:p>
       <w:pPr>
         <w:pStyle w:val="Heading2"/>
       </w:pPr>
       <w:r>
-        <w:t xml:space="preserve">5. The "Option C" execution model</w:t>
+        <w:t xml:space="preserve">5. The execution model: apps at EL0</w:t>
       </w:r>
     </w:p>
     <w:p>
@@ -1697,35 +1938,7 @@
         <w:pStyle w:val="FirstParagraph"/>
       </w:pPr>
       <w:r>
-        <w:t xml:space="preserve">This is the most structurally defining architectural decision. After prototyping</w:t>
-      </w:r>
-      <w:r>
-        <w:t xml:space="preserve"> </w:t>
-      </w:r>
-      <w:r>
-        <w:t xml:space="preserve">EL0 processes + system calls (</w:t>
-      </w:r>
-      <w:r>
-        <w:rPr>
-          <w:rStyle w:val="VerbatimChar"/>
-        </w:rPr>
-        <w:t xml:space="preserve">SVC</w:t>
-      </w:r>
-      <w:r>
-        <w:t xml:space="preserve">), the project switched to</w:t>
-      </w:r>
-      <w:r>
-        <w:t xml:space="preserve"> </w:t>
-      </w:r>
-      <w:r>
-        <w:rPr>
-          <w:b/>
-          <w:bCs/>
-        </w:rPr>
-        <w:t xml:space="preserve">Option C</w:t>
-      </w:r>
-      <w:r>
-        <w:t xml:space="preserve">:</w:t>
+        <w:t xml:space="preserve">The most structurally defining architectural decision. Since kapi v74 (2026-10-02):</w:t>
       </w:r>
     </w:p>
     <w:p>
@@ -1737,53 +1950,42 @@
         </w:numPr>
       </w:pPr>
       <w:r>
-        <w:t xml:space="preserve">Applications run in</w:t>
-      </w:r>
-      <w:r>
-        <w:t xml:space="preserve"> </w:t>
-      </w:r>
-      <w:r>
-        <w:rPr>
-          <w:b/>
-          <w:bCs/>
-        </w:rPr>
-        <w:t xml:space="preserve">EL1</w:t>
-      </w:r>
-      <w:r>
-        <w:t xml:space="preserve"> </w:t>
-      </w:r>
-      <w:r>
-        <w:t xml:space="preserve">(the same privilege level as the kernel),</w:t>
-      </w:r>
-      <w:r>
-        <w:t xml:space="preserve"> </w:t>
-      </w:r>
-      <w:r>
-        <w:rPr>
-          <w:b/>
-          <w:bCs/>
-        </w:rPr>
-        <w:t xml:space="preserve">each</w:t>
-      </w:r>
-      <w:r>
-        <w:rPr>
-          <w:b/>
-          <w:bCs/>
-        </w:rPr>
-        <w:t xml:space="preserve"> </w:t>
-      </w:r>
-      <w:r>
-        <w:rPr>
-          <w:b/>
-          <w:bCs/>
-        </w:rPr>
-        <w:t xml:space="preserve">in its own page table</w:t>
-      </w:r>
-      <w:r>
-        <w:t xml:space="preserve"> </w:t>
-      </w:r>
-      <w:r>
-        <w:t xml:space="preserve">tagged by ASID.</w:t>
+        <w:t xml:space="preserve">Applications run at</w:t>
+      </w:r>
+      <w:r>
+        <w:t xml:space="preserve"> </w:t>
+      </w:r>
+      <w:r>
+        <w:rPr>
+          <w:b/>
+          <w:bCs/>
+        </w:rPr>
+        <w:t xml:space="preserve">EL0</w:t>
+      </w:r>
+      <w:r>
+        <w:t xml:space="preserve">,</w:t>
+      </w:r>
+      <w:r>
+        <w:t xml:space="preserve"> </w:t>
+      </w:r>
+      <w:r>
+        <w:rPr>
+          <w:b/>
+          <w:bCs/>
+        </w:rPr>
+        <w:t xml:space="preserve">each in its own page table</w:t>
+      </w:r>
+      <w:r>
+        <w:t xml:space="preserve"> </w:t>
+      </w:r>
+      <w:r>
+        <w:t xml:space="preserve">tagged by ASID; the kernel's</w:t>
+      </w:r>
+      <w:r>
+        <w:t xml:space="preserve"> </w:t>
+      </w:r>
+      <w:r>
+        <w:t xml:space="preserve">memory, the devices and the other apps' pages are out of their reach (EL1-only mappings).</w:t>
       </w:r>
     </w:p>
     <w:p>
@@ -1805,34 +2007,106 @@
           <w:b/>
           <w:bCs/>
         </w:rPr>
-        <w:t xml:space="preserve">call the kernel's functions directly</w:t>
-      </w:r>
-      <w:r>
-        <w:t xml:space="preserve"> </w:t>
-      </w:r>
-      <w:r>
-        <w:t xml:space="preserve">via the</w:t>
-      </w:r>
-      <w:r>
-        <w:t xml:space="preserve"> </w:t>
-      </w:r>
-      <w:r>
-        <w:rPr>
-          <w:rStyle w:val="VerbatimChar"/>
+        <w:t xml:space="preserve">call the kernel through the</w:t>
+      </w:r>
+      <w:r>
+        <w:rPr>
+          <w:b/>
+          <w:bCs/>
+        </w:rPr>
+        <w:t xml:space="preserve"> </w:t>
+      </w:r>
+      <w:r>
+        <w:rPr>
+          <w:rStyle w:val="VerbatimChar"/>
+          <w:b/>
+          <w:bCs/>
         </w:rPr>
         <w:t xml:space="preserve">kapi</w:t>
       </w:r>
       <w:r>
-        <w:t xml:space="preserve"> </w:t>
-      </w:r>
-      <w:r>
-        <w:t xml:space="preserve">ABI table — no</w:t>
-      </w:r>
-      <w:r>
-        <w:t xml:space="preserve"> </w:t>
-      </w:r>
-      <w:r>
-        <w:t xml:space="preserve">system trap in the normal path.</w:t>
+        <w:rPr>
+          <w:b/>
+          <w:bCs/>
+        </w:rPr>
+        <w:t xml:space="preserve"> </w:t>
+      </w:r>
+      <w:r>
+        <w:rPr>
+          <w:b/>
+          <w:bCs/>
+        </w:rPr>
+        <w:t xml:space="preserve">table</w:t>
+      </w:r>
+      <w:r>
+        <w:t xml:space="preserve"> </w:t>
+      </w:r>
+      <w:r>
+        <w:t xml:space="preserve">at a fixed address, as before — but in an</w:t>
+      </w:r>
+      <w:r>
+        <w:t xml:space="preserve"> </w:t>
+      </w:r>
+      <w:r>
+        <w:t xml:space="preserve">app that table points at small stubs (</w:t>
+      </w:r>
+      <w:r>
+        <w:rPr>
+          <w:rStyle w:val="VerbatimChar"/>
+        </w:rPr>
+        <w:t xml:space="preserve">mov x8, #slot; svc #0; ret</w:t>
+      </w:r>
+      <w:r>
+        <w:t xml:space="preserve">): every kapi is a</w:t>
+      </w:r>
+      <w:r>
+        <w:t xml:space="preserve"> </w:t>
+      </w:r>
+      <w:r>
+        <w:rPr>
+          <w:b/>
+          <w:bCs/>
+        </w:rPr>
+        <w:t xml:space="preserve">system call</w:t>
+      </w:r>
+      <w:r>
+        <w:t xml:space="preserve">, its pointers checked, its handles per process.</w:t>
+      </w:r>
+      <w:r>
+        <w:t xml:space="preserve"> </w:t>
+      </w:r>
+      <w:r>
+        <w:rPr>
+          <w:rStyle w:val="VerbatimChar"/>
+        </w:rPr>
+        <w:t xml:space="preserve">memcpy</w:t>
+      </w:r>
+      <w:r>
+        <w:t xml:space="preserve"> </w:t>
+      </w:r>
+      <w:r>
+        <w:t xml:space="preserve">/</w:t>
+      </w:r>
+      <w:r>
+        <w:t xml:space="preserve"> </w:t>
+      </w:r>
+      <w:r>
+        <w:rPr>
+          <w:rStyle w:val="VerbatimChar"/>
+        </w:rPr>
+        <w:t xml:space="preserve">memset</w:t>
+      </w:r>
+      <w:r>
+        <w:t xml:space="preserve"> </w:t>
+      </w:r>
+      <w:r>
+        <w:t xml:space="preserve">and the</w:t>
+      </w:r>
+      <w:r>
+        <w:t xml:space="preserve"> </w:t>
+      </w:r>
+      <w:r>
+        <w:t xml:space="preserve">event pump run in the app itself (no system call). Existing binaries kept working unchanged.</w:t>
       </w:r>
     </w:p>
     <w:p>
@@ -1848,68 +2122,31 @@
           <w:b/>
           <w:bCs/>
         </w:rPr>
-        <w:t xml:space="preserve">Isolation:</w:t>
-      </w:r>
-      <w:r>
-        <w:t xml:space="preserve"> </w:t>
-      </w:r>
-      <w:r>
-        <w:t xml:space="preserve">applications are isolated</w:t>
-      </w:r>
-      <w:r>
-        <w:t xml:space="preserve"> </w:t>
-      </w:r>
-      <w:r>
-        <w:rPr>
-          <w:b/>
-          <w:bCs/>
-        </w:rPr>
-        <w:t xml:space="preserve">from one another</w:t>
-      </w:r>
-      <w:r>
-        <w:t xml:space="preserve"> </w:t>
-      </w:r>
-      <w:r>
-        <w:t xml:space="preserve">(a distinct</w:t>
-      </w:r>
-      <w:r>
-        <w:t xml:space="preserve"> </w:t>
-      </w:r>
-      <w:r>
-        <w:t xml:space="preserve">ASID/TTBR0 per app; an app cannot address another's pages). The</w:t>
-      </w:r>
-      <w:r>
-        <w:t xml:space="preserve"> </w:t>
-      </w:r>
-      <w:r>
-        <w:rPr>
-          <w:b/>
-          <w:bCs/>
-        </w:rPr>
-        <w:t xml:space="preserve">kernel is not</w:t>
-      </w:r>
-      <w:r>
-        <w:rPr>
-          <w:b/>
-          <w:bCs/>
-        </w:rPr>
-        <w:t xml:space="preserve"> </w:t>
-      </w:r>
-      <w:r>
-        <w:rPr>
-          <w:b/>
-          <w:bCs/>
-        </w:rPr>
-        <w:t xml:space="preserve">protected</w:t>
-      </w:r>
-      <w:r>
-        <w:t xml:space="preserve">: an EL1 app can technically touch the kernel's memory. This is the</w:t>
-      </w:r>
-      <w:r>
-        <w:t xml:space="preserve"> </w:t>
-      </w:r>
-      <w:r>
-        <w:t xml:space="preserve">accepted trade-off in exchange for the ergonomics of direct calls.</w:t>
+        <w:t xml:space="preserve">A fault in an app kills that app</w:t>
+      </w:r>
+      <w:r>
+        <w:t xml:space="preserve"> </w:t>
+      </w:r>
+      <w:r>
+        <w:t xml:space="preserve">(a notice on the desktop, a line in</w:t>
+      </w:r>
+      <w:r>
+        <w:t xml:space="preserve"> </w:t>
+      </w:r>
+      <w:r>
+        <w:rPr>
+          <w:rStyle w:val="VerbatimChar"/>
+        </w:rPr>
+        <w:t xml:space="preserve">kmsg</w:t>
+      </w:r>
+      <w:r>
+        <w:t xml:space="preserve">), never the</w:t>
+      </w:r>
+      <w:r>
+        <w:t xml:space="preserve"> </w:t>
+      </w:r>
+      <w:r>
+        <w:t xml:space="preserve">machine.</w:t>
       </w:r>
     </w:p>
     <w:p>
@@ -1921,56 +2158,43 @@
         </w:numPr>
       </w:pPr>
       <w:r>
-        <w:t xml:space="preserve">The EL0/</w:t>
-      </w:r>
-      <w:r>
-        <w:rPr>
-          <w:rStyle w:val="VerbatimChar"/>
-        </w:rPr>
-        <w:t xml:space="preserve">SVC</w:t>
-      </w:r>
-      <w:r>
-        <w:t xml:space="preserve"> </w:t>
-      </w:r>
-      <w:r>
-        <w:t xml:space="preserve">machinery (vectors, system-call dispatch)</w:t>
-      </w:r>
-      <w:r>
-        <w:t xml:space="preserve"> </w:t>
-      </w:r>
-      <w:r>
-        <w:rPr>
-          <w:b/>
-          <w:bCs/>
-        </w:rPr>
-        <w:t xml:space="preserve">still exists but is</w:t>
-      </w:r>
-      <w:r>
-        <w:rPr>
-          <w:b/>
-          <w:bCs/>
-        </w:rPr>
-        <w:t xml:space="preserve"> </w:t>
-      </w:r>
-      <w:r>
-        <w:rPr>
-          <w:b/>
-          <w:bCs/>
-        </w:rPr>
-        <w:t xml:space="preserve">inert</w:t>
-      </w:r>
-      <w:r>
-        <w:t xml:space="preserve">; it could be reused if one wanted true EL0 applications isolated from the</w:t>
-      </w:r>
-      <w:r>
-        <w:t xml:space="preserve"> </w:t>
-      </w:r>
-      <w:r>
-        <w:t xml:space="preserve">kernel.</w:t>
-      </w:r>
-    </w:p>
-    <w:bookmarkEnd w:id="28"/>
-    <w:bookmarkStart w:id="29" w:name="Xd979bbb935ec2154d49de8f14f78dcb3ac81be6"/>
+        <w:t xml:space="preserve">History: the project first ran apps at EL1 with direct calls ("Option C",</w:t>
+      </w:r>
+      <w:r>
+        <w:t xml:space="preserve"> </w:t>
+      </w:r>
+      <w:r>
+        <w:rPr>
+          <w:rStyle w:val="VerbatimChar"/>
+        </w:rPr>
+        <w:t xml:space="preserve">ARCHITECTURE.md</w:t>
+      </w:r>
+      <w:r>
+        <w:t xml:space="preserve"> </w:t>
+      </w:r>
+      <w:r>
+        <w:t xml:space="preserve">§11–§12: apps isolated from one another but not from the kernel); the move to EL0 was done in</w:t>
+      </w:r>
+      <w:r>
+        <w:t xml:space="preserve"> </w:t>
+      </w:r>
+      <w:r>
+        <w:t xml:space="preserve">steps (</w:t>
+      </w:r>
+      <w:hyperlink r:id="rId30">
+        <w:r>
+          <w:rPr>
+            <w:rStyle w:val="Hyperlink"/>
+          </w:rPr>
+          <w:t xml:space="preserve">EL0-PROTECTED-MODE.md</w:t>
+        </w:r>
+      </w:hyperlink>
+      <w:r>
+        <w:t xml:space="preserve">) and the EL1 mode removed.</w:t>
+      </w:r>
+    </w:p>
+    <w:bookmarkEnd w:id="31"/>
+    <w:bookmarkStart w:id="32" w:name="Xd979bbb935ec2154d49de8f14f78dcb3ac81be6"/>
     <w:p>
       <w:pPr>
         <w:pStyle w:val="Heading2"/>
@@ -2072,91 +2296,19 @@
         <w:pStyle w:val="BodyText"/>
       </w:pPr>
       <w:r>
-        <w:t xml:space="preserve">Preemption from the IRQ is not straightforward in Circle's model: threads run in</w:t>
-      </w:r>
-      <w:r>
-        <w:t xml:space="preserve"> </w:t>
-      </w:r>
-      <w:r>
-        <w:rPr>
-          <w:b/>
-          <w:bCs/>
-        </w:rPr>
-        <w:t xml:space="preserve">EL1t</w:t>
-      </w:r>
-      <w:r>
-        <w:t xml:space="preserve"> </w:t>
-      </w:r>
-      <w:r>
-        <w:t xml:space="preserve">(with</w:t>
-      </w:r>
-      <w:r>
-        <w:t xml:space="preserve"> </w:t>
-      </w:r>
-      <w:r>
-        <w:rPr>
-          <w:rStyle w:val="VerbatimChar"/>
-        </w:rPr>
-        <w:t xml:space="preserve">SP_EL0</w:t>
-      </w:r>
-      <w:r>
-        <w:t xml:space="preserve">), while the IRQ handler runs in</w:t>
-      </w:r>
-      <w:r>
-        <w:t xml:space="preserve"> </w:t>
-      </w:r>
-      <w:r>
-        <w:rPr>
-          <w:b/>
-          <w:bCs/>
-        </w:rPr>
-        <w:t xml:space="preserve">EL1h</w:t>
-      </w:r>
-      <w:r>
-        <w:t xml:space="preserve"> </w:t>
-      </w:r>
-      <w:r>
-        <w:t xml:space="preserve">(with</w:t>
-      </w:r>
-      <w:r>
-        <w:t xml:space="preserve"> </w:t>
-      </w:r>
-      <w:r>
-        <w:rPr>
-          <w:rStyle w:val="VerbatimChar"/>
-        </w:rPr>
-        <w:t xml:space="preserve">SP_EL1</w:t>
-      </w:r>
-      <w:r>
-        <w:t xml:space="preserve">), so</w:t>
-      </w:r>
-      <w:r>
-        <w:t xml:space="preserve"> </w:t>
-      </w:r>
-      <w:r>
-        <w:t xml:space="preserve">a context switch inside the IRQ would swap the wrong stack. The kernel therefore</w:t>
-      </w:r>
-      <w:r>
-        <w:t xml:space="preserve"> </w:t>
-      </w:r>
-      <w:r>
-        <w:rPr>
-          <w:b/>
-          <w:bCs/>
-        </w:rPr>
-        <w:t xml:space="preserve">redirects the IRQ's return</w:t>
-      </w:r>
-      <w:r>
-        <w:t xml:space="preserve"> </w:t>
-      </w:r>
-      <w:r>
-        <w:t xml:space="preserve">into a small trampoline that runs on the app's own</w:t>
-      </w:r>
-      <w:r>
-        <w:t xml:space="preserve"> </w:t>
-      </w:r>
-      <w:r>
-        <w:t xml:space="preserve">stack, saves its full register and FP state, and yields like a voluntary switch.</w:t>
+        <w:t xml:space="preserve">An IRQ taken while an app runs (at EL0) arrives on that task's own kernel stack, with the</w:t>
+      </w:r>
+      <w:r>
+        <w:t xml:space="preserve"> </w:t>
+      </w:r>
+      <w:r>
+        <w:t xml:space="preserve">app's full register and FP state saved there; when the slice is over the kernel yields right</w:t>
+      </w:r>
+      <w:r>
+        <w:t xml:space="preserve"> </w:t>
+      </w:r>
+      <w:r>
+        <w:t xml:space="preserve">there, like a voluntary switch.</w:t>
       </w:r>
     </w:p>
     <w:p>
@@ -2298,7 +2450,7 @@
       <w:r>
         <w:t xml:space="preserve"> </w:t>
       </w:r>
-      <w:hyperlink r:id="rId23">
+      <w:hyperlink r:id="rId24">
         <w:r>
           <w:rPr>
             <w:rStyle w:val="Hyperlink"/>
@@ -2355,8 +2507,8 @@
         <w:t xml:space="preserve">kills them all. The scheduler's task list has no fixed limit.</w:t>
       </w:r>
     </w:p>
-    <w:bookmarkEnd w:id="29"/>
-    <w:bookmarkStart w:id="30" w:name="Xd53f7f34704294b1d13f3b775edea3ef231f3a2"/>
+    <w:bookmarkEnd w:id="32"/>
+    <w:bookmarkStart w:id="34" w:name="Xd53f7f34704294b1d13f3b775edea3ef231f3a2"/>
     <w:p>
       <w:pPr>
         <w:pStyle w:val="Heading2"/>
@@ -2471,17 +2623,157 @@
         </w:numPr>
       </w:pPr>
       <w:r>
-        <w:t xml:space="preserve">The RPi 5 is deferred (I/O behind the proprietary RP1 chip via PCIe — heavier</w:t>
-      </w:r>
-      <w:r>
-        <w:t xml:space="preserve"> </w:t>
-      </w:r>
-      <w:r>
-        <w:t xml:space="preserve">bring-up). Multi-core (SMP) is also deferred.</w:t>
-      </w:r>
-    </w:p>
-    <w:bookmarkEnd w:id="30"/>
-    <w:bookmarkStart w:id="31" w:name="Xaeb7f2a1a29ce6f3d3f3f6655afd64b5919cb4f"/>
+        <w:rPr>
+          <w:b/>
+          <w:bCs/>
+        </w:rPr>
+        <w:t xml:space="preserve">The four cores, used asymmetrically by design</w:t>
+      </w:r>
+      <w:r>
+        <w:t xml:space="preserve"> </w:t>
+      </w:r>
+      <w:r>
+        <w:t xml:space="preserve">(not a symmetric SMP kernel):</w:t>
+      </w:r>
+      <w:r>
+        <w:t xml:space="preserve"> </w:t>
+      </w:r>
+      <w:r>
+        <w:rPr>
+          <w:b/>
+          <w:bCs/>
+        </w:rPr>
+        <w:t xml:space="preserve">core 0</w:t>
+      </w:r>
+      <w:r>
+        <w:t xml:space="preserve"> </w:t>
+      </w:r>
+      <w:r>
+        <w:t xml:space="preserve">runs the kernel, the scheduler, the desktop and every process;</w:t>
+      </w:r>
+      <w:r>
+        <w:t xml:space="preserve"> </w:t>
+      </w:r>
+      <w:r>
+        <w:rPr>
+          <w:b/>
+          <w:bCs/>
+        </w:rPr>
+        <w:t xml:space="preserve">core 1</w:t>
+      </w:r>
+      <w:r>
+        <w:t xml:space="preserve"> </w:t>
+      </w:r>
+      <w:r>
+        <w:t xml:space="preserve">the sound</w:t>
+      </w:r>
+      <w:r>
+        <w:t xml:space="preserve"> </w:t>
+      </w:r>
+      <w:r>
+        <w:t xml:space="preserve">producer (and, on a hang, the crash record);</w:t>
+      </w:r>
+      <w:r>
+        <w:t xml:space="preserve"> </w:t>
+      </w:r>
+      <w:r>
+        <w:rPr>
+          <w:b/>
+          <w:bCs/>
+        </w:rPr>
+        <w:t xml:space="preserve">cores 2 and 3</w:t>
+      </w:r>
+      <w:r>
+        <w:t xml:space="preserve"> </w:t>
+      </w:r>
+      <w:r>
+        <w:t xml:space="preserve">are</w:t>
+      </w:r>
+      <w:r>
+        <w:t xml:space="preserve"> </w:t>
+      </w:r>
+      <w:r>
+        <w:rPr>
+          <w:b/>
+          <w:bCs/>
+        </w:rPr>
+        <w:t xml:space="preserve">app cores</w:t>
+      </w:r>
+      <w:r>
+        <w:t xml:space="preserve">, each</w:t>
+      </w:r>
+      <w:r>
+        <w:t xml:space="preserve"> </w:t>
+      </w:r>
+      <w:r>
+        <w:t xml:space="preserve">lent whole to one app for its own code (an emulator's machine, Doom's engine); with</w:t>
+      </w:r>
+      <w:r>
+        <w:t xml:space="preserve"> </w:t>
+      </w:r>
+      <w:r>
+        <w:rPr>
+          <w:rStyle w:val="VerbatimChar"/>
+        </w:rPr>
+        <w:t xml:space="preserve">netcore=1</w:t>
+      </w:r>
+      <w:r>
+        <w:t xml:space="preserve"> </w:t>
+      </w:r>
+      <w:r>
+        <w:rPr>
+          <w:b/>
+          <w:bCs/>
+        </w:rPr>
+        <w:t xml:space="preserve">core 3</w:t>
+      </w:r>
+      <w:r>
+        <w:t xml:space="preserve"> </w:t>
+      </w:r>
+      <w:r>
+        <w:t xml:space="preserve">runs the network stack instead. Nothing of the kernel, Circle's</w:t>
+      </w:r>
+      <w:r>
+        <w:t xml:space="preserve"> </w:t>
+      </w:r>
+      <w:r>
+        <w:t xml:space="preserve">drivers or FatFs has to be multi-core safe. (docs/02 §12, §14, §11.)</w:t>
+      </w:r>
+    </w:p>
+    <w:p>
+      <w:pPr>
+        <w:pStyle w:val="Compact"/>
+        <w:numPr>
+          <w:ilvl w:val="0"/>
+          <w:numId w:val="1003"/>
+        </w:numPr>
+      </w:pPr>
+      <w:r>
+        <w:t xml:space="preserve">The RPi 5 is not supported yet (I/O behind the RP1 chip via PCIe — heavier bring-up;</w:t>
+      </w:r>
+      <w:r>
+        <w:t xml:space="preserve"> </w:t>
+      </w:r>
+      <w:r>
+        <w:t xml:space="preserve">the plan:</w:t>
+      </w:r>
+      <w:r>
+        <w:t xml:space="preserve"> </w:t>
+      </w:r>
+      <w:hyperlink r:id="rId33">
+        <w:r>
+          <w:rPr>
+            <w:rStyle w:val="Hyperlink"/>
+          </w:rPr>
+          <w:t xml:space="preserve">PI5-PORT.md</w:t>
+        </w:r>
+      </w:hyperlink>
+      <w:r>
+        <w:t xml:space="preserve">).</w:t>
+      </w:r>
+    </w:p>
+    <w:bookmarkEnd w:id="34"/>
+    <w:bookmarkStart w:id="35" w:name="Xaeb7f2a1a29ce6f3d3f3f6655afd64b5919cb4f"/>
     <w:p>
       <w:pPr>
         <w:pStyle w:val="Heading2"/>
@@ -2498,7 +2790,7 @@
         <w:rPr>
           <w:rStyle w:val="VerbatimChar"/>
         </w:rPr>
-        <w:t xml:space="preserve">ARCHITECTURE.md   original design + build manifest (historical, partly dated)</w:t>
+        <w:t xml:space="preserve">README.md         what Onyx is, how to build / stage / test, where the docs are</w:t>
       </w:r>
       <w:r>
         <w:br/>
@@ -2507,7 +2799,7 @@
         <w:rPr>
           <w:rStyle w:val="VerbatimChar"/>
         </w:rPr>
-        <w:t xml:space="preserve">README.md         summary (partly dated: describes the "2 demos" state)</w:t>
+        <w:t xml:space="preserve">ARCHITECTURE.md   the original design + build manifest (historical record)</w:t>
       </w:r>
       <w:r>
         <w:br/>
@@ -2516,7 +2808,7 @@
         <w:rPr>
           <w:rStyle w:val="VerbatimChar"/>
         </w:rPr>
-        <w:t xml:space="preserve">docs/             THIS documentation (overview, internals, dev/user guides)</w:t>
+        <w:t xml:space="preserve">docs/             THIS documentation (overview, internals, dev/user guides, plans)</w:t>
       </w:r>
       <w:r>
         <w:br/>
@@ -2534,7 +2826,7 @@
         <w:rPr>
           <w:rStyle w:val="VerbatimChar"/>
         </w:rPr>
-        <w:t xml:space="preserve">user/             the userland: apps (*.c), runtime (crt0.S, user.ld), /bin tools</w:t>
+        <w:t xml:space="preserve">user/             the userland: apps (Apps/&lt;name&gt;/), wtk toolkit, libraries, /bin tools</w:t>
       </w:r>
       <w:r>
         <w:br/>
@@ -2543,7 +2835,7 @@
         <w:rPr>
           <w:rStyle w:val="VerbatimChar"/>
         </w:rPr>
-        <w:t xml:space="preserve">sdcard/           ready-to-flash files for an RPi 4 (firmware, config, apps, /bin)</w:t>
+        <w:t xml:space="preserve">                  (bin/), runtime (crt0.S, user.ld, libc/), Jet Browser (netsurf/)</w:t>
       </w:r>
       <w:r>
         <w:br/>
@@ -2552,7 +2844,7 @@
         <w:rPr>
           <w:rStyle w:val="VerbatimChar"/>
         </w:rPr>
-        <w:t xml:space="preserve">tools/            host scripts (BMP icon generation)</w:t>
+        <w:t xml:space="preserve">sdcard/           ready-to-flash files for an RPi 4 (firmware, config, apps, /bin, samples)</w:t>
       </w:r>
       <w:r>
         <w:br/>
@@ -2561,7 +2853,43 @@
         <w:rPr>
           <w:rStyle w:val="VerbatimChar"/>
         </w:rPr>
-        <w:t xml:space="preserve">circle/           upstream Circle clone (not committed; cloned separately)</w:t>
+        <w:t xml:space="preserve">sdcard_lite/      the minimal card (the required packages), the rest from the repository</w:t>
+      </w:r>
+      <w:r>
+        <w:br/>
+      </w:r>
+      <w:r>
+        <w:rPr>
+          <w:rStyle w:val="VerbatimChar"/>
+        </w:rPr>
+        <w:t xml:space="preserve">third_party/      vendored libraries (NetSurf, FreeType, MuPDF, FFmpeg, QuickJS, …)</w:t>
+      </w:r>
+      <w:r>
+        <w:br/>
+      </w:r>
+      <w:r>
+        <w:rPr>
+          <w:rStyle w:val="VerbatimChar"/>
+        </w:rPr>
+        <w:t xml:space="preserve">tools/            host scripts and tests (packages, screenshots, desktop simulator, …)</w:t>
+      </w:r>
+      <w:r>
+        <w:br/>
+      </w:r>
+      <w:r>
+        <w:rPr>
+          <w:rStyle w:val="VerbatimChar"/>
+        </w:rPr>
+        <w:t xml:space="preserve">pc/               the Windows builds (Koton, the emulators, Onyx Remote)</w:t>
+      </w:r>
+      <w:r>
+        <w:br/>
+      </w:r>
+      <w:r>
+        <w:rPr>
+          <w:rStyle w:val="VerbatimChar"/>
+        </w:rPr>
+        <w:t xml:space="preserve">circle/           Circle, as a git submodule (the fork stephaneweg/circle, branch onyx)</w:t>
       </w:r>
     </w:p>
     <w:p>
@@ -2573,7 +2901,7 @@
           <w:b/>
           <w:bCs/>
         </w:rPr>
-        <w:t xml:space="preserve">Beware of legacy docs.</w:t>
+        <w:t xml:space="preserve">Legacy docs.</w:t>
       </w:r>
       <w:r>
         <w:t xml:space="preserve"> </w:t>
@@ -2585,84 +2913,19 @@
         <w:t xml:space="preserve">ARCHITECTURE.md</w:t>
       </w:r>
       <w:r>
-        <w:t xml:space="preserve">,</w:t>
-      </w:r>
-      <w:r>
-        <w:t xml:space="preserve"> </w:t>
-      </w:r>
-      <w:r>
-        <w:rPr>
-          <w:rStyle w:val="VerbatimChar"/>
-        </w:rPr>
-        <w:t xml:space="preserve">README.md</w:t>
-      </w:r>
-      <w:r>
-        <w:t xml:space="preserve">,</w:t>
-      </w:r>
-      <w:r>
-        <w:t xml:space="preserve"> </w:t>
-      </w:r>
-      <w:r>
-        <w:rPr>
-          <w:rStyle w:val="VerbatimChar"/>
-        </w:rPr>
-        <w:t xml:space="preserve">kernel/README.md</w:t>
-      </w:r>
-      <w:r>
-        <w:t xml:space="preserve">, and</w:t>
-      </w:r>
-      <w:r>
-        <w:t xml:space="preserve"> </w:t>
-      </w:r>
-      <w:r>
-        <w:rPr>
-          <w:rStyle w:val="VerbatimChar"/>
-        </w:rPr>
-        <w:t xml:space="preserve">sdcard/README.md</w:t>
-      </w:r>
-      <w:r>
-        <w:t xml:space="preserve"> </w:t>
-      </w:r>
-      <w:r>
-        <w:t xml:space="preserve">describe</w:t>
-      </w:r>
-      <w:r>
-        <w:t xml:space="preserve"> </w:t>
-      </w:r>
-      <w:r>
-        <w:rPr>
-          <w:b/>
-          <w:bCs/>
-        </w:rPr>
-        <w:t xml:space="preserve">older states</w:t>
-      </w:r>
-      <w:r>
-        <w:t xml:space="preserve"> </w:t>
-      </w:r>
-      <w:r>
-        <w:t xml:space="preserve">of the project (EL0 processes,</w:t>
-      </w:r>
-      <w:r>
-        <w:t xml:space="preserve"> </w:t>
-      </w:r>
-      <w:r>
-        <w:t xml:space="preserve">preemptive scheduling, 640×480, "two demos"). Where they contradict this</w:t>
-      </w:r>
-      <w:r>
-        <w:t xml:space="preserve"> </w:t>
-      </w:r>
-      <w:r>
-        <w:t xml:space="preserve">documentation,</w:t>
-      </w:r>
-      <w:r>
-        <w:t xml:space="preserve"> </w:t>
-      </w:r>
-      <w:r>
-        <w:rPr>
-          <w:b/>
-          <w:bCs/>
-        </w:rPr>
-        <w:t xml:space="preserve">these documents here (</w:t>
+        <w:t xml:space="preserve"> </w:t>
+      </w:r>
+      <w:r>
+        <w:t xml:space="preserve">is the historical design record (its banner says what</w:t>
+      </w:r>
+      <w:r>
+        <w:t xml:space="preserve"> </w:t>
+      </w:r>
+      <w:r>
+        <w:t xml:space="preserve">changed since); where it contradicts this documentation,</w:t>
+      </w:r>
+      <w:r>
+        <w:t xml:space="preserve"> </w:t>
       </w:r>
       <w:r>
         <w:rPr>
@@ -2677,28 +2940,23 @@
           <w:b/>
           <w:bCs/>
         </w:rPr>
-        <w:t xml:space="preserve">) are authoritative</w:t>
-      </w:r>
-      <w:r>
-        <w:t xml:space="preserve"> </w:t>
-      </w:r>
-      <w:r>
-        <w:t xml:space="preserve">for the current state.</w:t>
-      </w:r>
-      <w:r>
-        <w:t xml:space="preserve"> </w:t>
-      </w:r>
-      <w:r>
-        <w:rPr>
-          <w:rStyle w:val="VerbatimChar"/>
-        </w:rPr>
-        <w:t xml:space="preserve">ARCHITECTURE.md</w:t>
-      </w:r>
-      <w:r>
-        <w:t xml:space="preserve"> </w:t>
-      </w:r>
-      <w:r>
-        <w:t xml:space="preserve">§11–§12 nevertheless remains the best reference for</w:t>
+        <w:t xml:space="preserve"> </w:t>
+      </w:r>
+      <w:r>
+        <w:rPr>
+          <w:b/>
+          <w:bCs/>
+        </w:rPr>
+        <w:t xml:space="preserve">is authoritative</w:t>
+      </w:r>
+      <w:r>
+        <w:t xml:space="preserve">.</w:t>
+      </w:r>
+      <w:r>
+        <w:t xml:space="preserve"> </w:t>
+      </w:r>
+      <w:r>
+        <w:t xml:space="preserve">Its §11–§12 remain the reference for</w:t>
       </w:r>
       <w:r>
         <w:t xml:space="preserve"> </w:t>
@@ -2714,23 +2972,17 @@
         <w:t xml:space="preserve"> </w:t>
       </w:r>
       <w:r>
-        <w:t xml:space="preserve">Option C</w:t>
-      </w:r>
-      <w:r>
-        <w:t xml:space="preserve"> </w:t>
-      </w:r>
-      <w:r>
-        <w:t xml:space="preserve">was chosen (its "cooperative scheduling" has since been replaced by the preemption of</w:t>
-      </w:r>
-      <w:r>
-        <w:t xml:space="preserve"> </w:t>
-      </w:r>
-      <w:r>
-        <w:t xml:space="preserve">§6).</w:t>
-      </w:r>
-    </w:p>
-    <w:bookmarkEnd w:id="31"/>
-    <w:bookmarkStart w:id="34" w:name="X647cdcd38a19e7cb40f403bab2abebd96e480e2"/>
+        <w:t xml:space="preserve">the first execution model ("Option C", apps at</w:t>
+      </w:r>
+      <w:r>
+        <w:t xml:space="preserve"> </w:t>
+      </w:r>
+      <w:r>
+        <w:t xml:space="preserve">EL1) was chosen; apps run at EL0 since kapi v74 (§5).</w:t>
+      </w:r>
+    </w:p>
+    <w:bookmarkEnd w:id="35"/>
+    <w:bookmarkStart w:id="41" w:name="X647cdcd38a19e7cb40f403bab2abebd96e480e2"/>
     <w:p>
       <w:pPr>
         <w:pStyle w:val="Heading2"/>
@@ -2795,7 +3047,7 @@
             <w:pPr>
               <w:pStyle w:val="Compact"/>
             </w:pPr>
-            <w:hyperlink r:id="rId23">
+            <w:hyperlink r:id="rId24">
               <w:r>
                 <w:rPr>
                   <w:rStyle w:val="Hyperlink"/>
@@ -2837,7 +3089,7 @@
             <w:pPr>
               <w:pStyle w:val="Compact"/>
             </w:pPr>
-            <w:hyperlink r:id="rId32">
+            <w:hyperlink r:id="rId36">
               <w:r>
                 <w:rPr>
                   <w:rStyle w:val="Hyperlink"/>
@@ -2879,7 +3131,7 @@
             <w:pPr>
               <w:pStyle w:val="Compact"/>
             </w:pPr>
-            <w:hyperlink r:id="rId33">
+            <w:hyperlink r:id="rId37">
               <w:r>
                 <w:rPr>
                   <w:rStyle w:val="Hyperlink"/>
@@ -2914,9 +3166,241 @@
           </w:p>
         </w:tc>
       </w:tr>
+      <w:tr>
+        <w:tc>
+          <w:tcPr/>
+          <w:p>
+            <w:pPr>
+              <w:pStyle w:val="Compact"/>
+            </w:pPr>
+            <w:hyperlink r:id="rId38">
+              <w:r>
+                <w:rPr>
+                  <w:rStyle w:val="Hyperlink"/>
+                </w:rPr>
+                <w:t xml:space="preserve">05 — Circle Changes</w:t>
+              </w:r>
+            </w:hyperlink>
+          </w:p>
+        </w:tc>
+        <w:tc>
+          <w:tcPr/>
+          <w:p>
+            <w:pPr>
+              <w:pStyle w:val="Compact"/>
+            </w:pPr>
+            <w:r>
+              <w:t xml:space="preserve">anyone touching</w:t>
+            </w:r>
+            <w:r>
+              <w:t xml:space="preserve"> </w:t>
+            </w:r>
+            <w:r>
+              <w:rPr>
+                <w:rStyle w:val="VerbatimChar"/>
+              </w:rPr>
+              <w:t xml:space="preserve">circle/</w:t>
+            </w:r>
+          </w:p>
+        </w:tc>
+        <w:tc>
+          <w:tcPr/>
+          <w:p>
+            <w:pPr>
+              <w:pStyle w:val="Compact"/>
+            </w:pPr>
+            <w:r>
+              <w:t xml:space="preserve">the patches of our Circle fork vs upstream</w:t>
+            </w:r>
+            <w:r>
+              <w:t xml:space="preserve"> </w:t>
+            </w:r>
+            <w:r>
+              <w:rPr>
+                <w:rStyle w:val="VerbatimChar"/>
+              </w:rPr>
+              <w:t xml:space="preserve">Step51</w:t>
+            </w:r>
+          </w:p>
+        </w:tc>
+      </w:tr>
+      <w:tr>
+        <w:tc>
+          <w:tcPr/>
+          <w:p>
+            <w:pPr>
+              <w:pStyle w:val="Compact"/>
+            </w:pPr>
+            <w:hyperlink r:id="rId27">
+              <w:r>
+                <w:rPr>
+                  <w:rStyle w:val="Hyperlink"/>
+                </w:rPr>
+                <w:t xml:space="preserve">06 — Jet Browser</w:t>
+              </w:r>
+            </w:hyperlink>
+            <w:r>
+              <w:t xml:space="preserve">,</w:t>
+            </w:r>
+            <w:r>
+              <w:t xml:space="preserve"> </w:t>
+            </w:r>
+            <w:hyperlink r:id="rId39">
+              <w:r>
+                <w:rPr>
+                  <w:rStyle w:val="Hyperlink"/>
+                </w:rPr>
+                <w:t xml:space="preserve">07 — Browser gaps</w:t>
+              </w:r>
+            </w:hyperlink>
+          </w:p>
+        </w:tc>
+        <w:tc>
+          <w:tcPr/>
+          <w:p>
+            <w:pPr>
+              <w:pStyle w:val="Compact"/>
+            </w:pPr>
+            <w:r>
+              <w:t xml:space="preserve">the browser</w:t>
+            </w:r>
+          </w:p>
+        </w:tc>
+        <w:tc>
+          <w:tcPr/>
+          <w:p>
+            <w:pPr>
+              <w:pStyle w:val="Compact"/>
+            </w:pPr>
+            <w:r>
+              <w:t xml:space="preserve">the Onyx changes to NetSurf, libcss, FreeType; what is missing</w:t>
+            </w:r>
+          </w:p>
+        </w:tc>
+      </w:tr>
+      <w:tr>
+        <w:tc>
+          <w:tcPr/>
+          <w:p>
+            <w:pPr>
+              <w:pStyle w:val="Compact"/>
+            </w:pPr>
+            <w:hyperlink r:id="rId30">
+              <w:r>
+                <w:rPr>
+                  <w:rStyle w:val="Hyperlink"/>
+                </w:rPr>
+                <w:t xml:space="preserve">EL0 protected mode</w:t>
+              </w:r>
+            </w:hyperlink>
+          </w:p>
+        </w:tc>
+        <w:tc>
+          <w:tcPr/>
+          <w:p>
+            <w:pPr>
+              <w:pStyle w:val="Compact"/>
+            </w:pPr>
+            <w:r>
+              <w:t xml:space="preserve">the execution model</w:t>
+            </w:r>
+          </w:p>
+        </w:tc>
+        <w:tc>
+          <w:tcPr/>
+          <w:p>
+            <w:pPr>
+              <w:pStyle w:val="Compact"/>
+            </w:pPr>
+            <w:r>
+              <w:t xml:space="preserve">how apps moved to EL0, the design</w:t>
+            </w:r>
+          </w:p>
+        </w:tc>
+      </w:tr>
+      <w:tr>
+        <w:tc>
+          <w:tcPr/>
+          <w:p>
+            <w:pPr>
+              <w:pStyle w:val="Compact"/>
+            </w:pPr>
+            <w:hyperlink r:id="rId19">
+              <w:r>
+                <w:rPr>
+                  <w:rStyle w:val="Hyperlink"/>
+                </w:rPr>
+                <w:t xml:space="preserve">Licensing</w:t>
+              </w:r>
+            </w:hyperlink>
+          </w:p>
+        </w:tc>
+        <w:tc>
+          <w:tcPr/>
+          <w:p>
+            <w:pPr>
+              <w:pStyle w:val="Compact"/>
+            </w:pPr>
+            <w:r>
+              <w:t xml:space="preserve">distributors</w:t>
+            </w:r>
+          </w:p>
+        </w:tc>
+        <w:tc>
+          <w:tcPr/>
+          <w:p>
+            <w:pPr>
+              <w:pStyle w:val="Compact"/>
+            </w:pPr>
+            <w:r>
+              <w:t xml:space="preserve">the licences of everything Onyx contains</w:t>
+            </w:r>
+          </w:p>
+        </w:tc>
+      </w:tr>
+      <w:tr>
+        <w:tc>
+          <w:tcPr/>
+          <w:p>
+            <w:pPr>
+              <w:pStyle w:val="Compact"/>
+            </w:pPr>
+            <w:hyperlink r:id="rId40">
+              <w:r>
+                <w:rPr>
+                  <w:rStyle w:val="Hyperlink"/>
+                </w:rPr>
+                <w:t xml:space="preserve">Handoff</w:t>
+              </w:r>
+            </w:hyperlink>
+          </w:p>
+        </w:tc>
+        <w:tc>
+          <w:tcPr/>
+          <w:p>
+            <w:pPr>
+              <w:pStyle w:val="Compact"/>
+            </w:pPr>
+            <w:r>
+              <w:t xml:space="preserve">the next session</w:t>
+            </w:r>
+          </w:p>
+        </w:tc>
+        <w:tc>
+          <w:tcPr/>
+          <w:p>
+            <w:pPr>
+              <w:pStyle w:val="Compact"/>
+            </w:pPr>
+            <w:r>
+              <w:t xml:space="preserve">where the work stands, the next tasks</w:t>
+            </w:r>
+          </w:p>
+        </w:tc>
+      </w:tr>
     </w:tbl>
-    <w:bookmarkEnd w:id="34"/>
-    <w:bookmarkStart w:id="35" w:name="Xb3ffec909c2b52aab1f5b06d59da0ddab14a9e8"/>
+    <w:bookmarkEnd w:id="41"/>
+    <w:bookmarkStart w:id="42" w:name="Xb3ffec909c2b52aab1f5b06d59da0ddab14a9e8"/>
     <w:p>
       <w:pPr>
         <w:pStyle w:val="Heading2"/>
@@ -3224,7 +3708,80 @@
         <w:t xml:space="preserve">tool, and NTP clock sync.</w:t>
       </w:r>
     </w:p>
-    <w:bookmarkEnd w:id="35"/>
+    <w:p>
+      <w:pPr>
+        <w:pStyle w:val="Compact"/>
+        <w:numPr>
+          <w:ilvl w:val="0"/>
+          <w:numId w:val="1004"/>
+        </w:numPr>
+      </w:pPr>
+      <w:r>
+        <w:t xml:space="preserve">The modernised CDE desktop (v64: menu bar, dock, workspaces), the wtk toolkit; the</w:t>
+      </w:r>
+      <w:r>
+        <w:t xml:space="preserve"> </w:t>
+      </w:r>
+      <w:r>
+        <w:t xml:space="preserve">preemptive scheduler; sound on core 1, app cores 2–3 (v51), the GPU (v52);</w:t>
+      </w:r>
+      <w:r>
+        <w:t xml:space="preserve"> </w:t>
+      </w:r>
+      <w:r>
+        <w:t xml:space="preserve">Jet Browser (NetSurf, QuickJS); the office suite, the emulators, Koton; threads (v67);</w:t>
+      </w:r>
+      <w:r>
+        <w:t xml:space="preserve"> </w:t>
+      </w:r>
+      <w:r>
+        <w:t xml:space="preserve">the network on core 3; the</w:t>
+      </w:r>
+      <w:r>
+        <w:t xml:space="preserve"> </w:t>
+      </w:r>
+      <w:r>
+        <w:rPr>
+          <w:rStyle w:val="VerbatimChar"/>
+        </w:rPr>
+        <w:t xml:space="preserve">RAM:</w:t>
+      </w:r>
+      <w:r>
+        <w:t xml:space="preserve"> </w:t>
+      </w:r>
+      <w:r>
+        <w:t xml:space="preserve">volume (v71); the packages.</w:t>
+      </w:r>
+    </w:p>
+    <w:p>
+      <w:pPr>
+        <w:pStyle w:val="Compact"/>
+        <w:numPr>
+          <w:ilvl w:val="0"/>
+          <w:numId w:val="1004"/>
+        </w:numPr>
+      </w:pPr>
+      <w:r>
+        <w:rPr>
+          <w:b/>
+          <w:bCs/>
+        </w:rPr>
+        <w:t xml:space="preserve">Every app at EL0</w:t>
+      </w:r>
+      <w:r>
+        <w:t xml:space="preserve"> </w:t>
+      </w:r>
+      <w:r>
+        <w:t xml:space="preserve">(v73–v74, 2026-10): system calls through the same table, per-process</w:t>
+      </w:r>
+      <w:r>
+        <w:t xml:space="preserve"> </w:t>
+      </w:r>
+      <w:r>
+        <w:t xml:space="preserve">handles, every kapi pointer checked; a fault kills the app, not the machine.</w:t>
+      </w:r>
+    </w:p>
+    <w:bookmarkEnd w:id="42"/>
     <w:sectPr>
       <w:footerReference r:id="rId9" w:type="default"/>
       <w:footnotePr>

</xml_diff>

<commit_message>
Jet Browser is the WebKit browser: NetSurf's Jet, its libraries, its PC bench and Jet for Windows removed; Web renamed Jet (user/Apps/jet, apps/jet.app, the package jet 2.0; WebKit's user agent kept)
- removed: user/netsurf, user/nsfb, tools/tests/netsurf, pc/Jet, pc/dist/Jet, docs 06 and 07, and of
  third_party what only they used: netsurf, libcss, libdom, libhubbub, libnsbmp, libnsgif, libnsfb,
  libnslog, libnsutils, libparserutils, libwapcaplet, plutovg, plutosvg, quickjs-ng, wasm3,
  webref-css, cldr, expat, zstd; NetSurf's resources of sdcard/res; /bin/nstest, /bin/nsfbdemo
- kept: the ns-sans glyphs the system font is generated from (third_party/fonts/ns-sans), brotli and
  nghttp2 (curl), the codecs (their build: user/av/Makefile, was in NetSurf's makefile)
- Mail opens its pages and its HTML view in Jet (no fallback to another browser)
- the package web is no longer made: a card that has it keeps it (pkg delete web)

Co-Authored-By: Claude Opus 5.5 <noreply@anthropic.com>
</commit_message>
<xml_diff>
--- a/docs/exports/01-PROJECT-OVERVIEW.docx
+++ b/docs/exports/01-PROJECT-OVERVIEW.docx
@@ -1574,13 +1574,29 @@
         <w:t xml:space="preserve">jet</w:t>
       </w:r>
       <w:r>
-        <w:t xml:space="preserve">), the Onyx web browser based on</w:t>
-      </w:r>
-      <w:r>
-        <w:t xml:space="preserve"> </w:t>
-      </w:r>
-      <w:r>
-        <w:t xml:space="preserve">NetSurf:</w:t>
+        <w:t xml:space="preserve">), on</w:t>
+      </w:r>
+      <w:r>
+        <w:t xml:space="preserve"> </w:t>
+      </w:r>
+      <w:r>
+        <w:rPr>
+          <w:b/>
+          <w:bCs/>
+        </w:rPr>
+        <w:t xml:space="preserve">WebKit</w:t>
+      </w:r>
+      <w:r>
+        <w:t xml:space="preserve"> </w:t>
+      </w:r>
+      <w:r>
+        <w:t xml:space="preserve">(the engine of Safari): its own</w:t>
+      </w:r>
+      <w:r>
+        <w:t xml:space="preserve"> </w:t>
+      </w:r>
+      <w:r>
+        <w:t xml:space="preserve">port to Onyx —</w:t>
       </w:r>
       <w:r>
         <w:t xml:space="preserve"> </w:t>
@@ -1607,78 +1623,49 @@
         <w:t xml:space="preserve">https://</w:t>
       </w:r>
       <w:r>
-        <w:t xml:space="preserve">,</w:t>
-      </w:r>
-      <w:r>
-        <w:t xml:space="preserve"> </w:t>
-      </w:r>
-      <w:r>
-        <w:rPr>
-          <w:b/>
-          <w:bCs/>
-        </w:rPr>
-        <w:t xml:space="preserve">CSS3</w:t>
-      </w:r>
-      <w:r>
-        <w:t xml:space="preserve"> </w:t>
-      </w:r>
-      <w:r>
-        <w:t xml:space="preserve">(</w:t>
-      </w:r>
-      <w:r>
-        <w:rPr>
-          <w:rStyle w:val="VerbatimChar"/>
-        </w:rPr>
-        <w:t xml:space="preserve">calc()</w:t>
-      </w:r>
-      <w:r>
-        <w:t xml:space="preserve">,</w:t>
-      </w:r>
-      <w:r>
-        <w:t xml:space="preserve"> </w:t>
-      </w:r>
-      <w:r>
-        <w:rPr>
-          <w:rStyle w:val="VerbatimChar"/>
-        </w:rPr>
-        <w:t xml:space="preserve">var()</w:t>
-      </w:r>
-      <w:r>
-        <w:t xml:space="preserve">, flexbox, grid, gradients, shadows, rounded corners,</w:t>
-      </w:r>
-      <w:r>
-        <w:t xml:space="preserve"> </w:t>
-      </w:r>
-      <w:r>
-        <w:t xml:space="preserve">gradient text, vendor prefixes), web fonts (WOFF/WOFF2, variable fonts) with Chrome's</w:t>
-      </w:r>
-      <w:r>
-        <w:t xml:space="preserve"> </w:t>
-      </w:r>
-      <w:r>
-        <w:t xml:space="preserve">Windows fonts stood in by metric-compatible ones, and</w:t>
-      </w:r>
-      <w:r>
-        <w:t xml:space="preserve"> </w:t>
-      </w:r>
-      <w:r>
-        <w:rPr>
-          <w:b/>
-          <w:bCs/>
-        </w:rPr>
-        <w:t xml:space="preserve">JavaScript</w:t>
-      </w:r>
-      <w:r>
-        <w:t xml:space="preserve"> </w:t>
-      </w:r>
-      <w:r>
-        <w:t xml:space="preserve">on QuickJS</w:t>
-      </w:r>
-      <w:r>
-        <w:t xml:space="preserve"> </w:t>
-      </w:r>
-      <w:r>
-        <w:t xml:space="preserve">(ES2023, the DOM, the page laid out again after a script's changes). Details in</w:t>
+        <w:t xml:space="preserve">, JavaScript compiled by JavaScriptCore's JIT, the page</w:t>
+      </w:r>
+      <w:r>
+        <w:t xml:space="preserve"> </w:t>
+      </w:r>
+      <w:r>
+        <w:t xml:space="preserve">assembled by the Pi's GPU,</w:t>
+      </w:r>
+      <w:r>
+        <w:t xml:space="preserve"> </w:t>
+      </w:r>
+      <w:r>
+        <w:rPr>
+          <w:rStyle w:val="VerbatimChar"/>
+        </w:rPr>
+        <w:t xml:space="preserve">&lt;video&gt;</w:t>
+      </w:r>
+      <w:r>
+        <w:t xml:space="preserve"> </w:t>
+      </w:r>
+      <w:r>
+        <w:t xml:space="preserve">and</w:t>
+      </w:r>
+      <w:r>
+        <w:t xml:space="preserve"> </w:t>
+      </w:r>
+      <w:r>
+        <w:rPr>
+          <w:rStyle w:val="VerbatimChar"/>
+        </w:rPr>
+        <w:t xml:space="preserve">&lt;audio&gt;</w:t>
+      </w:r>
+      <w:r>
+        <w:t xml:space="preserve"> </w:t>
+      </w:r>
+      <w:r>
+        <w:t xml:space="preserve">(VP9, AV1, Opus; YouTube plays), one page per</w:t>
+      </w:r>
+      <w:r>
+        <w:t xml:space="preserve"> </w:t>
+      </w:r>
+      <w:r>
+        <w:t xml:space="preserve">window, three processes (the window, the page, the network):</w:t>
       </w:r>
       <w:r>
         <w:t xml:space="preserve"> </w:t>
@@ -1688,38 +1675,11 @@
           <w:rPr>
             <w:rStyle w:val="Hyperlink"/>
           </w:rPr>
-          <w:t xml:space="preserve">Jet Browser, the NetSurf changes</w:t>
+          <w:t xml:space="preserve">the WebKit port</w:t>
         </w:r>
       </w:hyperlink>
       <w:r>
-        <w:t xml:space="preserve">. Video and audio too</w:t>
-      </w:r>
-      <w:r>
-        <w:t xml:space="preserve"> </w:t>
-      </w:r>
-      <w:r>
-        <w:t xml:space="preserve">(</w:t>
-      </w:r>
-      <w:r>
-        <w:rPr>
-          <w:rStyle w:val="VerbatimChar"/>
-        </w:rPr>
-        <w:t xml:space="preserve">&lt;video&gt;</w:t>
-      </w:r>
-      <w:r>
-        <w:t xml:space="preserve">,</w:t>
-      </w:r>
-      <w:r>
-        <w:t xml:space="preserve"> </w:t>
-      </w:r>
-      <w:r>
-        <w:rPr>
-          <w:rStyle w:val="VerbatimChar"/>
-        </w:rPr>
-        <w:t xml:space="preserve">&lt;audio&gt;</w:t>
-      </w:r>
-      <w:r>
-        <w:t xml:space="preserve">, MSE).</w:t>
+        <w:t xml:space="preserve">.</w:t>
       </w:r>
     </w:p>
     <w:bookmarkEnd w:id="28"/>
@@ -2835,7 +2795,7 @@
         <w:rPr>
           <w:rStyle w:val="VerbatimChar"/>
         </w:rPr>
-        <w:t xml:space="preserve">                  (bin/), runtime (crt0.S, user.ld, libc/), Jet Browser (netsurf/)</w:t>
+        <w:t xml:space="preserve">                  (bin/), runtime (crt0.S, user.ld, libc/), the media library (av/)</w:t>
       </w:r>
       <w:r>
         <w:br/>
@@ -2862,7 +2822,7 @@
         <w:rPr>
           <w:rStyle w:val="VerbatimChar"/>
         </w:rPr>
-        <w:t xml:space="preserve">third_party/      vendored libraries (NetSurf, FreeType, MuPDF, FFmpeg, QuickJS, …)</w:t>
+        <w:t xml:space="preserve">third_party/      vendored libraries (FreeType, MuPDF, FFmpeg, ICU, Skia, curl, …)</w:t>
       </w:r>
       <w:r>
         <w:br/>
@@ -2982,7 +2942,7 @@
       </w:r>
     </w:p>
     <w:bookmarkEnd w:id="35"/>
-    <w:bookmarkStart w:id="41" w:name="X647cdcd38a19e7cb40f403bab2abebd96e480e2"/>
+    <w:bookmarkStart w:id="40" w:name="X647cdcd38a19e7cb40f403bab2abebd96e480e2"/>
     <w:p>
       <w:pPr>
         <w:pStyle w:val="Heading2"/>
@@ -3236,21 +3196,7 @@
                 <w:rPr>
                   <w:rStyle w:val="Hyperlink"/>
                 </w:rPr>
-                <w:t xml:space="preserve">06 — Jet Browser</w:t>
-              </w:r>
-            </w:hyperlink>
-            <w:r>
-              <w:t xml:space="preserve">,</w:t>
-            </w:r>
-            <w:r>
-              <w:t xml:space="preserve"> </w:t>
-            </w:r>
-            <w:hyperlink r:id="rId39">
-              <w:r>
-                <w:rPr>
-                  <w:rStyle w:val="Hyperlink"/>
-                </w:rPr>
-                <w:t xml:space="preserve">07 — Browser gaps</w:t>
+                <w:t xml:space="preserve">08 — Jet Browser, the WebKit port</w:t>
               </w:r>
             </w:hyperlink>
           </w:p>
@@ -3273,7 +3219,7 @@
               <w:pStyle w:val="Compact"/>
             </w:pPr>
             <w:r>
-              <w:t xml:space="preserve">the Onyx changes to NetSurf, libcss, FreeType; what is missing</w:t>
+              <w:t xml:space="preserve">the port of WebKit to Onyx: its status, the patch series, how to build</w:t>
             </w:r>
           </w:p>
         </w:tc>
@@ -3365,7 +3311,7 @@
             <w:pPr>
               <w:pStyle w:val="Compact"/>
             </w:pPr>
-            <w:hyperlink r:id="rId40">
+            <w:hyperlink r:id="rId39">
               <w:r>
                 <w:rPr>
                   <w:rStyle w:val="Hyperlink"/>
@@ -3399,8 +3345,8 @@
         </w:tc>
       </w:tr>
     </w:tbl>
-    <w:bookmarkEnd w:id="41"/>
-    <w:bookmarkStart w:id="42" w:name="Xb3ffec909c2b52aab1f5b06d59da0ddab14a9e8"/>
+    <w:bookmarkEnd w:id="40"/>
+    <w:bookmarkStart w:id="41" w:name="Xb3ffec909c2b52aab1f5b06d59da0ddab14a9e8"/>
     <w:p>
       <w:pPr>
         <w:pStyle w:val="Heading2"/>
@@ -3729,7 +3675,7 @@
         <w:t xml:space="preserve"> </w:t>
       </w:r>
       <w:r>
-        <w:t xml:space="preserve">Jet Browser (NetSurf, QuickJS); the office suite, the emulators, Koton; threads (v67);</w:t>
+        <w:t xml:space="preserve">Jet Browser (WebKit); the office suite, the emulators, Koton; threads (v67);</w:t>
       </w:r>
       <w:r>
         <w:t xml:space="preserve"> </w:t>
@@ -3781,7 +3727,7 @@
         <w:t xml:space="preserve">handles, every kapi pointer checked; a fault kills the app, not the machine.</w:t>
       </w:r>
     </w:p>
-    <w:bookmarkEnd w:id="42"/>
+    <w:bookmarkEnd w:id="41"/>
     <w:sectPr>
       <w:footerReference r:id="rId9" w:type="default"/>
       <w:footnotePr>

</xml_diff>

<commit_message>
docs: The Kits, a developer's guide (06-KITS-GUIDE) -- one kit per domain, an example for each; the exports regenerated
Co-Authored-By: Claude Opus 5.5 <noreply@anthropic.com>
</commit_message>
<xml_diff>
--- a/docs/exports/01-PROJECT-OVERVIEW.docx
+++ b/docs/exports/01-PROJECT-OVERVIEW.docx
@@ -1140,7 +1140,7 @@
         <w:rPr>
           <w:rStyle w:val="VerbatimChar"/>
         </w:rPr>
-        <w:t xml:space="preserve">user/gpucomp</w:t>
+        <w:t xml:space="preserve">user/Libs/gpucomp</w:t>
       </w:r>
       <w:r>
         <w:t xml:space="preserve">: Paint's blend modes, Jet Browser).</w:t>
@@ -1727,7 +1727,7 @@
         <w:rPr>
           <w:rStyle w:val="VerbatimChar"/>
         </w:rPr>
-        <w:t xml:space="preserve">│       │  call the kernel through kapi.h (inline wrappers)        │</w:t>
+        <w:t xml:space="preserve">│       │  call the kernel through AppKit (appkit/appkit.h)        │</w:t>
       </w:r>
       <w:r>
         <w:br/>
@@ -2786,7 +2786,7 @@
         <w:rPr>
           <w:rStyle w:val="VerbatimChar"/>
         </w:rPr>
-        <w:t xml:space="preserve">user/             the userland: apps (Apps/&lt;name&gt;/), wtk toolkit, libraries, /bin tools</w:t>
+        <w:t xml:space="preserve">user/             the userland: apps (Apps/&lt;name&gt;/), uikit toolkit, libraries, /bin tools</w:t>
       </w:r>
       <w:r>
         <w:br/>
@@ -3663,7 +3663,7 @@
         </w:numPr>
       </w:pPr>
       <w:r>
-        <w:t xml:space="preserve">The modernised CDE desktop (v64: menu bar, dock, workspaces), the wtk toolkit; the</w:t>
+        <w:t xml:space="preserve">The modernised CDE desktop (v64: menu bar, dock, workspaces), the uikit toolkit; the</w:t>
       </w:r>
       <w:r>
         <w:t xml:space="preserve"> </w:t>

</xml_diff>

<commit_message>
Pi 5: the kernel builds for the Pi 5 (make BOARD=pi5, Circle in circle5/), the four blockers fixed or fenced
- B1: the scheduler's ThisCore () reads the core number in Aff1 on the A76
- B2: the fork's memory64 registers the Pi 5's RAM once (circle 065871f9, docs/05 #29)
- B4: the V3D refuses to start on the Pi 5 (gpu_info 0: the software paths)
- the sound's auto output: no jack on the Pi 5; gpio_ctl ENODEV there (the header is on the RP1)
- tools/pi5/circle5.sh: Circle configured -r 5 in circle5/ (not in git)
The Pi 4's kernel code is unchanged (every object compared without its debug info).

Co-Authored-By: Claude Opus 5.5 <noreply@anthropic.com>
Claude-Session: https://claude.ai/code/session_01NVTBGsTejLZor1Spptroyo
</commit_message>
<xml_diff>
--- a/docs/exports/01-PROJECT-OVERVIEW.docx
+++ b/docs/exports/01-PROJECT-OVERVIEW.docx
@@ -18,7 +18,7 @@
         <w:t xml:space="preserve">Onyx · multi-process OS on Raspberry Pi 4</w:t>
       </w:r>
     </w:p>
-    <w:bookmarkStart w:id="23" w:name="X14dbb8d34989bbb6ce0a693749d87edcb6cab80"/>
+    <w:bookmarkStart w:id="25" w:name="X14dbb8d34989bbb6ce0a693749d87edcb6cab80"/>
     <w:p>
       <w:pPr>
         <w:pStyle w:val="Heading2"/>
@@ -39,8 +39,8 @@
       </w:r>
       <w:r>
         <w:rPr>
-          <w:b/>
-          <w:bCs/>
+          <w:bCs/>
+          <w:b/>
         </w:rPr>
         <w:t xml:space="preserve">small multi-process operating system</w:t>
       </w:r>
@@ -55,8 +55,8 @@
       </w:r>
       <w:r>
         <w:rPr>
-          <w:b/>
-          <w:bCs/>
+          <w:bCs/>
+          <w:b/>
         </w:rPr>
         <w:t xml:space="preserve">Raspberry Pi 4</w:t>
       </w:r>
@@ -71,8 +71,8 @@
       </w:r>
       <w:r>
         <w:rPr>
-          <w:b/>
-          <w:bCs/>
+          <w:bCs/>
+          <w:b/>
         </w:rPr>
         <w:t xml:space="preserve">on top of Circle</w:t>
       </w:r>
@@ -82,7 +82,7 @@
       <w:r>
         <w:t xml:space="preserve">(</w:t>
       </w:r>
-      <w:hyperlink r:id="rId18">
+      <w:hyperlink r:id="rId20">
         <w:r>
           <w:rPr>
             <w:rStyle w:val="Hyperlink"/>
@@ -104,22 +104,22 @@
       </w:r>
       <w:r>
         <w:rPr>
-          <w:b/>
-          <w:bCs/>
+          <w:bCs/>
+          <w:b/>
         </w:rPr>
         <w:t xml:space="preserve">ELF programs from the SD</w:t>
       </w:r>
       <w:r>
         <w:rPr>
-          <w:b/>
-          <w:bCs/>
-        </w:rPr>
-        <w:t xml:space="preserve"> </w:t>
-      </w:r>
-      <w:r>
-        <w:rPr>
-          <w:b/>
-          <w:bCs/>
+          <w:bCs/>
+          <w:b/>
+        </w:rPr>
+        <w:t xml:space="preserve"> </w:t>
+      </w:r>
+      <w:r>
+        <w:rPr>
+          <w:bCs/>
+          <w:b/>
         </w:rPr>
         <w:t xml:space="preserve">card</w:t>
       </w:r>
@@ -134,8 +134,8 @@
       </w:r>
       <w:r>
         <w:rPr>
-          <w:b/>
-          <w:bCs/>
+          <w:bCs/>
+          <w:b/>
         </w:rPr>
         <w:t xml:space="preserve">applications isolated from one another</w:t>
       </w:r>
@@ -153,8 +153,8 @@
       </w:r>
       <w:r>
         <w:rPr>
-          <w:b/>
-          <w:bCs/>
+          <w:bCs/>
+          <w:b/>
         </w:rPr>
         <w:t xml:space="preserve">Onyx desktop</w:t>
       </w:r>
@@ -196,8 +196,8 @@
       </w:r>
       <w:r>
         <w:rPr>
-          <w:b/>
-          <w:bCs/>
+          <w:bCs/>
+          <w:b/>
         </w:rPr>
         <w:t xml:space="preserve">pocket</w:t>
       </w:r>
@@ -212,8 +212,8 @@
       </w:r>
       <w:r>
         <w:rPr>
-          <w:b/>
-          <w:bCs/>
+          <w:bCs/>
+          <w:b/>
         </w:rPr>
         <w:t xml:space="preserve">console</w:t>
       </w:r>
@@ -229,7 +229,7 @@
       <w:r>
         <w:t xml:space="preserve">Our own code is under the MIT licence (</w:t>
       </w:r>
-      <w:hyperlink r:id="rId19">
+      <w:hyperlink r:id="rId21">
         <w:r>
           <w:rPr>
             <w:rStyle w:val="Hyperlink"/>
@@ -253,8 +253,8 @@
       </w:r>
       <w:r>
         <w:rPr>
-          <w:b/>
-          <w:bCs/>
+          <w:bCs/>
+          <w:b/>
         </w:rPr>
         <w:t xml:space="preserve">runs on real Raspberry Pi 4 hardware</w:t>
       </w:r>
@@ -274,18 +274,18 @@
           <wp:inline>
             <wp:extent cx="5334000" cy="4000500"/>
             <wp:effectExtent b="0" l="0" r="0" t="0"/>
-            <wp:docPr descr="The Onyx desktop" title="" id="21" name="Picture"/>
+            <wp:docPr descr="The Onyx desktop" title="" id="23" name="Picture"/>
             <a:graphic>
               <a:graphicData uri="http://schemas.openxmlformats.org/drawingml/2006/picture">
                 <pic:pic>
                   <pic:nvPicPr>
-                    <pic:cNvPr descr="../screenshots/desktop.png" id="22" name="Picture"/>
+                    <pic:cNvPr descr="../screenshots/desktop.png" id="24" name="Picture"/>
                     <pic:cNvPicPr>
                       <a:picLocks noChangeArrowheads="1" noChangeAspect="1"/>
                     </pic:cNvPicPr>
                   </pic:nvPicPr>
                   <pic:blipFill>
-                    <a:blip r:embed="rId20"/>
+                    <a:blip r:embed="rId22"/>
                     <a:stretch>
                       <a:fillRect/>
                     </a:stretch>
@@ -316,64 +316,64 @@
       </w:r>
       <w:r>
         <w:rPr>
+          <w:iCs/>
           <w:i/>
+        </w:rPr>
+        <w:t xml:space="preserve">The Onyx desktop, a modernised CDE: the menu bar, the agenda on the Voronoi wallpaper, a</w:t>
+      </w:r>
+      <w:r>
+        <w:rPr>
           <w:iCs/>
-        </w:rPr>
-        <w:t xml:space="preserve">The Onyx desktop, a modernised CDE: the menu bar, the agenda on the Voronoi wallpaper, a</w:t>
-      </w:r>
-      <w:r>
-        <w:rPr>
           <w:i/>
+        </w:rPr>
+        <w:t xml:space="preserve"> </w:t>
+      </w:r>
+      <w:r>
+        <w:rPr>
           <w:iCs/>
-        </w:rPr>
-        <w:t xml:space="preserve"> </w:t>
-      </w:r>
-      <w:r>
-        <w:rPr>
           <w:i/>
+        </w:rPr>
+        <w:t xml:space="preserve">calculator behind (grey frame), the terminal in front (its frame in the theme's colour), the dock</w:t>
+      </w:r>
+      <w:r>
+        <w:rPr>
           <w:iCs/>
-        </w:rPr>
-        <w:t xml:space="preserve">calculator behind (grey frame), the terminal in front (its frame in the theme's colour), the dock</w:t>
-      </w:r>
-      <w:r>
-        <w:rPr>
           <w:i/>
+        </w:rPr>
+        <w:t xml:space="preserve"> </w:t>
+      </w:r>
+      <w:r>
+        <w:rPr>
           <w:iCs/>
-        </w:rPr>
-        <w:t xml:space="preserve"> </w:t>
-      </w:r>
-      <w:r>
-        <w:rPr>
           <w:i/>
+        </w:rPr>
+        <w:t xml:space="preserve">with its Internet drawer open. (The real apps, run on a PC by the desktop simulator.)</w:t>
+      </w:r>
+    </w:p>
+    <w:bookmarkEnd w:id="25"/>
+    <w:bookmarkStart w:id="27" w:name="Xd640424531133ed57c940435731be17c3880fdc"/>
+    <w:p>
+      <w:pPr>
+        <w:pStyle w:val="Heading2"/>
+      </w:pPr>
+      <w:r>
+        <w:t xml:space="preserve">2. Philosophy: "own the top, reuse the bottom"</w:t>
+      </w:r>
+    </w:p>
+    <w:p>
+      <w:pPr>
+        <w:pStyle w:val="FirstParagraph"/>
+      </w:pPr>
+      <w:r>
+        <w:t xml:space="preserve">Circle is a</w:t>
+      </w:r>
+      <w:r>
+        <w:t xml:space="preserve"> </w:t>
+      </w:r>
+      <w:r>
+        <w:rPr>
           <w:iCs/>
-        </w:rPr>
-        <w:t xml:space="preserve">with its Internet drawer open. (The real apps, run on a PC by the desktop simulator.)</w:t>
-      </w:r>
-    </w:p>
-    <w:bookmarkEnd w:id="23"/>
-    <w:bookmarkStart w:id="25" w:name="Xd640424531133ed57c940435731be17c3880fdc"/>
-    <w:p>
-      <w:pPr>
-        <w:pStyle w:val="Heading2"/>
-      </w:pPr>
-      <w:r>
-        <w:t xml:space="preserve">2. Philosophy: "own the top, reuse the bottom"</w:t>
-      </w:r>
-    </w:p>
-    <w:p>
-      <w:pPr>
-        <w:pStyle w:val="FirstParagraph"/>
-      </w:pPr>
-      <w:r>
-        <w:t xml:space="preserve">Circle is a</w:t>
-      </w:r>
-      <w:r>
-        <w:t xml:space="preserve"> </w:t>
-      </w:r>
-      <w:r>
-        <w:rPr>
           <w:i/>
-          <w:iCs/>
         </w:rPr>
         <w:t xml:space="preserve">single-process, single-address-space, cooperative</w:t>
       </w:r>
@@ -394,8 +394,8 @@
       </w:r>
       <w:r>
         <w:rPr>
-          <w:b/>
-          <w:bCs/>
+          <w:bCs/>
+          <w:b/>
         </w:rPr>
         <w:t xml:space="preserve">is</w:t>
       </w:r>
@@ -410,8 +410,8 @@
       </w:r>
       <w:r>
         <w:rPr>
-          <w:b/>
-          <w:bCs/>
+          <w:bCs/>
+          <w:b/>
         </w:rPr>
         <w:t xml:space="preserve">keeps the bottom half</w:t>
       </w:r>
@@ -432,8 +432,8 @@
       </w:r>
       <w:r>
         <w:rPr>
-          <w:b/>
-          <w:bCs/>
+          <w:bCs/>
+          <w:b/>
         </w:rPr>
         <w:t xml:space="preserve">replaces its "operating system" half</w:t>
       </w:r>
@@ -446,6 +446,7 @@
         <w:tblStyle w:val="Table"/>
         <w:tblW w:type="auto" w:w="0"/>
         <w:tblLook w:firstRow="1" w:lastRow="0" w:firstColumn="0" w:lastColumn="0" w:noHBand="0" w:noVBand="0" w:val="0020"/>
+        <w:jc w:val="start"/>
       </w:tblPr>
       <w:tblGrid>
         <w:gridCol w:w="2640"/>
@@ -454,13 +455,14 @@
       </w:tblGrid>
       <w:tr>
         <w:trPr>
-          <w:tblHeader w:val="on"/>
+          <w:tblHeader w:val="true"/>
         </w:trPr>
         <w:tc>
           <w:tcPr/>
           <w:p>
             <w:pPr>
               <w:pStyle w:val="Compact"/>
+              <w:jc w:val="left"/>
             </w:pPr>
             <w:r>
               <w:t xml:space="preserve">Layer</w:t>
@@ -472,6 +474,7 @@
           <w:p>
             <w:pPr>
               <w:pStyle w:val="Compact"/>
+              <w:jc w:val="left"/>
             </w:pPr>
             <w:r>
               <w:t xml:space="preserve">Decision</w:t>
@@ -483,6 +486,7 @@
           <w:p>
             <w:pPr>
               <w:pStyle w:val="Compact"/>
+              <w:jc w:val="left"/>
             </w:pPr>
             <w:r>
               <w:t xml:space="preserve">Detail</w:t>
@@ -496,6 +500,7 @@
           <w:p>
             <w:pPr>
               <w:pStyle w:val="Compact"/>
+              <w:jc w:val="left"/>
             </w:pPr>
             <w:r>
               <w:t xml:space="preserve">Reset → EL1, MMU activation, GIC, C++ constructors</w:t>
@@ -507,11 +512,12 @@
           <w:p>
             <w:pPr>
               <w:pStyle w:val="Compact"/>
+              <w:jc w:val="left"/>
             </w:pPr>
             <w:r>
               <w:rPr>
+                <w:bCs/>
                 <w:b/>
-                <w:bCs/>
               </w:rPr>
               <w:t xml:space="preserve">Keep Circle</w:t>
             </w:r>
@@ -522,6 +528,7 @@
           <w:p>
             <w:pPr>
               <w:pStyle w:val="Compact"/>
+              <w:jc w:val="left"/>
             </w:pPr>
             <w:r>
               <w:t xml:space="preserve">Our entry point is</w:t>
@@ -547,6 +554,7 @@
           <w:p>
             <w:pPr>
               <w:pStyle w:val="Compact"/>
+              <w:jc w:val="left"/>
             </w:pPr>
             <w:r>
               <w:t xml:space="preserve">64 KB page allocator (</w:t>
@@ -576,11 +584,12 @@
           <w:p>
             <w:pPr>
               <w:pStyle w:val="Compact"/>
+              <w:jc w:val="left"/>
             </w:pPr>
             <w:r>
               <w:rPr>
+                <w:bCs/>
                 <w:b/>
-                <w:bCs/>
               </w:rPr>
               <w:t xml:space="preserve">Keep</w:t>
             </w:r>
@@ -597,6 +606,7 @@
           <w:p>
             <w:pPr>
               <w:pStyle w:val="Compact"/>
+              <w:jc w:val="left"/>
             </w:pPr>
             <w:r>
               <w:rPr>
@@ -616,6 +626,7 @@
           <w:p>
             <w:pPr>
               <w:pStyle w:val="Compact"/>
+              <w:jc w:val="left"/>
             </w:pPr>
             <w:r>
               <w:t xml:space="preserve">GIC-400, timer, mailbox, EMMC+FatFs, USB, Ethernet, framebuffer</w:t>
@@ -627,11 +638,12 @@
           <w:p>
             <w:pPr>
               <w:pStyle w:val="Compact"/>
+              <w:jc w:val="left"/>
             </w:pPr>
             <w:r>
               <w:rPr>
+                <w:bCs/>
                 <w:b/>
-                <w:bCs/>
               </w:rPr>
               <w:t xml:space="preserve">Reuse</w:t>
             </w:r>
@@ -642,6 +654,7 @@
           <w:p>
             <w:pPr>
               <w:pStyle w:val="Compact"/>
+              <w:jc w:val="left"/>
             </w:pPr>
             <w:r>
               <w:t xml:space="preserve">This is the whole point of building on Circle.</w:t>
@@ -655,6 +668,7 @@
           <w:p>
             <w:pPr>
               <w:pStyle w:val="Compact"/>
+              <w:jc w:val="left"/>
             </w:pPr>
             <w:r>
               <w:rPr>
@@ -684,11 +698,12 @@
           <w:p>
             <w:pPr>
               <w:pStyle w:val="Compact"/>
+              <w:jc w:val="left"/>
             </w:pPr>
             <w:r>
               <w:rPr>
+                <w:bCs/>
                 <w:b/>
-                <w:bCs/>
               </w:rPr>
               <w:t xml:space="preserve">Rewrite the implementation, keep the API</w:t>
             </w:r>
@@ -699,6 +714,7 @@
           <w:p>
             <w:pPr>
               <w:pStyle w:val="Compact"/>
+              <w:jc w:val="left"/>
             </w:pPr>
             <w:r>
               <w:t xml:space="preserve">See</w:t>
@@ -706,7 +722,7 @@
             <w:r>
               <w:t xml:space="preserve"> </w:t>
             </w:r>
-            <w:hyperlink r:id="rId24">
+            <w:hyperlink r:id="rId26">
               <w:r>
                 <w:rPr>
                   <w:rStyle w:val="Hyperlink"/>
@@ -726,6 +742,7 @@
           <w:p>
             <w:pPr>
               <w:pStyle w:val="Compact"/>
+              <w:jc w:val="left"/>
             </w:pPr>
             <w:r>
               <w:t xml:space="preserve">Per-process page tables, context switching, exception vectors, address spaces</w:t>
@@ -737,11 +754,12 @@
           <w:p>
             <w:pPr>
               <w:pStyle w:val="Compact"/>
+              <w:jc w:val="left"/>
             </w:pPr>
             <w:r>
               <w:rPr>
+                <w:bCs/>
                 <w:b/>
-                <w:bCs/>
               </w:rPr>
               <w:t xml:space="preserve">Write from scratch</w:t>
             </w:r>
@@ -752,6 +770,7 @@
           <w:p>
             <w:pPr>
               <w:pStyle w:val="Compact"/>
+              <w:jc w:val="left"/>
             </w:pPr>
             <w:r>
               <w:t xml:space="preserve">Doesn't exist in Circle.</w:t>
@@ -772,8 +791,8 @@
       </w:r>
       <w:r>
         <w:rPr>
-          <w:b/>
-          <w:bCs/>
+          <w:bCs/>
+          <w:b/>
         </w:rPr>
         <w:t xml:space="preserve">link</w:t>
       </w:r>
@@ -829,8 +848,8 @@
         <w:t xml:space="preserve">sources.</w:t>
       </w:r>
     </w:p>
-    <w:bookmarkEnd w:id="25"/>
-    <w:bookmarkStart w:id="31" w:name="Xf0d948a12025d44e9afbc6dcf23238f6e9c5d4e"/>
+    <w:bookmarkEnd w:id="27"/>
+    <w:bookmarkStart w:id="33" w:name="Xf0d948a12025d44e9afbc6dcf23238f6e9c5d4e"/>
     <w:p>
       <w:pPr>
         <w:pStyle w:val="Heading2"/>
@@ -841,16 +860,16 @@
     </w:p>
     <w:p>
       <w:pPr>
-        <w:pStyle w:val="Compact"/>
         <w:numPr>
           <w:ilvl w:val="0"/>
           <w:numId w:val="1001"/>
         </w:numPr>
-      </w:pPr>
-      <w:r>
-        <w:rPr>
-          <w:b/>
-          <w:bCs/>
+        <w:pStyle w:val="Compact"/>
+      </w:pPr>
+      <w:r>
+        <w:rPr>
+          <w:bCs/>
+          <w:b/>
         </w:rPr>
         <w:t xml:space="preserve">Per-process isolation via the MMU.</w:t>
       </w:r>
@@ -871,8 +890,8 @@
       </w:r>
       <w:r>
         <w:rPr>
-          <w:b/>
-          <w:bCs/>
+          <w:bCs/>
+          <w:b/>
         </w:rPr>
         <w:t xml:space="preserve">ASID</w:t>
       </w:r>
@@ -888,16 +907,16 @@
     </w:p>
     <w:p>
       <w:pPr>
-        <w:pStyle w:val="Compact"/>
         <w:numPr>
           <w:ilvl w:val="0"/>
           <w:numId w:val="1001"/>
         </w:numPr>
-      </w:pPr>
-      <w:r>
-        <w:rPr>
-          <w:b/>
-          <w:bCs/>
+        <w:pStyle w:val="Compact"/>
+      </w:pPr>
+      <w:r>
+        <w:rPr>
+          <w:bCs/>
+          <w:b/>
         </w:rPr>
         <w:t xml:space="preserve">Protected apps (EL0).</w:t>
       </w:r>
@@ -912,8 +931,8 @@
       </w:r>
       <w:r>
         <w:rPr>
-          <w:b/>
-          <w:bCs/>
+          <w:bCs/>
+          <w:b/>
         </w:rPr>
         <w:t xml:space="preserve">EL0</w:t>
       </w:r>
@@ -931,8 +950,8 @@
       </w:r>
       <w:r>
         <w:rPr>
-          <w:b/>
-          <w:bCs/>
+          <w:bCs/>
+          <w:b/>
         </w:rPr>
         <w:t xml:space="preserve">system calls</w:t>
       </w:r>
@@ -956,8 +975,8 @@
       </w:r>
       <w:r>
         <w:rPr>
-          <w:b/>
-          <w:bCs/>
+          <w:bCs/>
+          <w:b/>
         </w:rPr>
         <w:t xml:space="preserve">and</w:t>
       </w:r>
@@ -976,31 +995,31 @@
     </w:p>
     <w:p>
       <w:pPr>
-        <w:pStyle w:val="Compact"/>
         <w:numPr>
           <w:ilvl w:val="0"/>
           <w:numId w:val="1001"/>
         </w:numPr>
-      </w:pPr>
-      <w:r>
-        <w:rPr>
-          <w:b/>
-          <w:bCs/>
+        <w:pStyle w:val="Compact"/>
+      </w:pPr>
+      <w:r>
+        <w:rPr>
+          <w:bCs/>
+          <w:b/>
         </w:rPr>
         <w:t xml:space="preserve">Stable fixed-address ABI (</w:t>
       </w:r>
       <w:r>
         <w:rPr>
           <w:rStyle w:val="VerbatimChar"/>
-          <w:b/>
-          <w:bCs/>
+          <w:bCs/>
+          <w:b/>
         </w:rPr>
         <w:t xml:space="preserve">kapi</w:t>
       </w:r>
       <w:r>
         <w:rPr>
-          <w:b/>
-          <w:bCs/>
+          <w:bCs/>
+          <w:b/>
         </w:rPr>
         <w:t xml:space="preserve">).</w:t>
       </w:r>
@@ -1015,22 +1034,22 @@
       </w:r>
       <w:r>
         <w:rPr>
-          <w:b/>
-          <w:bCs/>
+          <w:bCs/>
+          <w:b/>
         </w:rPr>
         <w:t xml:space="preserve">table of function</w:t>
       </w:r>
       <w:r>
         <w:rPr>
-          <w:b/>
-          <w:bCs/>
-        </w:rPr>
-        <w:t xml:space="preserve"> </w:t>
-      </w:r>
-      <w:r>
-        <w:rPr>
-          <w:b/>
-          <w:bCs/>
+          <w:bCs/>
+          <w:b/>
+        </w:rPr>
+        <w:t xml:space="preserve"> </w:t>
+      </w:r>
+      <w:r>
+        <w:rPr>
+          <w:bCs/>
+          <w:b/>
         </w:rPr>
         <w:t xml:space="preserve">pointers</w:t>
       </w:r>
@@ -1051,8 +1070,8 @@
       </w:r>
       <w:r>
         <w:rPr>
-          <w:b/>
-          <w:bCs/>
+          <w:bCs/>
+          <w:b/>
         </w:rPr>
         <w:t xml:space="preserve">an application binary keeps working without recompilation</w:t>
       </w:r>
@@ -1073,8 +1092,8 @@
       </w:r>
       <w:r>
         <w:rPr>
-          <w:b/>
-          <w:bCs/>
+          <w:bCs/>
+          <w:b/>
         </w:rPr>
         <w:t xml:space="preserve">97</w:t>
       </w:r>
@@ -1105,16 +1124,16 @@
     </w:p>
     <w:p>
       <w:pPr>
-        <w:pStyle w:val="Compact"/>
         <w:numPr>
           <w:ilvl w:val="0"/>
           <w:numId w:val="1001"/>
         </w:numPr>
-      </w:pPr>
-      <w:r>
-        <w:rPr>
-          <w:b/>
-          <w:bCs/>
+        <w:pStyle w:val="Compact"/>
+      </w:pPr>
+      <w:r>
+        <w:rPr>
+          <w:bCs/>
+          <w:b/>
         </w:rPr>
         <w:t xml:space="preserve">Demand paging</w:t>
       </w:r>
@@ -1139,16 +1158,16 @@
     </w:p>
     <w:p>
       <w:pPr>
-        <w:pStyle w:val="Compact"/>
         <w:numPr>
           <w:ilvl w:val="0"/>
           <w:numId w:val="1001"/>
         </w:numPr>
-      </w:pPr>
-      <w:r>
-        <w:rPr>
-          <w:b/>
-          <w:bCs/>
+        <w:pStyle w:val="Compact"/>
+      </w:pPr>
+      <w:r>
+        <w:rPr>
+          <w:bCs/>
+          <w:b/>
         </w:rPr>
         <w:t xml:space="preserve">Shared images, shared libraries, preloading.</w:t>
       </w:r>
@@ -1163,8 +1182,8 @@
       </w:r>
       <w:r>
         <w:rPr>
-          <w:b/>
-          <w:bCs/>
+          <w:bCs/>
+          <w:b/>
         </w:rPr>
         <w:t xml:space="preserve">once</w:t>
       </w:r>
@@ -1203,8 +1222,8 @@
       </w:r>
       <w:r>
         <w:rPr>
-          <w:b/>
-          <w:bCs/>
+          <w:bCs/>
+          <w:b/>
         </w:rPr>
         <w:t xml:space="preserve">shared library</w:t>
       </w:r>
@@ -1234,8 +1253,8 @@
       </w:r>
       <w:r>
         <w:rPr>
-          <w:b/>
-          <w:bCs/>
+          <w:bCs/>
+          <w:b/>
         </w:rPr>
         <w:t xml:space="preserve">preloaded</w:t>
       </w:r>
@@ -1272,7 +1291,7 @@
       <w:r>
         <w:t xml:space="preserve">(</w:t>
       </w:r>
-      <w:hyperlink r:id="rId24">
+      <w:hyperlink r:id="rId26">
         <w:r>
           <w:rPr>
             <w:rStyle w:val="Hyperlink"/>
@@ -1288,24 +1307,24 @@
       </w:r>
       <w:r>
         <w:rPr>
+          <w:iCs/>
           <w:i/>
+        </w:rPr>
+        <w:t xml:space="preserve">Demand paging</w:t>
+      </w:r>
+      <w:r>
+        <w:t xml:space="preserve"> </w:t>
+      </w:r>
+      <w:r>
+        <w:t xml:space="preserve">and</w:t>
+      </w:r>
+      <w:r>
+        <w:t xml:space="preserve"> </w:t>
+      </w:r>
+      <w:r>
+        <w:rPr>
           <w:iCs/>
-        </w:rPr>
-        <w:t xml:space="preserve">Demand paging</w:t>
-      </w:r>
-      <w:r>
-        <w:t xml:space="preserve"> </w:t>
-      </w:r>
-      <w:r>
-        <w:t xml:space="preserve">and</w:t>
-      </w:r>
-      <w:r>
-        <w:t xml:space="preserve"> </w:t>
-      </w:r>
-      <w:r>
-        <w:rPr>
           <w:i/>
-          <w:iCs/>
         </w:rPr>
         <w:t xml:space="preserve">Shared libraries</w:t>
       </w:r>
@@ -1315,16 +1334,16 @@
     </w:p>
     <w:p>
       <w:pPr>
-        <w:pStyle w:val="Compact"/>
         <w:numPr>
           <w:ilvl w:val="0"/>
           <w:numId w:val="1001"/>
         </w:numPr>
-      </w:pPr>
-      <w:r>
-        <w:rPr>
-          <w:b/>
-          <w:bCs/>
+        <w:pStyle w:val="Compact"/>
+      </w:pPr>
+      <w:r>
+        <w:rPr>
+          <w:bCs/>
+          <w:b/>
         </w:rPr>
         <w:t xml:space="preserve">The kits.</w:t>
       </w:r>
@@ -1339,8 +1358,8 @@
       </w:r>
       <w:r>
         <w:rPr>
-          <w:b/>
-          <w:bCs/>
+          <w:bCs/>
+          <w:b/>
         </w:rPr>
         <w:t xml:space="preserve">kit per domain</w:t>
       </w:r>
@@ -1352,8 +1371,8 @@
       </w:r>
       <w:r>
         <w:rPr>
-          <w:b/>
-          <w:bCs/>
+          <w:bCs/>
+          <w:b/>
         </w:rPr>
         <w:t xml:space="preserve">AppKit</w:t>
       </w:r>
@@ -1374,8 +1393,8 @@
       </w:r>
       <w:r>
         <w:rPr>
-          <w:b/>
-          <w:bCs/>
+          <w:bCs/>
+          <w:b/>
         </w:rPr>
         <w:t xml:space="preserve">UIKit</w:t>
       </w:r>
@@ -1390,8 +1409,8 @@
       </w:r>
       <w:r>
         <w:rPr>
-          <w:b/>
-          <w:bCs/>
+          <w:bCs/>
+          <w:b/>
         </w:rPr>
         <w:t xml:space="preserve">SystemKit</w:t>
       </w:r>
@@ -1412,8 +1431,8 @@
       </w:r>
       <w:r>
         <w:rPr>
-          <w:b/>
-          <w:bCs/>
+          <w:bCs/>
+          <w:b/>
         </w:rPr>
         <w:t xml:space="preserve">NetKit</w:t>
       </w:r>
@@ -1425,8 +1444,8 @@
       </w:r>
       <w:r>
         <w:rPr>
-          <w:b/>
-          <w:bCs/>
+          <w:bCs/>
+          <w:b/>
         </w:rPr>
         <w:t xml:space="preserve">FileKit</w:t>
       </w:r>
@@ -1438,8 +1457,8 @@
       </w:r>
       <w:r>
         <w:rPr>
-          <w:b/>
-          <w:bCs/>
+          <w:bCs/>
+          <w:b/>
         </w:rPr>
         <w:t xml:space="preserve">ImageKit</w:t>
       </w:r>
@@ -1451,8 +1470,8 @@
       </w:r>
       <w:r>
         <w:rPr>
-          <w:b/>
-          <w:bCs/>
+          <w:bCs/>
+          <w:b/>
         </w:rPr>
         <w:t xml:space="preserve">AudioKit</w:t>
       </w:r>
@@ -1464,8 +1483,8 @@
       </w:r>
       <w:r>
         <w:rPr>
-          <w:b/>
-          <w:bCs/>
+          <w:bCs/>
+          <w:b/>
         </w:rPr>
         <w:t xml:space="preserve">FontKit</w:t>
       </w:r>
@@ -1477,8 +1496,8 @@
       </w:r>
       <w:r>
         <w:rPr>
-          <w:b/>
-          <w:bCs/>
+          <w:bCs/>
+          <w:b/>
         </w:rPr>
         <w:t xml:space="preserve">PrinterKit</w:t>
       </w:r>
@@ -1490,8 +1509,8 @@
       </w:r>
       <w:r>
         <w:rPr>
-          <w:b/>
-          <w:bCs/>
+          <w:bCs/>
+          <w:b/>
         </w:rPr>
         <w:t xml:space="preserve">GPIOKit</w:t>
       </w:r>
@@ -1504,7 +1523,7 @@
       <w:r>
         <w:t xml:space="preserve">is replaced on the card, the programs are not rebuilt. (</w:t>
       </w:r>
-      <w:hyperlink r:id="rId26">
+      <w:hyperlink r:id="rId28">
         <w:r>
           <w:rPr>
             <w:rStyle w:val="Hyperlink"/>
@@ -1518,16 +1537,16 @@
     </w:p>
     <w:p>
       <w:pPr>
-        <w:pStyle w:val="Compact"/>
         <w:numPr>
           <w:ilvl w:val="0"/>
           <w:numId w:val="1001"/>
         </w:numPr>
-      </w:pPr>
-      <w:r>
-        <w:rPr>
-          <w:b/>
-          <w:bCs/>
+        <w:pStyle w:val="Compact"/>
+      </w:pPr>
+      <w:r>
+        <w:rPr>
+          <w:bCs/>
+          <w:b/>
         </w:rPr>
         <w:t xml:space="preserve">Threads, app cores, RAM volume.</w:t>
       </w:r>
@@ -1564,16 +1583,16 @@
     </w:p>
     <w:p>
       <w:pPr>
-        <w:pStyle w:val="Compact"/>
         <w:numPr>
           <w:ilvl w:val="0"/>
           <w:numId w:val="1001"/>
         </w:numPr>
-      </w:pPr>
-      <w:r>
-        <w:rPr>
-          <w:b/>
-          <w:bCs/>
+        <w:pStyle w:val="Compact"/>
+      </w:pPr>
+      <w:r>
+        <w:rPr>
+          <w:bCs/>
+          <w:b/>
         </w:rPr>
         <w:t xml:space="preserve">The GPU.</w:t>
       </w:r>
@@ -1607,16 +1626,16 @@
     </w:p>
     <w:p>
       <w:pPr>
-        <w:pStyle w:val="Compact"/>
         <w:numPr>
           <w:ilvl w:val="0"/>
           <w:numId w:val="1001"/>
         </w:numPr>
-      </w:pPr>
-      <w:r>
-        <w:rPr>
-          <w:b/>
-          <w:bCs/>
+        <w:pStyle w:val="Compact"/>
+      </w:pPr>
+      <w:r>
+        <w:rPr>
+          <w:bCs/>
+          <w:b/>
         </w:rPr>
         <w:t xml:space="preserve">The graphics server is a user process</w:t>
       </w:r>
@@ -1631,8 +1650,8 @@
       </w:r>
       <w:r>
         <w:rPr>
-          <w:b/>
-          <w:bCs/>
+          <w:bCs/>
+          <w:b/>
         </w:rPr>
         <w:t xml:space="preserve">Elegant</w:t>
       </w:r>
@@ -1672,16 +1691,16 @@
     </w:p>
     <w:p>
       <w:pPr>
-        <w:pStyle w:val="Compact"/>
         <w:numPr>
           <w:ilvl w:val="0"/>
           <w:numId w:val="1001"/>
         </w:numPr>
-      </w:pPr>
-      <w:r>
-        <w:rPr>
-          <w:b/>
-          <w:bCs/>
+        <w:pStyle w:val="Compact"/>
+      </w:pPr>
+      <w:r>
+        <w:rPr>
+          <w:bCs/>
+          <w:b/>
         </w:rPr>
         <w:t xml:space="preserve">Full graphical desktop.</w:t>
       </w:r>
@@ -1702,8 +1721,8 @@
       </w:r>
       <w:r>
         <w:rPr>
-          <w:b/>
-          <w:bCs/>
+          <w:bCs/>
+          <w:b/>
         </w:rPr>
         <w:t xml:space="preserve">UIKit</w:t>
       </w:r>
@@ -1719,16 +1738,16 @@
     </w:p>
     <w:p>
       <w:pPr>
-        <w:pStyle w:val="Compact"/>
         <w:numPr>
           <w:ilvl w:val="0"/>
           <w:numId w:val="1001"/>
         </w:numPr>
-      </w:pPr>
-      <w:r>
-        <w:rPr>
-          <w:b/>
-          <w:bCs/>
+        <w:pStyle w:val="Compact"/>
+      </w:pPr>
+      <w:r>
+        <w:rPr>
+          <w:bCs/>
+          <w:b/>
         </w:rPr>
         <w:t xml:space="preserve">Three interfaces, one binary per app.</w:t>
       </w:r>
@@ -1767,8 +1786,8 @@
       </w:r>
       <w:r>
         <w:rPr>
-          <w:b/>
-          <w:bCs/>
+          <w:bCs/>
+          <w:b/>
         </w:rPr>
         <w:t xml:space="preserve">Mode</w:t>
       </w:r>
@@ -1783,8 +1802,8 @@
       </w:r>
       <w:r>
         <w:rPr>
-          <w:b/>
-          <w:bCs/>
+          <w:bCs/>
+          <w:b/>
         </w:rPr>
         <w:t xml:space="preserve">desktop</w:t>
       </w:r>
@@ -1805,8 +1824,8 @@
       </w:r>
       <w:r>
         <w:rPr>
-          <w:b/>
-          <w:bCs/>
+          <w:bCs/>
+          <w:b/>
         </w:rPr>
         <w:t xml:space="preserve">pocket</w:t>
       </w:r>
@@ -1827,8 +1846,8 @@
       </w:r>
       <w:r>
         <w:rPr>
-          <w:b/>
-          <w:bCs/>
+          <w:bCs/>
+          <w:b/>
         </w:rPr>
         <w:t xml:space="preserve">console</w:t>
       </w:r>
@@ -1855,29 +1874,29 @@
       </w:r>
       <w:r>
         <w:rPr>
-          <w:b/>
-          <w:bCs/>
+          <w:bCs/>
+          <w:b/>
         </w:rPr>
         <w:t xml:space="preserve">an app is</w:t>
       </w:r>
       <w:r>
         <w:rPr>
-          <w:b/>
-          <w:bCs/>
-        </w:rPr>
-        <w:t xml:space="preserve"> </w:t>
-      </w:r>
-      <w:r>
-        <w:rPr>
-          <w:b/>
-          <w:bCs/>
+          <w:bCs/>
+          <w:b/>
+        </w:rPr>
+        <w:t xml:space="preserve"> </w:t>
+      </w:r>
+      <w:r>
+        <w:rPr>
+          <w:bCs/>
+          <w:b/>
         </w:rPr>
         <w:t xml:space="preserve">not rebuilt, and has no code per mode</w:t>
       </w:r>
       <w:r>
         <w:t xml:space="preserve">. (</w:t>
       </w:r>
-      <w:hyperlink r:id="rId27">
+      <w:hyperlink r:id="rId29">
         <w:r>
           <w:rPr>
             <w:rStyle w:val="Hyperlink"/>
@@ -1894,7 +1913,7 @@
       <w:r>
         <w:t xml:space="preserve"> </w:t>
       </w:r>
-      <w:hyperlink r:id="rId28">
+      <w:hyperlink r:id="rId30">
         <w:r>
           <w:rPr>
             <w:rStyle w:val="Hyperlink"/>
@@ -1908,16 +1927,16 @@
     </w:p>
     <w:p>
       <w:pPr>
-        <w:pStyle w:val="Compact"/>
         <w:numPr>
           <w:ilvl w:val="0"/>
           <w:numId w:val="1001"/>
         </w:numPr>
-      </w:pPr>
-      <w:r>
-        <w:rPr>
-          <w:b/>
-          <w:bCs/>
+        <w:pStyle w:val="Compact"/>
+      </w:pPr>
+      <w:r>
+        <w:rPr>
+          <w:bCs/>
+          <w:b/>
         </w:rPr>
         <w:t xml:space="preserve">English and French.</w:t>
       </w:r>
@@ -1930,16 +1949,16 @@
     </w:p>
     <w:p>
       <w:pPr>
-        <w:pStyle w:val="Compact"/>
         <w:numPr>
           <w:ilvl w:val="0"/>
           <w:numId w:val="1001"/>
         </w:numPr>
-      </w:pPr>
-      <w:r>
-        <w:rPr>
-          <w:b/>
-          <w:bCs/>
+        <w:pStyle w:val="Compact"/>
+      </w:pPr>
+      <w:r>
+        <w:rPr>
+          <w:bCs/>
+          <w:b/>
         </w:rPr>
         <w:t xml:space="preserve">Onyx shell.</w:t>
       </w:r>
@@ -1966,8 +1985,8 @@
       </w:r>
       <w:r>
         <w:rPr>
-          <w:b/>
-          <w:bCs/>
+          <w:bCs/>
+          <w:b/>
         </w:rPr>
         <w:t xml:space="preserve">pipes and redirection</w:t>
       </w:r>
@@ -2049,16 +2068,16 @@
     </w:p>
     <w:p>
       <w:pPr>
-        <w:pStyle w:val="Compact"/>
         <w:numPr>
           <w:ilvl w:val="0"/>
           <w:numId w:val="1001"/>
         </w:numPr>
-      </w:pPr>
-      <w:r>
-        <w:rPr>
-          <w:b/>
-          <w:bCs/>
+        <w:pStyle w:val="Compact"/>
+      </w:pPr>
+      <w:r>
+        <w:rPr>
+          <w:bCs/>
+          <w:b/>
         </w:rPr>
         <w:t xml:space="preserve">Application catalog</w:t>
       </w:r>
@@ -2068,7 +2087,7 @@
       <w:r>
         <w:t xml:space="preserve">(</w:t>
       </w:r>
-      <w:hyperlink r:id="rId29">
+      <w:hyperlink r:id="rId31">
         <w:r>
           <w:rPr>
             <w:rStyle w:val="Hyperlink"/>
@@ -2217,16 +2236,16 @@
     </w:p>
     <w:p>
       <w:pPr>
-        <w:pStyle w:val="Compact"/>
         <w:numPr>
           <w:ilvl w:val="0"/>
           <w:numId w:val="1001"/>
         </w:numPr>
-      </w:pPr>
-      <w:r>
-        <w:rPr>
-          <w:b/>
-          <w:bCs/>
+        <w:pStyle w:val="Compact"/>
+      </w:pPr>
+      <w:r>
+        <w:rPr>
+          <w:bCs/>
+          <w:b/>
         </w:rPr>
         <w:t xml:space="preserve">USB input devices.</w:t>
       </w:r>
@@ -2245,16 +2264,16 @@
     </w:p>
     <w:p>
       <w:pPr>
-        <w:pStyle w:val="Compact"/>
         <w:numPr>
           <w:ilvl w:val="0"/>
           <w:numId w:val="1001"/>
         </w:numPr>
-      </w:pPr>
-      <w:r>
-        <w:rPr>
-          <w:b/>
-          <w:bCs/>
+        <w:pStyle w:val="Compact"/>
+      </w:pPr>
+      <w:r>
+        <w:rPr>
+          <w:bCs/>
+          <w:b/>
         </w:rPr>
         <w:t xml:space="preserve">Networking (WLAN).</w:t>
       </w:r>
@@ -2318,16 +2337,16 @@
     </w:p>
     <w:p>
       <w:pPr>
-        <w:pStyle w:val="Compact"/>
         <w:numPr>
           <w:ilvl w:val="0"/>
           <w:numId w:val="1001"/>
         </w:numPr>
-      </w:pPr>
-      <w:r>
-        <w:rPr>
-          <w:b/>
-          <w:bCs/>
+        <w:pStyle w:val="Compact"/>
+      </w:pPr>
+      <w:r>
+        <w:rPr>
+          <w:bCs/>
+          <w:b/>
         </w:rPr>
         <w:t xml:space="preserve">Packages.</w:t>
       </w:r>
@@ -2373,16 +2392,16 @@
     </w:p>
     <w:p>
       <w:pPr>
-        <w:pStyle w:val="Compact"/>
         <w:numPr>
           <w:ilvl w:val="0"/>
           <w:numId w:val="1001"/>
         </w:numPr>
-      </w:pPr>
-      <w:r>
-        <w:rPr>
-          <w:b/>
-          <w:bCs/>
+        <w:pStyle w:val="Compact"/>
+      </w:pPr>
+      <w:r>
+        <w:rPr>
+          <w:bCs/>
+          <w:b/>
         </w:rPr>
         <w:t xml:space="preserve">A modern web browser.</w:t>
       </w:r>
@@ -2391,8 +2410,8 @@
       </w:r>
       <w:r>
         <w:rPr>
-          <w:b/>
-          <w:bCs/>
+          <w:bCs/>
+          <w:b/>
         </w:rPr>
         <w:t xml:space="preserve">Jet Browser</w:t>
       </w:r>
@@ -2416,8 +2435,8 @@
       </w:r>
       <w:r>
         <w:rPr>
-          <w:b/>
-          <w:bCs/>
+          <w:bCs/>
+          <w:b/>
         </w:rPr>
         <w:t xml:space="preserve">WebKit</w:t>
       </w:r>
@@ -2505,7 +2524,7 @@
       <w:r>
         <w:t xml:space="preserve"> </w:t>
       </w:r>
-      <w:hyperlink r:id="rId30">
+      <w:hyperlink r:id="rId32">
         <w:r>
           <w:rPr>
             <w:rStyle w:val="Hyperlink"/>
@@ -2517,8 +2536,8 @@
         <w:t xml:space="preserve">.</w:t>
       </w:r>
     </w:p>
-    <w:bookmarkEnd w:id="31"/>
-    <w:bookmarkStart w:id="32" w:name="X66f2bb71df6feea41223d9c271803389d6670e0"/>
+    <w:bookmarkEnd w:id="33"/>
+    <w:bookmarkStart w:id="34" w:name="X66f2bb71df6feea41223d9c271803389d6670e0"/>
     <w:p>
       <w:pPr>
         <w:pStyle w:val="Heading2"/>
@@ -2727,8 +2746,8 @@
         <w:t xml:space="preserve">└──────────────────────────────────────────────────────────────────┘</w:t>
       </w:r>
     </w:p>
-    <w:bookmarkEnd w:id="32"/>
-    <w:bookmarkStart w:id="34" w:name="Xe020df86a20dd184672bf24142e3014208d91a9"/>
+    <w:bookmarkEnd w:id="34"/>
+    <w:bookmarkStart w:id="36" w:name="Xe020df86a20dd184672bf24142e3014208d91a9"/>
     <w:p>
       <w:pPr>
         <w:pStyle w:val="Heading2"/>
@@ -2747,11 +2766,11 @@
     </w:p>
     <w:p>
       <w:pPr>
-        <w:pStyle w:val="Compact"/>
         <w:numPr>
           <w:ilvl w:val="0"/>
           <w:numId w:val="1002"/>
         </w:numPr>
+        <w:pStyle w:val="Compact"/>
       </w:pPr>
       <w:r>
         <w:t xml:space="preserve">Applications run at</w:t>
@@ -2761,8 +2780,8 @@
       </w:r>
       <w:r>
         <w:rPr>
-          <w:b/>
-          <w:bCs/>
+          <w:bCs/>
+          <w:b/>
         </w:rPr>
         <w:t xml:space="preserve">EL0</w:t>
       </w:r>
@@ -2774,8 +2793,8 @@
       </w:r>
       <w:r>
         <w:rPr>
-          <w:b/>
-          <w:bCs/>
+          <w:bCs/>
+          <w:b/>
         </w:rPr>
         <w:t xml:space="preserve">each in its own page table</w:t>
       </w:r>
@@ -2794,11 +2813,11 @@
     </w:p>
     <w:p>
       <w:pPr>
-        <w:pStyle w:val="Compact"/>
         <w:numPr>
           <w:ilvl w:val="0"/>
           <w:numId w:val="1002"/>
         </w:numPr>
+        <w:pStyle w:val="Compact"/>
       </w:pPr>
       <w:r>
         <w:t xml:space="preserve">They</w:t>
@@ -2808,37 +2827,37 @@
       </w:r>
       <w:r>
         <w:rPr>
-          <w:b/>
-          <w:bCs/>
+          <w:bCs/>
+          <w:b/>
         </w:rPr>
         <w:t xml:space="preserve">call the kernel through the</w:t>
       </w:r>
       <w:r>
         <w:rPr>
-          <w:b/>
-          <w:bCs/>
-        </w:rPr>
-        <w:t xml:space="preserve"> </w:t>
-      </w:r>
-      <w:r>
-        <w:rPr>
-          <w:rStyle w:val="VerbatimChar"/>
-          <w:b/>
-          <w:bCs/>
+          <w:bCs/>
+          <w:b/>
+        </w:rPr>
+        <w:t xml:space="preserve"> </w:t>
+      </w:r>
+      <w:r>
+        <w:rPr>
+          <w:rStyle w:val="VerbatimChar"/>
+          <w:bCs/>
+          <w:b/>
         </w:rPr>
         <w:t xml:space="preserve">kapi</w:t>
       </w:r>
       <w:r>
         <w:rPr>
-          <w:b/>
-          <w:bCs/>
-        </w:rPr>
-        <w:t xml:space="preserve"> </w:t>
-      </w:r>
-      <w:r>
-        <w:rPr>
-          <w:b/>
-          <w:bCs/>
+          <w:bCs/>
+          <w:b/>
+        </w:rPr>
+        <w:t xml:space="preserve"> </w:t>
+      </w:r>
+      <w:r>
+        <w:rPr>
+          <w:bCs/>
+          <w:b/>
         </w:rPr>
         <w:t xml:space="preserve">table</w:t>
       </w:r>
@@ -2868,8 +2887,8 @@
       </w:r>
       <w:r>
         <w:rPr>
-          <w:b/>
-          <w:bCs/>
+          <w:bCs/>
+          <w:b/>
         </w:rPr>
         <w:t xml:space="preserve">system call</w:t>
       </w:r>
@@ -2915,16 +2934,16 @@
     </w:p>
     <w:p>
       <w:pPr>
-        <w:pStyle w:val="Compact"/>
         <w:numPr>
           <w:ilvl w:val="0"/>
           <w:numId w:val="1002"/>
         </w:numPr>
-      </w:pPr>
-      <w:r>
-        <w:rPr>
-          <w:b/>
-          <w:bCs/>
+        <w:pStyle w:val="Compact"/>
+      </w:pPr>
+      <w:r>
+        <w:rPr>
+          <w:bCs/>
+          <w:b/>
         </w:rPr>
         <w:t xml:space="preserve">A fault in an app kills that app</w:t>
       </w:r>
@@ -2955,11 +2974,11 @@
     </w:p>
     <w:p>
       <w:pPr>
-        <w:pStyle w:val="Compact"/>
         <w:numPr>
           <w:ilvl w:val="0"/>
           <w:numId w:val="1002"/>
         </w:numPr>
+        <w:pStyle w:val="Compact"/>
       </w:pPr>
       <w:r>
         <w:t xml:space="preserve">History: the project first ran apps at EL1 with direct calls ("Option C",</w:t>
@@ -2985,7 +3004,7 @@
       <w:r>
         <w:t xml:space="preserve">steps (</w:t>
       </w:r>
-      <w:hyperlink r:id="rId33">
+      <w:hyperlink r:id="rId35">
         <w:r>
           <w:rPr>
             <w:rStyle w:val="Hyperlink"/>
@@ -2997,8 +3016,8 @@
         <w:t xml:space="preserve">) and the EL1 mode removed.</w:t>
       </w:r>
     </w:p>
-    <w:bookmarkEnd w:id="34"/>
-    <w:bookmarkStart w:id="35" w:name="Xd979bbb935ec2154d49de8f14f78dcb3ac81be6"/>
+    <w:bookmarkEnd w:id="36"/>
+    <w:bookmarkStart w:id="37" w:name="Xd979bbb935ec2154d49de8f14f78dcb3ac81be6"/>
     <w:p>
       <w:pPr>
         <w:pStyle w:val="Heading2"/>
@@ -3019,8 +3038,8 @@
       </w:r>
       <w:r>
         <w:rPr>
-          <w:b/>
-          <w:bCs/>
+          <w:bCs/>
+          <w:b/>
         </w:rPr>
         <w:t xml:space="preserve">100 Hz timer tick</w:t>
       </w:r>
@@ -3041,8 +3060,8 @@
       </w:r>
       <w:r>
         <w:rPr>
-          <w:b/>
-          <w:bCs/>
+          <w:bCs/>
+          <w:b/>
         </w:rPr>
         <w:t xml:space="preserve">preempts the application</w:t>
       </w:r>
@@ -3127,8 +3146,8 @@
       </w:r>
       <w:r>
         <w:rPr>
-          <w:b/>
-          <w:bCs/>
+          <w:bCs/>
+          <w:b/>
         </w:rPr>
         <w:t xml:space="preserve">application code</w:t>
       </w:r>
@@ -3164,8 +3183,8 @@
       </w:r>
       <w:r>
         <w:rPr>
-          <w:b/>
-          <w:bCs/>
+          <w:bCs/>
+          <w:b/>
         </w:rPr>
         <w:t xml:space="preserve">kernel is non-preemptive</w:t>
       </w:r>
@@ -3189,8 +3208,8 @@
       </w:r>
       <w:r>
         <w:rPr>
-          <w:b/>
-          <w:bCs/>
+          <w:bCs/>
+          <w:b/>
         </w:rPr>
         <w:t xml:space="preserve">voluntarily</w:t>
       </w:r>
@@ -3254,7 +3273,7 @@
       <w:r>
         <w:t xml:space="preserve"> </w:t>
       </w:r>
-      <w:hyperlink r:id="rId24">
+      <w:hyperlink r:id="rId26">
         <w:r>
           <w:rPr>
             <w:rStyle w:val="Hyperlink"/>
@@ -3281,8 +3300,8 @@
       </w:r>
       <w:r>
         <w:rPr>
-          <w:b/>
-          <w:bCs/>
+          <w:bCs/>
+          <w:b/>
         </w:rPr>
         <w:t xml:space="preserve">threads</w:t>
       </w:r>
@@ -3311,8 +3330,8 @@
         <w:t xml:space="preserve">kills them all. The scheduler's task list has no fixed limit.</w:t>
       </w:r>
     </w:p>
-    <w:bookmarkEnd w:id="35"/>
-    <w:bookmarkStart w:id="37" w:name="Xd53f7f34704294b1d13f3b775edea3ef231f3a2"/>
+    <w:bookmarkEnd w:id="37"/>
+    <w:bookmarkStart w:id="39" w:name="Xd53f7f34704294b1d13f3b775edea3ef231f3a2"/>
     <w:p>
       <w:pPr>
         <w:pStyle w:val="Heading2"/>
@@ -3323,16 +3342,16 @@
     </w:p>
     <w:p>
       <w:pPr>
-        <w:pStyle w:val="Compact"/>
         <w:numPr>
           <w:ilvl w:val="0"/>
           <w:numId w:val="1003"/>
         </w:numPr>
-      </w:pPr>
-      <w:r>
-        <w:rPr>
-          <w:b/>
-          <w:bCs/>
+        <w:pStyle w:val="Compact"/>
+      </w:pPr>
+      <w:r>
+        <w:rPr>
+          <w:bCs/>
+          <w:b/>
         </w:rPr>
         <w:t xml:space="preserve">Raspberry Pi 4</w:t>
       </w:r>
@@ -3345,16 +3364,16 @@
     </w:p>
     <w:p>
       <w:pPr>
-        <w:pStyle w:val="Compact"/>
         <w:numPr>
           <w:ilvl w:val="0"/>
           <w:numId w:val="1003"/>
         </w:numPr>
-      </w:pPr>
-      <w:r>
-        <w:rPr>
-          <w:b/>
-          <w:bCs/>
+        <w:pStyle w:val="Compact"/>
+      </w:pPr>
+      <w:r>
+        <w:rPr>
+          <w:bCs/>
+          <w:b/>
         </w:rPr>
         <w:t xml:space="preserve">HDMI</w:t>
       </w:r>
@@ -3367,16 +3386,16 @@
     </w:p>
     <w:p>
       <w:pPr>
-        <w:pStyle w:val="Compact"/>
         <w:numPr>
           <w:ilvl w:val="0"/>
           <w:numId w:val="1003"/>
         </w:numPr>
-      </w:pPr>
-      <w:r>
-        <w:rPr>
-          <w:b/>
-          <w:bCs/>
+        <w:pStyle w:val="Compact"/>
+      </w:pPr>
+      <w:r>
+        <w:rPr>
+          <w:bCs/>
+          <w:b/>
         </w:rPr>
         <w:t xml:space="preserve">USB keyboard + mouse</w:t>
       </w:r>
@@ -3386,11 +3405,11 @@
     </w:p>
     <w:p>
       <w:pPr>
-        <w:pStyle w:val="Compact"/>
         <w:numPr>
           <w:ilvl w:val="0"/>
           <w:numId w:val="1003"/>
         </w:numPr>
+        <w:pStyle w:val="Compact"/>
       </w:pPr>
       <w:r>
         <w:t xml:space="preserve">Optional</w:t>
@@ -3400,8 +3419,8 @@
       </w:r>
       <w:r>
         <w:rPr>
-          <w:b/>
-          <w:bCs/>
+          <w:bCs/>
+          <w:b/>
         </w:rPr>
         <w:t xml:space="preserve">serial console</w:t>
       </w:r>
@@ -3420,16 +3439,16 @@
     </w:p>
     <w:p>
       <w:pPr>
-        <w:pStyle w:val="Compact"/>
         <w:numPr>
           <w:ilvl w:val="0"/>
           <w:numId w:val="1003"/>
         </w:numPr>
-      </w:pPr>
-      <w:r>
-        <w:rPr>
-          <w:b/>
-          <w:bCs/>
+        <w:pStyle w:val="Compact"/>
+      </w:pPr>
+      <w:r>
+        <w:rPr>
+          <w:bCs/>
+          <w:b/>
         </w:rPr>
         <w:t xml:space="preserve">The four cores, used asymmetrically by design</w:t>
       </w:r>
@@ -3444,8 +3463,8 @@
       </w:r>
       <w:r>
         <w:rPr>
-          <w:b/>
-          <w:bCs/>
+          <w:bCs/>
+          <w:b/>
         </w:rPr>
         <w:t xml:space="preserve">core 0</w:t>
       </w:r>
@@ -3460,8 +3479,8 @@
       </w:r>
       <w:r>
         <w:rPr>
-          <w:b/>
-          <w:bCs/>
+          <w:bCs/>
+          <w:b/>
         </w:rPr>
         <w:t xml:space="preserve">core 1</w:t>
       </w:r>
@@ -3482,8 +3501,8 @@
       </w:r>
       <w:r>
         <w:rPr>
-          <w:b/>
-          <w:bCs/>
+          <w:bCs/>
+          <w:b/>
         </w:rPr>
         <w:t xml:space="preserve">cores 2 and 3</w:t>
       </w:r>
@@ -3498,8 +3517,8 @@
       </w:r>
       <w:r>
         <w:rPr>
-          <w:b/>
-          <w:bCs/>
+          <w:bCs/>
+          <w:b/>
         </w:rPr>
         <w:t xml:space="preserve">app cores</w:t>
       </w:r>
@@ -3526,8 +3545,8 @@
       </w:r>
       <w:r>
         <w:rPr>
-          <w:b/>
-          <w:bCs/>
+          <w:bCs/>
+          <w:b/>
         </w:rPr>
         <w:t xml:space="preserve">core 3</w:t>
       </w:r>
@@ -3546,11 +3565,11 @@
     </w:p>
     <w:p>
       <w:pPr>
-        <w:pStyle w:val="Compact"/>
         <w:numPr>
           <w:ilvl w:val="0"/>
           <w:numId w:val="1003"/>
         </w:numPr>
+        <w:pStyle w:val="Compact"/>
       </w:pPr>
       <w:r>
         <w:t xml:space="preserve">The RPi 5 is not supported yet (I/O behind the RP1 chip via PCIe — heavier bring-up;</w:t>
@@ -3564,7 +3583,7 @@
       <w:r>
         <w:t xml:space="preserve"> </w:t>
       </w:r>
-      <w:hyperlink r:id="rId36">
+      <w:hyperlink r:id="rId38">
         <w:r>
           <w:rPr>
             <w:rStyle w:val="Hyperlink"/>
@@ -3576,8 +3595,8 @@
         <w:t xml:space="preserve">).</w:t>
       </w:r>
     </w:p>
-    <w:bookmarkEnd w:id="37"/>
-    <w:bookmarkStart w:id="38" w:name="Xaeb7f2a1a29ce6f3d3f3f6655afd64b5919cb4f"/>
+    <w:bookmarkEnd w:id="39"/>
+    <w:bookmarkStart w:id="40" w:name="Xaeb7f2a1a29ce6f3d3f3f6655afd64b5919cb4f"/>
     <w:p>
       <w:pPr>
         <w:pStyle w:val="Heading2"/>
@@ -3702,8 +3721,8 @@
       </w:pPr>
       <w:r>
         <w:rPr>
-          <w:b/>
-          <w:bCs/>
+          <w:bCs/>
+          <w:b/>
         </w:rPr>
         <w:t xml:space="preserve">Legacy docs.</w:t>
       </w:r>
@@ -3734,22 +3753,22 @@
       <w:r>
         <w:rPr>
           <w:rStyle w:val="VerbatimChar"/>
-          <w:b/>
-          <w:bCs/>
+          <w:bCs/>
+          <w:b/>
         </w:rPr>
         <w:t xml:space="preserve">docs/</w:t>
       </w:r>
       <w:r>
         <w:rPr>
-          <w:b/>
-          <w:bCs/>
-        </w:rPr>
-        <w:t xml:space="preserve"> </w:t>
-      </w:r>
-      <w:r>
-        <w:rPr>
-          <w:b/>
-          <w:bCs/>
+          <w:bCs/>
+          <w:b/>
+        </w:rPr>
+        <w:t xml:space="preserve"> </w:t>
+      </w:r>
+      <w:r>
+        <w:rPr>
+          <w:bCs/>
+          <w:b/>
         </w:rPr>
         <w:t xml:space="preserve">is authoritative</w:t>
       </w:r>
@@ -3767,8 +3786,8 @@
       </w:r>
       <w:r>
         <w:rPr>
+          <w:iCs/>
           <w:i/>
-          <w:iCs/>
         </w:rPr>
         <w:t xml:space="preserve">why</w:t>
       </w:r>
@@ -3785,8 +3804,8 @@
         <w:t xml:space="preserve">EL1) was chosen; apps run at EL0 since kapi v74 (§5).</w:t>
       </w:r>
     </w:p>
-    <w:bookmarkEnd w:id="38"/>
-    <w:bookmarkStart w:id="42" w:name="X647cdcd38a19e7cb40f403bab2abebd96e480e2"/>
+    <w:bookmarkEnd w:id="40"/>
+    <w:bookmarkStart w:id="44" w:name="X647cdcd38a19e7cb40f403bab2abebd96e480e2"/>
     <w:p>
       <w:pPr>
         <w:pStyle w:val="Heading2"/>
@@ -3800,6 +3819,7 @@
         <w:tblStyle w:val="Table"/>
         <w:tblW w:type="auto" w:w="0"/>
         <w:tblLook w:firstRow="1" w:lastRow="0" w:firstColumn="0" w:lastColumn="0" w:noHBand="0" w:noVBand="0" w:val="0020"/>
+        <w:jc w:val="start"/>
       </w:tblPr>
       <w:tblGrid>
         <w:gridCol w:w="2640"/>
@@ -3808,13 +3828,14 @@
       </w:tblGrid>
       <w:tr>
         <w:trPr>
-          <w:tblHeader w:val="on"/>
+          <w:tblHeader w:val="true"/>
         </w:trPr>
         <w:tc>
           <w:tcPr/>
           <w:p>
             <w:pPr>
               <w:pStyle w:val="Compact"/>
+              <w:jc w:val="left"/>
             </w:pPr>
             <w:r>
               <w:t xml:space="preserve">Document</w:t>
@@ -3826,6 +3847,7 @@
           <w:p>
             <w:pPr>
               <w:pStyle w:val="Compact"/>
+              <w:jc w:val="left"/>
             </w:pPr>
             <w:r>
               <w:t xml:space="preserve">For whom</w:t>
@@ -3837,6 +3859,7 @@
           <w:p>
             <w:pPr>
               <w:pStyle w:val="Compact"/>
+              <w:jc w:val="left"/>
             </w:pPr>
             <w:r>
               <w:t xml:space="preserve">Contents</w:t>
@@ -3850,13 +3873,14 @@
           <w:p>
             <w:pPr>
               <w:pStyle w:val="Compact"/>
+              <w:jc w:val="left"/>
             </w:pPr>
-            <w:hyperlink r:id="rId24">
+            <w:hyperlink r:id="rId26">
               <w:r>
                 <w:rPr>
                   <w:rStyle w:val="Hyperlink"/>
+                  <w:bCs/>
                   <w:b/>
-                  <w:bCs/>
                 </w:rPr>
                 <w:t xml:space="preserve">02 — Kernel Internals</w:t>
               </w:r>
@@ -3868,6 +3892,7 @@
           <w:p>
             <w:pPr>
               <w:pStyle w:val="Compact"/>
+              <w:jc w:val="left"/>
             </w:pPr>
             <w:r>
               <w:t xml:space="preserve">anyone who wants to understand the kernel</w:t>
@@ -3879,6 +3904,7 @@
           <w:p>
             <w:pPr>
               <w:pStyle w:val="Compact"/>
+              <w:jc w:val="left"/>
             </w:pPr>
             <w:r>
               <w:t xml:space="preserve">boot, memory/MMU, scheduling, exceptions, ABI, GUI, streams</w:t>
@@ -3892,13 +3918,14 @@
           <w:p>
             <w:pPr>
               <w:pStyle w:val="Compact"/>
+              <w:jc w:val="left"/>
             </w:pPr>
-            <w:hyperlink r:id="rId39">
+            <w:hyperlink r:id="rId41">
               <w:r>
                 <w:rPr>
                   <w:rStyle w:val="Hyperlink"/>
+                  <w:bCs/>
                   <w:b/>
-                  <w:bCs/>
                 </w:rPr>
                 <w:t xml:space="preserve">03 — Developer Guide</w:t>
               </w:r>
@@ -3910,6 +3937,7 @@
           <w:p>
             <w:pPr>
               <w:pStyle w:val="Compact"/>
+              <w:jc w:val="left"/>
             </w:pPr>
             <w:r>
               <w:t xml:space="preserve">anyone who wants to build/compile/extend</w:t>
@@ -3921,6 +3949,7 @@
           <w:p>
             <w:pPr>
               <w:pStyle w:val="Compact"/>
+              <w:jc w:val="left"/>
             </w:pPr>
             <w:r>
               <w:t xml:space="preserve">toolchain, build, app model, extending the ABI, conventions, debugging</w:t>
@@ -3934,13 +3963,14 @@
           <w:p>
             <w:pPr>
               <w:pStyle w:val="Compact"/>
+              <w:jc w:val="left"/>
             </w:pPr>
-            <w:hyperlink r:id="rId27">
+            <w:hyperlink r:id="rId29">
               <w:r>
                 <w:rPr>
                   <w:rStyle w:val="Hyperlink"/>
+                  <w:bCs/>
                   <w:b/>
-                  <w:bCs/>
                 </w:rPr>
                 <w:t xml:space="preserve">04 — User Guide</w:t>
               </w:r>
@@ -3952,6 +3982,7 @@
           <w:p>
             <w:pPr>
               <w:pStyle w:val="Compact"/>
+              <w:jc w:val="left"/>
             </w:pPr>
             <w:r>
               <w:t xml:space="preserve">anyone who wants to use it</w:t>
@@ -3963,6 +3994,7 @@
           <w:p>
             <w:pPr>
               <w:pStyle w:val="Compact"/>
+              <w:jc w:val="left"/>
             </w:pPr>
             <w:r>
               <w:t xml:space="preserve">SD card, desktop, terminal, files, applications, customization</w:t>
@@ -3976,13 +4008,14 @@
           <w:p>
             <w:pPr>
               <w:pStyle w:val="Compact"/>
+              <w:jc w:val="left"/>
             </w:pPr>
-            <w:hyperlink r:id="rId26">
+            <w:hyperlink r:id="rId28">
               <w:r>
                 <w:rPr>
                   <w:rStyle w:val="Hyperlink"/>
+                  <w:bCs/>
                   <w:b/>
-                  <w:bCs/>
                 </w:rPr>
                 <w:t xml:space="preserve">06 — The kits</w:t>
               </w:r>
@@ -3994,6 +4027,7 @@
           <w:p>
             <w:pPr>
               <w:pStyle w:val="Compact"/>
+              <w:jc w:val="left"/>
             </w:pPr>
             <w:r>
               <w:t xml:space="preserve">anyone writing a program</w:t>
@@ -4005,6 +4039,7 @@
           <w:p>
             <w:pPr>
               <w:pStyle w:val="Compact"/>
+              <w:jc w:val="left"/>
             </w:pPr>
             <w:r>
               <w:t xml:space="preserve">one kit per domain, how a program uses them (their references: 10 to 19)</w:t>
@@ -4018,8 +4053,9 @@
           <w:p>
             <w:pPr>
               <w:pStyle w:val="Compact"/>
+              <w:jc w:val="left"/>
             </w:pPr>
-            <w:hyperlink r:id="rId40">
+            <w:hyperlink r:id="rId42">
               <w:r>
                 <w:rPr>
                   <w:rStyle w:val="Hyperlink"/>
@@ -4034,6 +4070,7 @@
           <w:p>
             <w:pPr>
               <w:pStyle w:val="Compact"/>
+              <w:jc w:val="left"/>
             </w:pPr>
             <w:r>
               <w:t xml:space="preserve">anyone touching</w:t>
@@ -4054,6 +4091,7 @@
           <w:p>
             <w:pPr>
               <w:pStyle w:val="Compact"/>
+              <w:jc w:val="left"/>
             </w:pPr>
             <w:r>
               <w:t xml:space="preserve">the patches of our Circle fork vs upstream</w:t>
@@ -4076,8 +4114,9 @@
           <w:p>
             <w:pPr>
               <w:pStyle w:val="Compact"/>
+              <w:jc w:val="left"/>
             </w:pPr>
-            <w:hyperlink r:id="rId30">
+            <w:hyperlink r:id="rId32">
               <w:r>
                 <w:rPr>
                   <w:rStyle w:val="Hyperlink"/>
@@ -4092,6 +4131,7 @@
           <w:p>
             <w:pPr>
               <w:pStyle w:val="Compact"/>
+              <w:jc w:val="left"/>
             </w:pPr>
             <w:r>
               <w:t xml:space="preserve">the browser</w:t>
@@ -4103,6 +4143,7 @@
           <w:p>
             <w:pPr>
               <w:pStyle w:val="Compact"/>
+              <w:jc w:val="left"/>
             </w:pPr>
             <w:r>
               <w:t xml:space="preserve">the port of WebKit to Onyx: its status, the patch series, how to build</w:t>
@@ -4116,8 +4157,9 @@
           <w:p>
             <w:pPr>
               <w:pStyle w:val="Compact"/>
+              <w:jc w:val="left"/>
             </w:pPr>
-            <w:hyperlink r:id="rId33">
+            <w:hyperlink r:id="rId35">
               <w:r>
                 <w:rPr>
                   <w:rStyle w:val="Hyperlink"/>
@@ -4132,6 +4174,7 @@
           <w:p>
             <w:pPr>
               <w:pStyle w:val="Compact"/>
+              <w:jc w:val="left"/>
             </w:pPr>
             <w:r>
               <w:t xml:space="preserve">the execution model</w:t>
@@ -4143,6 +4186,7 @@
           <w:p>
             <w:pPr>
               <w:pStyle w:val="Compact"/>
+              <w:jc w:val="left"/>
             </w:pPr>
             <w:r>
               <w:t xml:space="preserve">how apps moved to EL0, the design</w:t>
@@ -4156,8 +4200,9 @@
           <w:p>
             <w:pPr>
               <w:pStyle w:val="Compact"/>
+              <w:jc w:val="left"/>
             </w:pPr>
-            <w:hyperlink r:id="rId19">
+            <w:hyperlink r:id="rId21">
               <w:r>
                 <w:rPr>
                   <w:rStyle w:val="Hyperlink"/>
@@ -4172,6 +4217,7 @@
           <w:p>
             <w:pPr>
               <w:pStyle w:val="Compact"/>
+              <w:jc w:val="left"/>
             </w:pPr>
             <w:r>
               <w:t xml:space="preserve">distributors</w:t>
@@ -4183,6 +4229,7 @@
           <w:p>
             <w:pPr>
               <w:pStyle w:val="Compact"/>
+              <w:jc w:val="left"/>
             </w:pPr>
             <w:r>
               <w:t xml:space="preserve">the licences of everything Onyx contains</w:t>
@@ -4196,8 +4243,9 @@
           <w:p>
             <w:pPr>
               <w:pStyle w:val="Compact"/>
+              <w:jc w:val="left"/>
             </w:pPr>
-            <w:hyperlink r:id="rId41">
+            <w:hyperlink r:id="rId43">
               <w:r>
                 <w:rPr>
                   <w:rStyle w:val="Hyperlink"/>
@@ -4212,6 +4260,7 @@
           <w:p>
             <w:pPr>
               <w:pStyle w:val="Compact"/>
+              <w:jc w:val="left"/>
             </w:pPr>
             <w:r>
               <w:t xml:space="preserve">the next session</w:t>
@@ -4223,6 +4272,7 @@
           <w:p>
             <w:pPr>
               <w:pStyle w:val="Compact"/>
+              <w:jc w:val="left"/>
             </w:pPr>
             <w:r>
               <w:t xml:space="preserve">where the work stands, the next tasks</w:t>
@@ -4231,8 +4281,8 @@
         </w:tc>
       </w:tr>
     </w:tbl>
-    <w:bookmarkEnd w:id="42"/>
-    <w:bookmarkStart w:id="43" w:name="Xb3ffec909c2b52aab1f5b06d59da0ddab14a9e8"/>
+    <w:bookmarkEnd w:id="44"/>
+    <w:bookmarkStart w:id="45" w:name="Xb3ffec909c2b52aab1f5b06d59da0ddab14a9e8"/>
     <w:p>
       <w:pPr>
         <w:pStyle w:val="Heading2"/>
@@ -4243,11 +4293,11 @@
     </w:p>
     <w:p>
       <w:pPr>
-        <w:pStyle w:val="Compact"/>
         <w:numPr>
           <w:ilvl w:val="0"/>
           <w:numId w:val="1004"/>
         </w:numPr>
+        <w:pStyle w:val="Compact"/>
       </w:pPr>
       <w:r>
         <w:t xml:space="preserve">Taking control of</w:t>
@@ -4282,11 +4332,11 @@
     </w:p>
     <w:p>
       <w:pPr>
-        <w:pStyle w:val="Compact"/>
         <w:numPr>
           <w:ilvl w:val="0"/>
           <w:numId w:val="1004"/>
         </w:numPr>
+        <w:pStyle w:val="Compact"/>
       </w:pPr>
       <w:r>
         <w:t xml:space="preserve">Replacement scheduler ("shadow" header for</w:t>
@@ -4306,11 +4356,11 @@
     </w:p>
     <w:p>
       <w:pPr>
-        <w:pStyle w:val="Compact"/>
         <w:numPr>
           <w:ilvl w:val="0"/>
           <w:numId w:val="1004"/>
         </w:numPr>
+        <w:pStyle w:val="Compact"/>
       </w:pPr>
       <w:r>
         <w:rPr>
@@ -4327,11 +4377,11 @@
     </w:p>
     <w:p>
       <w:pPr>
-        <w:pStyle w:val="Compact"/>
         <w:numPr>
           <w:ilvl w:val="0"/>
           <w:numId w:val="1004"/>
         </w:numPr>
+        <w:pStyle w:val="Compact"/>
       </w:pPr>
       <w:r>
         <w:t xml:space="preserve">Per-process page tables (</w:t>
@@ -4348,11 +4398,11 @@
     </w:p>
     <w:p>
       <w:pPr>
-        <w:pStyle w:val="Compact"/>
         <w:numPr>
           <w:ilvl w:val="0"/>
           <w:numId w:val="1004"/>
         </w:numPr>
+        <w:pStyle w:val="Compact"/>
       </w:pPr>
       <w:r>
         <w:t xml:space="preserve">ELF64 loader → process.</w:t>
@@ -4360,11 +4410,11 @@
     </w:p>
     <w:p>
       <w:pPr>
-        <w:pStyle w:val="Compact"/>
         <w:numPr>
           <w:ilvl w:val="0"/>
           <w:numId w:val="1004"/>
         </w:numPr>
+        <w:pStyle w:val="Compact"/>
       </w:pPr>
       <w:r>
         <w:t xml:space="preserve">Framebuffer (</w:t>
@@ -4414,11 +4464,11 @@
     </w:p>
     <w:p>
       <w:pPr>
-        <w:pStyle w:val="Compact"/>
         <w:numPr>
           <w:ilvl w:val="0"/>
           <w:numId w:val="1004"/>
         </w:numPr>
+        <w:pStyle w:val="Compact"/>
       </w:pPr>
       <w:r>
         <w:t xml:space="preserve">Compositor + window manager; two animated demos running simultaneously.</w:t>
@@ -4426,16 +4476,16 @@
     </w:p>
     <w:p>
       <w:pPr>
-        <w:pStyle w:val="Compact"/>
         <w:numPr>
           <w:ilvl w:val="0"/>
           <w:numId w:val="1004"/>
         </w:numPr>
-      </w:pPr>
-      <w:r>
-        <w:rPr>
-          <w:b/>
-          <w:bCs/>
+        <w:pStyle w:val="Compact"/>
+      </w:pPr>
+      <w:r>
+        <w:rPr>
+          <w:bCs/>
+          <w:b/>
         </w:rPr>
         <w:t xml:space="preserve">Switch to Option C</w:t>
       </w:r>
@@ -4450,8 +4500,8 @@
       </w:r>
       <w:r>
         <w:rPr>
-          <w:b/>
-          <w:bCs/>
+          <w:bCs/>
+          <w:b/>
         </w:rPr>
         <w:t xml:space="preserve">fixed-table ABI</w:t>
       </w:r>
@@ -4461,11 +4511,11 @@
     </w:p>
     <w:p>
       <w:pPr>
-        <w:pStyle w:val="Compact"/>
         <w:numPr>
           <w:ilvl w:val="0"/>
           <w:numId w:val="1004"/>
         </w:numPr>
+        <w:pStyle w:val="Compact"/>
       </w:pPr>
       <w:r>
         <w:t xml:space="preserve">Onyx desktop (panel + applist), stream/stdio subsystem, terminal +</w:t>
@@ -4491,11 +4541,11 @@
     </w:p>
     <w:p>
       <w:pPr>
-        <w:pStyle w:val="Compact"/>
         <w:numPr>
           <w:ilvl w:val="0"/>
           <w:numId w:val="1004"/>
         </w:numPr>
+        <w:pStyle w:val="Compact"/>
       </w:pPr>
       <w:r>
         <w:t xml:space="preserve">Modal dialogs, themes, app-drawn wallpaper, PID management, keyboard layouts,</w:t>
@@ -4509,11 +4559,11 @@
     </w:p>
     <w:p>
       <w:pPr>
-        <w:pStyle w:val="Compact"/>
         <w:numPr>
           <w:ilvl w:val="0"/>
           <w:numId w:val="1004"/>
         </w:numPr>
+        <w:pStyle w:val="Compact"/>
       </w:pPr>
       <w:r>
         <w:t xml:space="preserve">Networking: WLAN bring-up + TCP/IP on the primary core, TCP socket calls</w:t>
@@ -4542,11 +4592,11 @@
     </w:p>
     <w:p>
       <w:pPr>
-        <w:pStyle w:val="Compact"/>
         <w:numPr>
           <w:ilvl w:val="0"/>
           <w:numId w:val="1004"/>
         </w:numPr>
+        <w:pStyle w:val="Compact"/>
       </w:pPr>
       <w:r>
         <w:t xml:space="preserve">The modernised CDE desktop (v64: menu bar, dock, workspaces), the uikit toolkit; the</w:t>
@@ -4587,16 +4637,16 @@
     </w:p>
     <w:p>
       <w:pPr>
-        <w:pStyle w:val="Compact"/>
         <w:numPr>
           <w:ilvl w:val="0"/>
           <w:numId w:val="1004"/>
         </w:numPr>
-      </w:pPr>
-      <w:r>
-        <w:rPr>
-          <w:b/>
-          <w:bCs/>
+        <w:pStyle w:val="Compact"/>
+      </w:pPr>
+      <w:r>
+        <w:rPr>
+          <w:bCs/>
+          <w:b/>
         </w:rPr>
         <w:t xml:space="preserve">Every app at EL0</w:t>
       </w:r>
@@ -4615,16 +4665,16 @@
     </w:p>
     <w:p>
       <w:pPr>
-        <w:pStyle w:val="Compact"/>
         <w:numPr>
           <w:ilvl w:val="0"/>
           <w:numId w:val="1004"/>
         </w:numPr>
-      </w:pPr>
-      <w:r>
-        <w:rPr>
-          <w:b/>
-          <w:bCs/>
+        <w:pStyle w:val="Compact"/>
+      </w:pPr>
+      <w:r>
+        <w:rPr>
+          <w:bCs/>
+          <w:b/>
         </w:rPr>
         <w:t xml:space="preserve">Demand paging</w:t>
       </w:r>
@@ -4639,8 +4689,8 @@
       </w:r>
       <w:r>
         <w:rPr>
-          <w:b/>
-          <w:bCs/>
+          <w:bCs/>
+          <w:b/>
         </w:rPr>
         <w:t xml:space="preserve">shared libraries</w:t>
       </w:r>
@@ -4655,8 +4705,8 @@
       </w:r>
       <w:r>
         <w:rPr>
-          <w:b/>
-          <w:bCs/>
+          <w:bCs/>
+          <w:b/>
         </w:rPr>
         <w:t xml:space="preserve">kits</w:t>
       </w:r>
@@ -4677,8 +4727,8 @@
       </w:r>
       <w:r>
         <w:rPr>
-          <w:b/>
-          <w:bCs/>
+          <w:bCs/>
+          <w:b/>
         </w:rPr>
         <w:t xml:space="preserve">Elegant</w:t>
       </w:r>
@@ -4694,16 +4744,16 @@
     </w:p>
     <w:p>
       <w:pPr>
-        <w:pStyle w:val="Compact"/>
         <w:numPr>
           <w:ilvl w:val="0"/>
           <w:numId w:val="1004"/>
         </w:numPr>
-      </w:pPr>
-      <w:r>
-        <w:rPr>
-          <w:b/>
-          <w:bCs/>
+        <w:pStyle w:val="Compact"/>
+      </w:pPr>
+      <w:r>
+        <w:rPr>
+          <w:bCs/>
+          <w:b/>
         </w:rPr>
         <w:t xml:space="preserve">PocketUI</w:t>
       </w:r>
@@ -4720,8 +4770,8 @@
         <w:t xml:space="preserve">apps in all three.</w:t>
       </w:r>
     </w:p>
-    <w:bookmarkEnd w:id="43"/>
-    <w:bookmarkStart w:id="46" w:name="X29842c42cadd97bf2b875ac65d2a73721b4de86"/>
+    <w:bookmarkEnd w:id="45"/>
+    <w:bookmarkStart w:id="48" w:name="X29842c42cadd97bf2b875ac65d2a73721b4de86"/>
     <w:p>
       <w:pPr>
         <w:pStyle w:val="Heading2"/>
@@ -4736,22 +4786,22 @@
       </w:pPr>
       <w:r>
         <w:rPr>
+          <w:iCs/>
           <w:i/>
+        </w:rPr>
+        <w:t xml:space="preserve">Written on 2026-10-09. A comparison of designs and of what each system offers — nothing here was</w:t>
+      </w:r>
+      <w:r>
+        <w:rPr>
           <w:iCs/>
-        </w:rPr>
-        <w:t xml:space="preserve">Written on 2026-10-09. A comparison of designs and of what each system offers — nothing here was</w:t>
-      </w:r>
-      <w:r>
-        <w:rPr>
           <w:i/>
+        </w:rPr>
+        <w:t xml:space="preserve"> </w:t>
+      </w:r>
+      <w:r>
+        <w:rPr>
           <w:iCs/>
-        </w:rPr>
-        <w:t xml:space="preserve"> </w:t>
-      </w:r>
-      <w:r>
-        <w:rPr>
           <w:i/>
-          <w:iCs/>
         </w:rPr>
         <w:t xml:space="preserve">measured, and the other systems move: check their own sites.</w:t>
       </w:r>
@@ -4762,8 +4812,8 @@
       </w:pPr>
       <w:r>
         <w:rPr>
-          <w:b/>
-          <w:bCs/>
+          <w:bCs/>
+          <w:b/>
         </w:rPr>
         <w:t xml:space="preserve">What Onyx is for.</w:t>
       </w:r>
@@ -4797,6 +4847,7 @@
         <w:tblStyle w:val="Table"/>
         <w:tblW w:type="auto" w:w="0"/>
         <w:tblLook w:firstRow="1" w:lastRow="0" w:firstColumn="0" w:lastColumn="0" w:noHBand="0" w:noVBand="0" w:val="0020"/>
+        <w:jc w:val="start"/>
       </w:tblPr>
       <w:tblGrid>
         <w:gridCol w:w="2640"/>
@@ -4805,13 +4856,14 @@
       </w:tblGrid>
       <w:tr>
         <w:trPr>
-          <w:tblHeader w:val="on"/>
+          <w:tblHeader w:val="true"/>
         </w:trPr>
         <w:tc>
           <w:tcPr/>
           <w:p>
             <w:pPr>
               <w:pStyle w:val="Compact"/>
+              <w:jc w:val="left"/>
             </w:pPr>
             <w:r>
               <w:t xml:space="preserve">System</w:t>
@@ -4823,6 +4875,7 @@
           <w:p>
             <w:pPr>
               <w:pStyle w:val="Compact"/>
+              <w:jc w:val="left"/>
             </w:pPr>
             <w:r>
               <w:t xml:space="preserve">What it is</w:t>
@@ -4834,6 +4887,7 @@
           <w:p>
             <w:pPr>
               <w:pStyle w:val="Compact"/>
+              <w:jc w:val="left"/>
             </w:pPr>
             <w:r>
               <w:t xml:space="preserve">Beside it, Onyx…</w:t>
@@ -4847,11 +4901,12 @@
           <w:p>
             <w:pPr>
               <w:pStyle w:val="Compact"/>
+              <w:jc w:val="left"/>
             </w:pPr>
             <w:r>
               <w:rPr>
+                <w:bCs/>
                 <w:b/>
-                <w:bCs/>
               </w:rPr>
               <w:t xml:space="preserve">Raspberry Pi OS</w:t>
             </w:r>
@@ -4865,6 +4920,7 @@
           <w:p>
             <w:pPr>
               <w:pStyle w:val="Compact"/>
+              <w:jc w:val="left"/>
             </w:pPr>
             <w:r>
               <w:t xml:space="preserve">a complete general-purpose system, every Pi, tens of thousands of packages</w:t>
@@ -4876,6 +4932,7 @@
           <w:p>
             <w:pPr>
               <w:pStyle w:val="Compact"/>
+              <w:jc w:val="left"/>
             </w:pPr>
             <w:r>
               <w:t xml:space="preserve">is small enough to be read whole, comes with its apps, shares and preloads their images, changes of interface without changing of apps; it has far fewer programs, one board, no symmetric multiprocessing</w:t>
@@ -4889,11 +4946,12 @@
           <w:p>
             <w:pPr>
               <w:pStyle w:val="Compact"/>
+              <w:jc w:val="left"/>
             </w:pPr>
             <w:r>
               <w:rPr>
+                <w:bCs/>
                 <w:b/>
-                <w:bCs/>
               </w:rPr>
               <w:t xml:space="preserve">LibreELEC</w:t>
             </w:r>
@@ -4905,8 +4963,8 @@
             </w:r>
             <w:r>
               <w:rPr>
+                <w:bCs/>
                 <w:b/>
-                <w:bCs/>
               </w:rPr>
               <w:t xml:space="preserve">RetroPie</w:t>
             </w:r>
@@ -4920,6 +4978,7 @@
           <w:p>
             <w:pPr>
               <w:pStyle w:val="Compact"/>
+              <w:jc w:val="left"/>
             </w:pPr>
             <w:r>
               <w:t xml:space="preserve">Linux reduced to one use (a media centre, emulation)</w:t>
@@ -4931,6 +4990,7 @@
           <w:p>
             <w:pPr>
               <w:pStyle w:val="Compact"/>
+              <w:jc w:val="left"/>
             </w:pPr>
             <w:r>
               <w:t xml:space="preserve">has the media player and the emulators</w:t>
@@ -4940,8 +5000,8 @@
             </w:r>
             <w:r>
               <w:rPr>
+                <w:bCs/>
                 <w:b/>
-                <w:bCs/>
               </w:rPr>
               <w:t xml:space="preserve">and</w:t>
             </w:r>
@@ -4960,11 +5020,12 @@
           <w:p>
             <w:pPr>
               <w:pStyle w:val="Compact"/>
+              <w:jc w:val="left"/>
             </w:pPr>
             <w:r>
               <w:rPr>
+                <w:bCs/>
                 <w:b/>
-                <w:bCs/>
               </w:rPr>
               <w:t xml:space="preserve">Android</w:t>
             </w:r>
@@ -4981,6 +5042,7 @@
           <w:p>
             <w:pPr>
               <w:pStyle w:val="Compact"/>
+              <w:jc w:val="left"/>
             </w:pPr>
             <w:r>
               <w:t xml:space="preserve">a touch system with its own vast catalogue of apps</w:t>
@@ -4992,6 +5054,7 @@
           <w:p>
             <w:pPr>
               <w:pStyle w:val="Compact"/>
+              <w:jc w:val="left"/>
             </w:pPr>
             <w:r>
               <w:t xml:space="preserve">has a windowed desktop as well as the pocket mode; no Android app runs on it</w:t>
@@ -5005,11 +5068,12 @@
           <w:p>
             <w:pPr>
               <w:pStyle w:val="Compact"/>
+              <w:jc w:val="left"/>
             </w:pPr>
             <w:r>
               <w:rPr>
+                <w:bCs/>
                 <w:b/>
-                <w:bCs/>
               </w:rPr>
               <w:t xml:space="preserve">RISC OS</w:t>
             </w:r>
@@ -5020,6 +5084,7 @@
           <w:p>
             <w:pPr>
               <w:pStyle w:val="Compact"/>
+              <w:jc w:val="left"/>
             </w:pPr>
             <w:r>
               <w:t xml:space="preserve">Acorn's system: 32-bit, cooperative multitasking, a long-lived catalogue</w:t>
@@ -5031,6 +5096,7 @@
           <w:p>
             <w:pPr>
               <w:pStyle w:val="Compact"/>
+              <w:jc w:val="left"/>
             </w:pPr>
             <w:r>
               <w:t xml:space="preserve">is 64-bit, preemptive, with every app isolated at EL0 (a faulty app is ended, not the machine); RISC OS has decades of software and of users</w:t>
@@ -5044,11 +5110,12 @@
           <w:p>
             <w:pPr>
               <w:pStyle w:val="Compact"/>
+              <w:jc w:val="left"/>
             </w:pPr>
             <w:r>
               <w:rPr>
+                <w:bCs/>
                 <w:b/>
-                <w:bCs/>
               </w:rPr>
               <w:t xml:space="preserve">Haiku</w:t>
             </w:r>
@@ -5060,8 +5127,8 @@
             </w:r>
             <w:r>
               <w:rPr>
+                <w:bCs/>
                 <w:b/>
-                <w:bCs/>
               </w:rPr>
               <w:t xml:space="preserve">Plan 9 / 9front</w:t>
             </w:r>
@@ -5075,6 +5142,7 @@
           <w:p>
             <w:pPr>
               <w:pStyle w:val="Compact"/>
+              <w:jc w:val="left"/>
             </w:pPr>
             <w:r>
               <w:t xml:space="preserve">other independent systems, whose support of the Pi varies</w:t>
@@ -5086,6 +5154,7 @@
           <w:p>
             <w:pPr>
               <w:pStyle w:val="Compact"/>
+              <w:jc w:val="left"/>
             </w:pPr>
             <w:r>
               <w:t xml:space="preserve">was written for the Pi 4, with its GPU, its Wi-Fi and a WebKit browser with the JIT and video; they are self-hosted, the BSDs and Plan 9 multi-user, and all far more tested</w:t>
@@ -5099,11 +5168,12 @@
           <w:p>
             <w:pPr>
               <w:pStyle w:val="Compact"/>
+              <w:jc w:val="left"/>
             </w:pPr>
             <w:r>
               <w:rPr>
+                <w:bCs/>
                 <w:b/>
-                <w:bCs/>
               </w:rPr>
               <w:t xml:space="preserve">Circle</w:t>
             </w:r>
@@ -5117,6 +5187,7 @@
           <w:p>
             <w:pPr>
               <w:pStyle w:val="Compact"/>
+              <w:jc w:val="left"/>
             </w:pPr>
             <w:r>
               <w:t xml:space="preserve">bare-metal frameworks: the application</w:t>
@@ -5126,8 +5197,8 @@
             </w:r>
             <w:r>
               <w:rPr>
+                <w:iCs/>
                 <w:i/>
-                <w:iCs/>
               </w:rPr>
               <w:t xml:space="preserve">is</w:t>
             </w:r>
@@ -5144,6 +5215,7 @@
           <w:p>
             <w:pPr>
               <w:pStyle w:val="Compact"/>
+              <w:jc w:val="left"/>
             </w:pPr>
             <w:r>
               <w:t xml:space="preserve">is an operating system on top of one (Circle): processes, protection, a desktop, packages</w:t>
@@ -5158,24 +5230,24 @@
       </w:pPr>
       <w:r>
         <w:rPr>
-          <w:b/>
-          <w:bCs/>
+          <w:bCs/>
+          <w:b/>
         </w:rPr>
         <w:t xml:space="preserve">What Onyx has that is its own.</w:t>
       </w:r>
     </w:p>
     <w:p>
       <w:pPr>
-        <w:pStyle w:val="Compact"/>
         <w:numPr>
           <w:ilvl w:val="0"/>
           <w:numId w:val="1005"/>
         </w:numPr>
-      </w:pPr>
-      <w:r>
-        <w:rPr>
-          <w:b/>
-          <w:bCs/>
+        <w:pStyle w:val="Compact"/>
+      </w:pPr>
+      <w:r>
+        <w:rPr>
+          <w:bCs/>
+          <w:b/>
         </w:rPr>
         <w:t xml:space="preserve">One binary, three interfaces</w:t>
       </w:r>
@@ -5200,16 +5272,16 @@
     </w:p>
     <w:p>
       <w:pPr>
-        <w:pStyle w:val="Compact"/>
         <w:numPr>
           <w:ilvl w:val="0"/>
           <w:numId w:val="1005"/>
         </w:numPr>
-      </w:pPr>
-      <w:r>
-        <w:rPr>
-          <w:b/>
-          <w:bCs/>
+        <w:pStyle w:val="Compact"/>
+      </w:pPr>
+      <w:r>
+        <w:rPr>
+          <w:bCs/>
+          <w:b/>
         </w:rPr>
         <w:t xml:space="preserve">Images as templates.</w:t>
       </w:r>
@@ -5230,8 +5302,8 @@
       </w:r>
       <w:r>
         <w:rPr>
+          <w:iCs/>
           <w:i/>
-          <w:iCs/>
         </w:rPr>
         <w:t xml:space="preserve">zygote</w:t>
       </w:r>
@@ -5247,16 +5319,16 @@
     </w:p>
     <w:p>
       <w:pPr>
-        <w:pStyle w:val="Compact"/>
         <w:numPr>
           <w:ilvl w:val="0"/>
           <w:numId w:val="1005"/>
         </w:numPr>
-      </w:pPr>
-      <w:r>
-        <w:rPr>
-          <w:b/>
-          <w:bCs/>
+        <w:pStyle w:val="Compact"/>
+      </w:pPr>
+      <w:r>
+        <w:rPr>
+          <w:bCs/>
+          <w:b/>
         </w:rPr>
         <w:t xml:space="preserve">Whole cores for a program.</w:t>
       </w:r>
@@ -5275,16 +5347,16 @@
     </w:p>
     <w:p>
       <w:pPr>
-        <w:pStyle w:val="Compact"/>
         <w:numPr>
           <w:ilvl w:val="0"/>
           <w:numId w:val="1005"/>
         </w:numPr>
-      </w:pPr>
-      <w:r>
-        <w:rPr>
-          <w:b/>
-          <w:bCs/>
+        <w:pStyle w:val="Compact"/>
+      </w:pPr>
+      <w:r>
+        <w:rPr>
+          <w:bCs/>
+          <w:b/>
         </w:rPr>
         <w:t xml:space="preserve">A graphics server that can end.</w:t>
       </w:r>
@@ -5303,16 +5375,16 @@
     </w:p>
     <w:p>
       <w:pPr>
-        <w:pStyle w:val="Compact"/>
         <w:numPr>
           <w:ilvl w:val="0"/>
           <w:numId w:val="1005"/>
         </w:numPr>
-      </w:pPr>
-      <w:r>
-        <w:rPr>
-          <w:b/>
-          <w:bCs/>
+        <w:pStyle w:val="Compact"/>
+      </w:pPr>
+      <w:r>
+        <w:rPr>
+          <w:bCs/>
+          <w:b/>
         </w:rPr>
         <w:t xml:space="preserve">One hand.</w:t>
       </w:r>
@@ -5335,24 +5407,24 @@
       </w:pPr>
       <w:r>
         <w:rPr>
-          <w:b/>
-          <w:bCs/>
+          <w:bCs/>
+          <w:b/>
         </w:rPr>
         <w:t xml:space="preserve">What it does not have — by choice.</w:t>
       </w:r>
     </w:p>
     <w:p>
       <w:pPr>
-        <w:pStyle w:val="Compact"/>
         <w:numPr>
           <w:ilvl w:val="0"/>
           <w:numId w:val="1006"/>
         </w:numPr>
-      </w:pPr>
-      <w:r>
-        <w:rPr>
-          <w:b/>
-          <w:bCs/>
+        <w:pStyle w:val="Compact"/>
+      </w:pPr>
+      <w:r>
+        <w:rPr>
+          <w:bCs/>
+          <w:b/>
         </w:rPr>
         <w:t xml:space="preserve">One user.</w:t>
       </w:r>
@@ -5365,16 +5437,16 @@
     </w:p>
     <w:p>
       <w:pPr>
-        <w:pStyle w:val="Compact"/>
         <w:numPr>
           <w:ilvl w:val="0"/>
           <w:numId w:val="1006"/>
         </w:numPr>
-      </w:pPr>
-      <w:r>
-        <w:rPr>
-          <w:b/>
-          <w:bCs/>
+        <w:pStyle w:val="Compact"/>
+      </w:pPr>
+      <w:r>
+        <w:rPr>
+          <w:bCs/>
+          <w:b/>
         </w:rPr>
         <w:t xml:space="preserve">Cross-developed.</w:t>
       </w:r>
@@ -5387,16 +5459,16 @@
     </w:p>
     <w:p>
       <w:pPr>
-        <w:pStyle w:val="Compact"/>
         <w:numPr>
           <w:ilvl w:val="0"/>
           <w:numId w:val="1006"/>
         </w:numPr>
-      </w:pPr>
-      <w:r>
-        <w:rPr>
-          <w:b/>
-          <w:bCs/>
+        <w:pStyle w:val="Compact"/>
+      </w:pPr>
+      <w:r>
+        <w:rPr>
+          <w:bCs/>
+          <w:b/>
         </w:rPr>
         <w:t xml:space="preserve">Not binary compatible with anything.</w:t>
       </w:r>
@@ -5412,7 +5484,7 @@
       <w:r>
         <w:t xml:space="preserve">from another system (</w:t>
       </w:r>
-      <w:hyperlink r:id="rId44">
+      <w:hyperlink r:id="rId46">
         <w:r>
           <w:rPr>
             <w:rStyle w:val="Hyperlink"/>
@@ -5429,16 +5501,16 @@
     </w:p>
     <w:p>
       <w:pPr>
-        <w:pStyle w:val="Compact"/>
         <w:numPr>
           <w:ilvl w:val="0"/>
           <w:numId w:val="1006"/>
         </w:numPr>
-      </w:pPr>
-      <w:r>
-        <w:rPr>
-          <w:b/>
-          <w:bCs/>
+        <w:pStyle w:val="Compact"/>
+      </w:pPr>
+      <w:r>
+        <w:rPr>
+          <w:bCs/>
+          <w:b/>
         </w:rPr>
         <w:t xml:space="preserve">Asymmetric cores.</w:t>
       </w:r>
@@ -5467,31 +5539,31 @@
       </w:pPr>
       <w:r>
         <w:rPr>
-          <w:b/>
-          <w:bCs/>
+          <w:bCs/>
+          <w:b/>
         </w:rPr>
         <w:t xml:space="preserve">What it does not have — yet, or simply not.</w:t>
       </w:r>
     </w:p>
     <w:p>
       <w:pPr>
-        <w:pStyle w:val="Compact"/>
         <w:numPr>
           <w:ilvl w:val="0"/>
           <w:numId w:val="1007"/>
         </w:numPr>
-      </w:pPr>
-      <w:r>
-        <w:rPr>
-          <w:b/>
-          <w:bCs/>
+        <w:pStyle w:val="Compact"/>
+      </w:pPr>
+      <w:r>
+        <w:rPr>
+          <w:bCs/>
+          <w:b/>
         </w:rPr>
         <w:t xml:space="preserve">Hardware</w:t>
       </w:r>
       <w:r>
         <w:t xml:space="preserve">: the Raspberry Pi 4 and 400 only — the Pi 5 is a plan (</w:t>
       </w:r>
-      <w:hyperlink r:id="rId36">
+      <w:hyperlink r:id="rId38">
         <w:r>
           <w:rPr>
             <w:rStyle w:val="Hyperlink"/>
@@ -5508,7 +5580,7 @@
       <w:r>
         <w:t xml:space="preserve">no Bluetooth (</w:t>
       </w:r>
-      <w:hyperlink r:id="rId45">
+      <w:hyperlink r:id="rId47">
         <w:r>
           <w:rPr>
             <w:rStyle w:val="Hyperlink"/>
@@ -5522,16 +5594,16 @@
     </w:p>
     <w:p>
       <w:pPr>
-        <w:pStyle w:val="Compact"/>
         <w:numPr>
           <w:ilvl w:val="0"/>
           <w:numId w:val="1007"/>
         </w:numPr>
-      </w:pPr>
-      <w:r>
-        <w:rPr>
-          <w:b/>
-          <w:bCs/>
+        <w:pStyle w:val="Compact"/>
+      </w:pPr>
+      <w:r>
+        <w:rPr>
+          <w:bCs/>
+          <w:b/>
         </w:rPr>
         <w:t xml:space="preserve">Security</w:t>
       </w:r>
@@ -5553,16 +5625,16 @@
     </w:p>
     <w:p>
       <w:pPr>
-        <w:pStyle w:val="Compact"/>
         <w:numPr>
           <w:ilvl w:val="0"/>
           <w:numId w:val="1007"/>
         </w:numPr>
-      </w:pPr>
-      <w:r>
-        <w:rPr>
-          <w:b/>
-          <w:bCs/>
+        <w:pStyle w:val="Compact"/>
+      </w:pPr>
+      <w:r>
+        <w:rPr>
+          <w:bCs/>
+          <w:b/>
         </w:rPr>
         <w:t xml:space="preserve">Beyond the ordinary user</w:t>
       </w:r>
@@ -5578,16 +5650,16 @@
     </w:p>
     <w:p>
       <w:pPr>
-        <w:pStyle w:val="Compact"/>
         <w:numPr>
           <w:ilvl w:val="0"/>
           <w:numId w:val="1007"/>
         </w:numPr>
-      </w:pPr>
-      <w:r>
-        <w:rPr>
-          <w:b/>
-          <w:bCs/>
+        <w:pStyle w:val="Compact"/>
+      </w:pPr>
+      <w:r>
+        <w:rPr>
+          <w:bCs/>
+          <w:b/>
         </w:rPr>
         <w:t xml:space="preserve">Maturity</w:t>
       </w:r>
@@ -5603,16 +5675,16 @@
     </w:p>
     <w:p>
       <w:pPr>
-        <w:pStyle w:val="Compact"/>
         <w:numPr>
           <w:ilvl w:val="0"/>
           <w:numId w:val="1007"/>
         </w:numPr>
-      </w:pPr>
-      <w:r>
-        <w:rPr>
-          <w:b/>
-          <w:bCs/>
+        <w:pStyle w:val="Compact"/>
+      </w:pPr>
+      <w:r>
+        <w:rPr>
+          <w:bCs/>
+          <w:b/>
         </w:rPr>
         <w:t xml:space="preserve">Languages</w:t>
       </w:r>
@@ -5620,7 +5692,7 @@
         <w:t xml:space="preserve">: English and French; no screen reader.</w:t>
       </w:r>
     </w:p>
-    <w:bookmarkEnd w:id="46"/>
+    <w:bookmarkEnd w:id="48"/>
     <w:sectPr>
       <w:footerReference r:id="rId9" w:type="default"/>
       <w:footnotePr>
@@ -5702,14 +5774,14 @@
 <file path=word/numbering.xml><?xml version="1.0" encoding="utf-8"?>
 <w:numbering xmlns:w="http://schemas.openxmlformats.org/wordprocessingml/2006/main">
   <w:abstractNum w:abstractNumId="990">
-    <w:nsid w:val="0000A990"/>
+    <w:nsid w:val="A990"/>
     <w:multiLevelType w:val="multilevel"/>
     <w:lvl w:ilvl="0">
       <w:numFmt w:val="bullet"/>
       <w:lvlText w:val=" "/>
       <w:lvlJc w:val="left"/>
       <w:pPr>
-        <w:ind w:left="720" w:hanging="360"/>
+        <w:ind w:left="720" w:hanging="480"/>
       </w:pPr>
     </w:lvl>
     <w:lvl w:ilvl="1">
@@ -5717,7 +5789,7 @@
       <w:lvlText w:val=" "/>
       <w:lvlJc w:val="left"/>
       <w:pPr>
-        <w:ind w:left="1440" w:hanging="360"/>
+        <w:ind w:left="1440" w:hanging="480"/>
       </w:pPr>
     </w:lvl>
     <w:lvl w:ilvl="2">
@@ -5725,7 +5797,7 @@
       <w:lvlText w:val=" "/>
       <w:lvlJc w:val="left"/>
       <w:pPr>
-        <w:ind w:left="2160" w:hanging="360"/>
+        <w:ind w:left="2160" w:hanging="480"/>
       </w:pPr>
     </w:lvl>
     <w:lvl w:ilvl="3">
@@ -5733,7 +5805,7 @@
       <w:lvlText w:val=" "/>
       <w:lvlJc w:val="left"/>
       <w:pPr>
-        <w:ind w:left="2880" w:hanging="360"/>
+        <w:ind w:left="2880" w:hanging="480"/>
       </w:pPr>
     </w:lvl>
     <w:lvl w:ilvl="4">
@@ -5741,7 +5813,7 @@
       <w:lvlText w:val=" "/>
       <w:lvlJc w:val="left"/>
       <w:pPr>
-        <w:ind w:left="3600" w:hanging="360"/>
+        <w:ind w:left="3600" w:hanging="480"/>
       </w:pPr>
     </w:lvl>
     <w:lvl w:ilvl="5">
@@ -5749,7 +5821,7 @@
       <w:lvlText w:val=" "/>
       <w:lvlJc w:val="left"/>
       <w:pPr>
-        <w:ind w:left="4320" w:hanging="360"/>
+        <w:ind w:left="4320" w:hanging="480"/>
       </w:pPr>
     </w:lvl>
     <w:lvl w:ilvl="6">
@@ -5757,7 +5829,7 @@
       <w:lvlText w:val=" "/>
       <w:lvlJc w:val="left"/>
       <w:pPr>
-        <w:ind w:left="5040" w:hanging="360"/>
+        <w:ind w:left="5040" w:hanging="480"/>
       </w:pPr>
     </w:lvl>
     <w:lvl w:ilvl="7">
@@ -5765,7 +5837,7 @@
       <w:lvlText w:val=" "/>
       <w:lvlJc w:val="left"/>
       <w:pPr>
-        <w:ind w:left="5760" w:hanging="360"/>
+        <w:ind w:left="5760" w:hanging="480"/>
       </w:pPr>
     </w:lvl>
     <w:lvl w:ilvl="8">
@@ -5773,115 +5845,88 @@
       <w:lvlText w:val=" "/>
       <w:lvlJc w:val="left"/>
       <w:pPr>
-        <w:ind w:left="6480" w:hanging="360"/>
+        <w:ind w:left="6480" w:hanging="480"/>
       </w:pPr>
     </w:lvl>
   </w:abstractNum>
   <w:abstractNum w:abstractNumId="991">
-    <w:nsid w:val="0000A991"/>
+    <w:nsid w:val="A991"/>
     <w:multiLevelType w:val="multilevel"/>
     <w:lvl w:ilvl="0">
       <w:numFmt w:val="bullet"/>
-      <w:lvlText w:val=""/>
+      <w:lvlText w:val="•"/>
       <w:lvlJc w:val="left"/>
       <w:pPr>
-        <w:ind w:left="720" w:hanging="360"/>
-      </w:pPr>
-      <w:rPr>
-        <w:rFonts w:ascii="Symbol" w:hAnsi="Symbol" w:cs="Symbol" w:hint="default"/>
-      </w:rPr>
+        <w:ind w:left="720" w:hanging="480"/>
+      </w:pPr>
     </w:lvl>
     <w:lvl w:ilvl="1">
       <w:numFmt w:val="bullet"/>
-      <w:lvlText w:val="o"/>
+      <w:lvlText w:val="–"/>
       <w:lvlJc w:val="left"/>
       <w:pPr>
-        <w:ind w:left="1440" w:hanging="360"/>
-      </w:pPr>
-      <w:rPr>
-        <w:rFonts w:ascii="Courier New" w:hAnsi="Courier New" w:cs="Courier New" w:hint="default"/>
-      </w:rPr>
+        <w:ind w:left="1440" w:hanging="480"/>
+      </w:pPr>
     </w:lvl>
     <w:lvl w:ilvl="2">
       <w:numFmt w:val="bullet"/>
-      <w:lvlText w:val=""/>
+      <w:lvlText w:val="•"/>
       <w:lvlJc w:val="left"/>
       <w:pPr>
-        <w:ind w:left="2160" w:hanging="360"/>
-      </w:pPr>
-      <w:rPr>
-        <w:rFonts w:ascii="Wingdings" w:hAnsi="Wingdings" w:cs="Wingdings" w:hint="default"/>
-      </w:rPr>
+        <w:ind w:left="2160" w:hanging="480"/>
+      </w:pPr>
     </w:lvl>
     <w:lvl w:ilvl="3">
       <w:numFmt w:val="bullet"/>
-      <w:lvlText w:val=""/>
+      <w:lvlText w:val="–"/>
       <w:lvlJc w:val="left"/>
       <w:pPr>
-        <w:ind w:left="2880" w:hanging="360"/>
-      </w:pPr>
-      <w:rPr>
-        <w:rFonts w:ascii="Symbol" w:hAnsi="Symbol" w:cs="Symbol" w:hint="default"/>
-      </w:rPr>
+        <w:ind w:left="2880" w:hanging="480"/>
+      </w:pPr>
     </w:lvl>
     <w:lvl w:ilvl="4">
       <w:numFmt w:val="bullet"/>
-      <w:lvlText w:val="o"/>
+      <w:lvlText w:val="•"/>
       <w:lvlJc w:val="left"/>
       <w:pPr>
-        <w:ind w:left="3600" w:hanging="360"/>
-      </w:pPr>
-      <w:rPr>
-        <w:rFonts w:ascii="Courier New" w:hAnsi="Courier New" w:cs="Courier New" w:hint="default"/>
-      </w:rPr>
+        <w:ind w:left="3600" w:hanging="480"/>
+      </w:pPr>
     </w:lvl>
     <w:lvl w:ilvl="5">
       <w:numFmt w:val="bullet"/>
-      <w:lvlText w:val=""/>
+      <w:lvlText w:val="–"/>
       <w:lvlJc w:val="left"/>
       <w:pPr>
-        <w:ind w:left="4320" w:hanging="360"/>
-      </w:pPr>
-      <w:rPr>
-        <w:rFonts w:ascii="Wingdings" w:hAnsi="Wingdings" w:cs="Wingdings" w:hint="default"/>
-      </w:rPr>
+        <w:ind w:left="4320" w:hanging="480"/>
+      </w:pPr>
     </w:lvl>
     <w:lvl w:ilvl="6">
       <w:numFmt w:val="bullet"/>
-      <w:lvlText w:val=""/>
+      <w:lvlText w:val="•"/>
       <w:lvlJc w:val="left"/>
       <w:pPr>
-        <w:ind w:left="5040" w:hanging="360"/>
-      </w:pPr>
-      <w:rPr>
-        <w:rFonts w:ascii="Symbol" w:hAnsi="Symbol" w:cs="Symbol" w:hint="default"/>
-      </w:rPr>
+        <w:ind w:left="5040" w:hanging="480"/>
+      </w:pPr>
     </w:lvl>
     <w:lvl w:ilvl="7">
       <w:numFmt w:val="bullet"/>
-      <w:lvlText w:val="o"/>
+      <w:lvlText w:val="–"/>
       <w:lvlJc w:val="left"/>
       <w:pPr>
-        <w:ind w:left="5760" w:hanging="360"/>
-      </w:pPr>
-      <w:rPr>
-        <w:rFonts w:ascii="Courier New" w:hAnsi="Courier New" w:cs="Courier New" w:hint="default"/>
-      </w:rPr>
+        <w:ind w:left="5760" w:hanging="480"/>
+      </w:pPr>
     </w:lvl>
     <w:lvl w:ilvl="8">
       <w:numFmt w:val="bullet"/>
-      <w:lvlText w:val=""/>
+      <w:lvlText w:val="•"/>
       <w:lvlJc w:val="left"/>
       <w:pPr>
-        <w:ind w:left="6480" w:hanging="360"/>
-      </w:pPr>
-      <w:rPr>
-        <w:rFonts w:ascii="Wingdings" w:hAnsi="Wingdings" w:cs="Wingdings" w:hint="default"/>
-      </w:rPr>
+        <w:ind w:left="6480" w:hanging="480"/>
+      </w:pPr>
     </w:lvl>
   </w:abstractNum>
   <w:abstractNum w:abstractNumId="99411">
-    <w:nsid w:val="00A99411"/>
+    <w:nsid w:val="A99411"/>
     <w:multiLevelType w:val="multilevel"/>
     <w:lvl w:ilvl="0">
       <w:start w:val="1"/>
@@ -5889,7 +5934,7 @@
       <w:lvlText w:val="%1."/>
       <w:lvlJc w:val="left"/>
       <w:pPr>
-        <w:ind w:left="720" w:hanging="360"/>
+        <w:ind w:left="720" w:hanging="480"/>
       </w:pPr>
     </w:lvl>
     <w:lvl w:ilvl="1">
@@ -5898,7 +5943,7 @@
       <w:lvlText w:val="%2."/>
       <w:lvlJc w:val="left"/>
       <w:pPr>
-        <w:ind w:left="1440" w:hanging="360"/>
+        <w:ind w:left="1440" w:hanging="480"/>
       </w:pPr>
     </w:lvl>
     <w:lvl w:ilvl="2">
@@ -5907,7 +5952,7 @@
       <w:lvlText w:val="%3."/>
       <w:lvlJc w:val="left"/>
       <w:pPr>
-        <w:ind w:left="2160" w:hanging="360"/>
+        <w:ind w:left="2160" w:hanging="480"/>
       </w:pPr>
     </w:lvl>
     <w:lvl w:ilvl="3">
@@ -5916,7 +5961,7 @@
       <w:lvlText w:val="%4."/>
       <w:lvlJc w:val="left"/>
       <w:pPr>
-        <w:ind w:left="2880" w:hanging="360"/>
+        <w:ind w:left="2880" w:hanging="480"/>
       </w:pPr>
     </w:lvl>
     <w:lvl w:ilvl="4">
@@ -5925,7 +5970,7 @@
       <w:lvlText w:val="%5."/>
       <w:lvlJc w:val="left"/>
       <w:pPr>
-        <w:ind w:left="3600" w:hanging="360"/>
+        <w:ind w:left="3600" w:hanging="480"/>
       </w:pPr>
     </w:lvl>
     <w:lvl w:ilvl="5">
@@ -5934,7 +5979,7 @@
       <w:lvlText w:val="%6."/>
       <w:lvlJc w:val="left"/>
       <w:pPr>
-        <w:ind w:left="4320" w:hanging="360"/>
+        <w:ind w:left="4320" w:hanging="480"/>
       </w:pPr>
     </w:lvl>
     <w:lvl w:ilvl="6">
@@ -5943,7 +5988,7 @@
       <w:lvlText w:val="%7."/>
       <w:lvlJc w:val="left"/>
       <w:pPr>
-        <w:ind w:left="5040" w:hanging="360"/>
+        <w:ind w:left="5040" w:hanging="480"/>
       </w:pPr>
     </w:lvl>
     <w:lvl w:ilvl="7">
@@ -5952,7 +5997,7 @@
       <w:lvlText w:val="%8."/>
       <w:lvlJc w:val="left"/>
       <w:pPr>
-        <w:ind w:left="5760" w:hanging="360"/>
+        <w:ind w:left="5760" w:hanging="480"/>
       </w:pPr>
     </w:lvl>
     <w:lvl w:ilvl="8">
@@ -5961,7 +6006,7 @@
       <w:lvlText w:val="%9."/>
       <w:lvlJc w:val="left"/>
       <w:pPr>
-        <w:ind w:left="6480" w:hanging="360"/>
+        <w:ind w:left="6480" w:hanging="480"/>
       </w:pPr>
     </w:lvl>
   </w:abstractNum>
@@ -6717,8 +6762,8 @@
     <w:name w:val="KeywordTok"/>
     <w:basedOn w:val="VerbatimChar"/>
     <w:rPr>
+      <w:color w:val="007020"/>
       <w:b/>
-      <w:color w:val="007020"/>
     </w:rPr>
   </w:style>
   <w:style w:type="character" w:customStyle="1" w:styleId="DataTypeTok">
@@ -6795,42 +6840,42 @@
     <w:name w:val="ImportTok"/>
     <w:basedOn w:val="VerbatimChar"/>
     <w:rPr>
+      <w:color w:val="008000"/>
       <w:b/>
-      <w:color w:val="008000"/>
     </w:rPr>
   </w:style>
   <w:style w:type="character" w:customStyle="1" w:styleId="CommentTok">
     <w:name w:val="CommentTok"/>
     <w:basedOn w:val="VerbatimChar"/>
     <w:rPr>
+      <w:color w:val="60a0b0"/>
       <w:i/>
-      <w:color w:val="60a0b0"/>
     </w:rPr>
   </w:style>
   <w:style w:type="character" w:customStyle="1" w:styleId="DocumentationTok">
     <w:name w:val="DocumentationTok"/>
     <w:basedOn w:val="VerbatimChar"/>
     <w:rPr>
+      <w:color w:val="ba2121"/>
       <w:i/>
-      <w:color w:val="ba2121"/>
     </w:rPr>
   </w:style>
   <w:style w:type="character" w:customStyle="1" w:styleId="AnnotationTok">
     <w:name w:val="AnnotationTok"/>
     <w:basedOn w:val="VerbatimChar"/>
     <w:rPr>
+      <w:color w:val="60a0b0"/>
       <w:b/>
       <w:i/>
-      <w:color w:val="60a0b0"/>
     </w:rPr>
   </w:style>
   <w:style w:type="character" w:customStyle="1" w:styleId="CommentVarTok">
     <w:name w:val="CommentVarTok"/>
     <w:basedOn w:val="VerbatimChar"/>
     <w:rPr>
+      <w:color w:val="60a0b0"/>
       <w:b/>
       <w:i/>
-      <w:color w:val="60a0b0"/>
     </w:rPr>
   </w:style>
   <w:style w:type="character" w:customStyle="1" w:styleId="OtherTok">
@@ -6858,8 +6903,8 @@
     <w:name w:val="ControlFlowTok"/>
     <w:basedOn w:val="VerbatimChar"/>
     <w:rPr>
+      <w:color w:val="007020"/>
       <w:b/>
-      <w:color w:val="007020"/>
     </w:rPr>
   </w:style>
   <w:style w:type="character" w:customStyle="1" w:styleId="OperatorTok">
@@ -6904,34 +6949,34 @@
     <w:name w:val="InformationTok"/>
     <w:basedOn w:val="VerbatimChar"/>
     <w:rPr>
+      <w:color w:val="60a0b0"/>
       <w:b/>
       <w:i/>
-      <w:color w:val="60a0b0"/>
     </w:rPr>
   </w:style>
   <w:style w:type="character" w:customStyle="1" w:styleId="WarningTok">
     <w:name w:val="WarningTok"/>
     <w:basedOn w:val="VerbatimChar"/>
     <w:rPr>
+      <w:color w:val="60a0b0"/>
       <w:b/>
       <w:i/>
-      <w:color w:val="60a0b0"/>
     </w:rPr>
   </w:style>
   <w:style w:type="character" w:customStyle="1" w:styleId="AlertTok">
     <w:name w:val="AlertTok"/>
     <w:basedOn w:val="VerbatimChar"/>
     <w:rPr>
+      <w:color w:val="ff0000"/>
       <w:b/>
-      <w:color w:val="ff0000"/>
     </w:rPr>
   </w:style>
   <w:style w:type="character" w:customStyle="1" w:styleId="ErrorTok">
     <w:name w:val="ErrorTok"/>
     <w:basedOn w:val="VerbatimChar"/>
     <w:rPr>
+      <w:color w:val="ff0000"/>
       <w:b/>
-      <w:color w:val="ff0000"/>
     </w:rPr>
   </w:style>
   <w:style w:type="character" w:customStyle="1" w:styleId="NormalTok">

</xml_diff>

<commit_message>
docs: the Word / PDF exports regenerated (GameKit's reference 20 among them, build_docs.py lists it)
Co-Authored-By: Claude Opus 5.5 <noreply@anthropic.com>
Claude-Session: https://claude.ai/code/session_019HZNXkLwzsAQuW11C1P6uR
</commit_message>
<xml_diff>
--- a/docs/exports/01-PROJECT-OVERVIEW.docx
+++ b/docs/exports/01-PROJECT-OVERVIEW.docx
@@ -1515,7 +1515,23 @@
         <w:t xml:space="preserve">GPIOKit</w:t>
       </w:r>
       <w:r>
-        <w:t xml:space="preserve">. A program draws on the kits and never reaches the kernel itself; a kit that changes</w:t>
+        <w:t xml:space="preserve">,</w:t>
+      </w:r>
+      <w:r>
+        <w:t xml:space="preserve"> </w:t>
+      </w:r>
+      <w:r>
+        <w:rPr>
+          <w:bCs/>
+          <w:b/>
+        </w:rPr>
+        <w:t xml:space="preserve">GameKit</w:t>
+      </w:r>
+      <w:r>
+        <w:t xml:space="preserve"> </w:t>
+      </w:r>
+      <w:r>
+        <w:t xml:space="preserve">(the games of the card's ROMs). A program draws on the kits and never reaches the kernel itself; a kit that changes</w:t>
       </w:r>
       <w:r>
         <w:t xml:space="preserve"> </w:t>

</xml_diff>

<commit_message>
Pi 5: the desktop's pixels made opaque on their way to the screen (the Pi 500 showed the boot log then black: its display takes the alpha byte) -- fork patch 31; fullscreen_direct off on the Pi 5; packages onyx 2026.10.155 (Pi 5)
Co-Authored-By: Claude Opus 5.5 <noreply@anthropic.com>
Claude-Session: https://claude.ai/code/session_01NVTBGsTejLZor1Spptroyo
</commit_message>
<xml_diff>
--- a/docs/exports/01-PROJECT-OVERVIEW.docx
+++ b/docs/exports/01-PROJECT-OVERVIEW.docx
@@ -18,7 +18,7 @@
         <w:t xml:space="preserve">Onyx · multi-process OS on Raspberry Pi 4</w:t>
       </w:r>
     </w:p>
-    <w:bookmarkStart w:id="23" w:name="X14dbb8d34989bbb6ce0a693749d87edcb6cab80"/>
+    <w:bookmarkStart w:id="25" w:name="X14dbb8d34989bbb6ce0a693749d87edcb6cab80"/>
     <w:p>
       <w:pPr>
         <w:pStyle w:val="Heading2"/>
@@ -39,8 +39,8 @@
       </w:r>
       <w:r>
         <w:rPr>
-          <w:b/>
-          <w:bCs/>
+          <w:bCs/>
+          <w:b/>
         </w:rPr>
         <w:t xml:space="preserve">small multi-process operating system</w:t>
       </w:r>
@@ -55,8 +55,8 @@
       </w:r>
       <w:r>
         <w:rPr>
-          <w:b/>
-          <w:bCs/>
+          <w:bCs/>
+          <w:b/>
         </w:rPr>
         <w:t xml:space="preserve">Raspberry Pi 4</w:t>
       </w:r>
@@ -71,8 +71,8 @@
       </w:r>
       <w:r>
         <w:rPr>
-          <w:b/>
-          <w:bCs/>
+          <w:bCs/>
+          <w:b/>
         </w:rPr>
         <w:t xml:space="preserve">on top of Circle</w:t>
       </w:r>
@@ -82,7 +82,7 @@
       <w:r>
         <w:t xml:space="preserve">(</w:t>
       </w:r>
-      <w:hyperlink r:id="rId18">
+      <w:hyperlink r:id="rId20">
         <w:r>
           <w:rPr>
             <w:rStyle w:val="Hyperlink"/>
@@ -104,22 +104,22 @@
       </w:r>
       <w:r>
         <w:rPr>
-          <w:b/>
-          <w:bCs/>
+          <w:bCs/>
+          <w:b/>
         </w:rPr>
         <w:t xml:space="preserve">ELF programs from the SD</w:t>
       </w:r>
       <w:r>
         <w:rPr>
-          <w:b/>
-          <w:bCs/>
-        </w:rPr>
-        <w:t xml:space="preserve"> </w:t>
-      </w:r>
-      <w:r>
-        <w:rPr>
-          <w:b/>
-          <w:bCs/>
+          <w:bCs/>
+          <w:b/>
+        </w:rPr>
+        <w:t xml:space="preserve"> </w:t>
+      </w:r>
+      <w:r>
+        <w:rPr>
+          <w:bCs/>
+          <w:b/>
         </w:rPr>
         <w:t xml:space="preserve">card</w:t>
       </w:r>
@@ -134,8 +134,8 @@
       </w:r>
       <w:r>
         <w:rPr>
-          <w:b/>
-          <w:bCs/>
+          <w:bCs/>
+          <w:b/>
         </w:rPr>
         <w:t xml:space="preserve">applications isolated from one another</w:t>
       </w:r>
@@ -153,8 +153,8 @@
       </w:r>
       <w:r>
         <w:rPr>
-          <w:b/>
-          <w:bCs/>
+          <w:bCs/>
+          <w:b/>
         </w:rPr>
         <w:t xml:space="preserve">Onyx desktop</w:t>
       </w:r>
@@ -196,8 +196,8 @@
       </w:r>
       <w:r>
         <w:rPr>
-          <w:b/>
-          <w:bCs/>
+          <w:bCs/>
+          <w:b/>
         </w:rPr>
         <w:t xml:space="preserve">pocket</w:t>
       </w:r>
@@ -212,8 +212,8 @@
       </w:r>
       <w:r>
         <w:rPr>
-          <w:b/>
-          <w:bCs/>
+          <w:bCs/>
+          <w:b/>
         </w:rPr>
         <w:t xml:space="preserve">console</w:t>
       </w:r>
@@ -229,7 +229,7 @@
       <w:r>
         <w:t xml:space="preserve">Our own code is under the MIT licence (</w:t>
       </w:r>
-      <w:hyperlink r:id="rId19">
+      <w:hyperlink r:id="rId21">
         <w:r>
           <w:rPr>
             <w:rStyle w:val="Hyperlink"/>
@@ -253,8 +253,8 @@
       </w:r>
       <w:r>
         <w:rPr>
-          <w:b/>
-          <w:bCs/>
+          <w:bCs/>
+          <w:b/>
         </w:rPr>
         <w:t xml:space="preserve">runs on real Raspberry Pi 4 hardware</w:t>
       </w:r>
@@ -274,18 +274,18 @@
           <wp:inline>
             <wp:extent cx="5334000" cy="4000500"/>
             <wp:effectExtent b="0" l="0" r="0" t="0"/>
-            <wp:docPr descr="The Onyx desktop" title="" id="21" name="Picture"/>
+            <wp:docPr descr="The Onyx desktop" title="" id="23" name="Picture"/>
             <a:graphic>
               <a:graphicData uri="http://schemas.openxmlformats.org/drawingml/2006/picture">
                 <pic:pic>
                   <pic:nvPicPr>
-                    <pic:cNvPr descr="../screenshots/desktop.png" id="22" name="Picture"/>
+                    <pic:cNvPr descr="../screenshots/desktop.png" id="24" name="Picture"/>
                     <pic:cNvPicPr>
                       <a:picLocks noChangeArrowheads="1" noChangeAspect="1"/>
                     </pic:cNvPicPr>
                   </pic:nvPicPr>
                   <pic:blipFill>
-                    <a:blip r:embed="rId20"/>
+                    <a:blip r:embed="rId22"/>
                     <a:stretch>
                       <a:fillRect/>
                     </a:stretch>
@@ -316,64 +316,64 @@
       </w:r>
       <w:r>
         <w:rPr>
+          <w:iCs/>
           <w:i/>
+        </w:rPr>
+        <w:t xml:space="preserve">The Onyx desktop, a modernised CDE: the menu bar, the agenda on the Voronoi wallpaper, a</w:t>
+      </w:r>
+      <w:r>
+        <w:rPr>
           <w:iCs/>
-        </w:rPr>
-        <w:t xml:space="preserve">The Onyx desktop, a modernised CDE: the menu bar, the agenda on the Voronoi wallpaper, a</w:t>
-      </w:r>
-      <w:r>
-        <w:rPr>
           <w:i/>
+        </w:rPr>
+        <w:t xml:space="preserve"> </w:t>
+      </w:r>
+      <w:r>
+        <w:rPr>
           <w:iCs/>
-        </w:rPr>
-        <w:t xml:space="preserve"> </w:t>
-      </w:r>
-      <w:r>
-        <w:rPr>
           <w:i/>
+        </w:rPr>
+        <w:t xml:space="preserve">calculator behind (grey frame), the terminal in front (its frame in the theme's colour), the dock</w:t>
+      </w:r>
+      <w:r>
+        <w:rPr>
           <w:iCs/>
-        </w:rPr>
-        <w:t xml:space="preserve">calculator behind (grey frame), the terminal in front (its frame in the theme's colour), the dock</w:t>
-      </w:r>
-      <w:r>
-        <w:rPr>
           <w:i/>
+        </w:rPr>
+        <w:t xml:space="preserve"> </w:t>
+      </w:r>
+      <w:r>
+        <w:rPr>
           <w:iCs/>
-        </w:rPr>
-        <w:t xml:space="preserve"> </w:t>
-      </w:r>
-      <w:r>
-        <w:rPr>
           <w:i/>
+        </w:rPr>
+        <w:t xml:space="preserve">with its Internet drawer open. (The real apps, run on a PC by the desktop simulator.)</w:t>
+      </w:r>
+    </w:p>
+    <w:bookmarkEnd w:id="25"/>
+    <w:bookmarkStart w:id="27" w:name="Xd640424531133ed57c940435731be17c3880fdc"/>
+    <w:p>
+      <w:pPr>
+        <w:pStyle w:val="Heading2"/>
+      </w:pPr>
+      <w:r>
+        <w:t xml:space="preserve">2. Philosophy: "own the top, reuse the bottom"</w:t>
+      </w:r>
+    </w:p>
+    <w:p>
+      <w:pPr>
+        <w:pStyle w:val="FirstParagraph"/>
+      </w:pPr>
+      <w:r>
+        <w:t xml:space="preserve">Circle is a</w:t>
+      </w:r>
+      <w:r>
+        <w:t xml:space="preserve"> </w:t>
+      </w:r>
+      <w:r>
+        <w:rPr>
           <w:iCs/>
-        </w:rPr>
-        <w:t xml:space="preserve">with its Internet drawer open. (The real apps, run on a PC by the desktop simulator.)</w:t>
-      </w:r>
-    </w:p>
-    <w:bookmarkEnd w:id="23"/>
-    <w:bookmarkStart w:id="25" w:name="Xd640424531133ed57c940435731be17c3880fdc"/>
-    <w:p>
-      <w:pPr>
-        <w:pStyle w:val="Heading2"/>
-      </w:pPr>
-      <w:r>
-        <w:t xml:space="preserve">2. Philosophy: "own the top, reuse the bottom"</w:t>
-      </w:r>
-    </w:p>
-    <w:p>
-      <w:pPr>
-        <w:pStyle w:val="FirstParagraph"/>
-      </w:pPr>
-      <w:r>
-        <w:t xml:space="preserve">Circle is a</w:t>
-      </w:r>
-      <w:r>
-        <w:t xml:space="preserve"> </w:t>
-      </w:r>
-      <w:r>
-        <w:rPr>
           <w:i/>
-          <w:iCs/>
         </w:rPr>
         <w:t xml:space="preserve">single-process, single-address-space, cooperative</w:t>
       </w:r>
@@ -394,8 +394,8 @@
       </w:r>
       <w:r>
         <w:rPr>
-          <w:b/>
-          <w:bCs/>
+          <w:bCs/>
+          <w:b/>
         </w:rPr>
         <w:t xml:space="preserve">is</w:t>
       </w:r>
@@ -410,8 +410,8 @@
       </w:r>
       <w:r>
         <w:rPr>
-          <w:b/>
-          <w:bCs/>
+          <w:bCs/>
+          <w:b/>
         </w:rPr>
         <w:t xml:space="preserve">keeps the bottom half</w:t>
       </w:r>
@@ -432,8 +432,8 @@
       </w:r>
       <w:r>
         <w:rPr>
-          <w:b/>
-          <w:bCs/>
+          <w:bCs/>
+          <w:b/>
         </w:rPr>
         <w:t xml:space="preserve">replaces its "operating system" half</w:t>
       </w:r>
@@ -446,6 +446,7 @@
         <w:tblStyle w:val="Table"/>
         <w:tblW w:type="auto" w:w="0"/>
         <w:tblLook w:firstRow="1" w:lastRow="0" w:firstColumn="0" w:lastColumn="0" w:noHBand="0" w:noVBand="0" w:val="0020"/>
+        <w:jc w:val="start"/>
       </w:tblPr>
       <w:tblGrid>
         <w:gridCol w:w="2640"/>
@@ -454,13 +455,14 @@
       </w:tblGrid>
       <w:tr>
         <w:trPr>
-          <w:tblHeader w:val="on"/>
+          <w:tblHeader w:val="true"/>
         </w:trPr>
         <w:tc>
           <w:tcPr/>
           <w:p>
             <w:pPr>
               <w:pStyle w:val="Compact"/>
+              <w:jc w:val="left"/>
             </w:pPr>
             <w:r>
               <w:t xml:space="preserve">Layer</w:t>
@@ -472,6 +474,7 @@
           <w:p>
             <w:pPr>
               <w:pStyle w:val="Compact"/>
+              <w:jc w:val="left"/>
             </w:pPr>
             <w:r>
               <w:t xml:space="preserve">Decision</w:t>
@@ -483,6 +486,7 @@
           <w:p>
             <w:pPr>
               <w:pStyle w:val="Compact"/>
+              <w:jc w:val="left"/>
             </w:pPr>
             <w:r>
               <w:t xml:space="preserve">Detail</w:t>
@@ -496,6 +500,7 @@
           <w:p>
             <w:pPr>
               <w:pStyle w:val="Compact"/>
+              <w:jc w:val="left"/>
             </w:pPr>
             <w:r>
               <w:t xml:space="preserve">Reset → EL1, MMU activation, GIC, C++ constructors</w:t>
@@ -507,11 +512,12 @@
           <w:p>
             <w:pPr>
               <w:pStyle w:val="Compact"/>
+              <w:jc w:val="left"/>
             </w:pPr>
             <w:r>
               <w:rPr>
+                <w:bCs/>
                 <w:b/>
-                <w:bCs/>
               </w:rPr>
               <w:t xml:space="preserve">Keep Circle</w:t>
             </w:r>
@@ -522,6 +528,7 @@
           <w:p>
             <w:pPr>
               <w:pStyle w:val="Compact"/>
+              <w:jc w:val="left"/>
             </w:pPr>
             <w:r>
               <w:t xml:space="preserve">Our entry point is</w:t>
@@ -547,6 +554,7 @@
           <w:p>
             <w:pPr>
               <w:pStyle w:val="Compact"/>
+              <w:jc w:val="left"/>
             </w:pPr>
             <w:r>
               <w:t xml:space="preserve">64 KB page allocator (</w:t>
@@ -576,11 +584,12 @@
           <w:p>
             <w:pPr>
               <w:pStyle w:val="Compact"/>
+              <w:jc w:val="left"/>
             </w:pPr>
             <w:r>
               <w:rPr>
+                <w:bCs/>
                 <w:b/>
-                <w:bCs/>
               </w:rPr>
               <w:t xml:space="preserve">Keep</w:t>
             </w:r>
@@ -597,6 +606,7 @@
           <w:p>
             <w:pPr>
               <w:pStyle w:val="Compact"/>
+              <w:jc w:val="left"/>
             </w:pPr>
             <w:r>
               <w:rPr>
@@ -616,6 +626,7 @@
           <w:p>
             <w:pPr>
               <w:pStyle w:val="Compact"/>
+              <w:jc w:val="left"/>
             </w:pPr>
             <w:r>
               <w:t xml:space="preserve">GIC-400, timer, mailbox, EMMC+FatFs, USB, Ethernet, framebuffer</w:t>
@@ -627,11 +638,12 @@
           <w:p>
             <w:pPr>
               <w:pStyle w:val="Compact"/>
+              <w:jc w:val="left"/>
             </w:pPr>
             <w:r>
               <w:rPr>
+                <w:bCs/>
                 <w:b/>
-                <w:bCs/>
               </w:rPr>
               <w:t xml:space="preserve">Reuse</w:t>
             </w:r>
@@ -642,6 +654,7 @@
           <w:p>
             <w:pPr>
               <w:pStyle w:val="Compact"/>
+              <w:jc w:val="left"/>
             </w:pPr>
             <w:r>
               <w:t xml:space="preserve">This is the whole point of building on Circle.</w:t>
@@ -655,6 +668,7 @@
           <w:p>
             <w:pPr>
               <w:pStyle w:val="Compact"/>
+              <w:jc w:val="left"/>
             </w:pPr>
             <w:r>
               <w:rPr>
@@ -684,11 +698,12 @@
           <w:p>
             <w:pPr>
               <w:pStyle w:val="Compact"/>
+              <w:jc w:val="left"/>
             </w:pPr>
             <w:r>
               <w:rPr>
+                <w:bCs/>
                 <w:b/>
-                <w:bCs/>
               </w:rPr>
               <w:t xml:space="preserve">Rewrite the implementation, keep the API</w:t>
             </w:r>
@@ -699,6 +714,7 @@
           <w:p>
             <w:pPr>
               <w:pStyle w:val="Compact"/>
+              <w:jc w:val="left"/>
             </w:pPr>
             <w:r>
               <w:t xml:space="preserve">See</w:t>
@@ -706,7 +722,7 @@
             <w:r>
               <w:t xml:space="preserve"> </w:t>
             </w:r>
-            <w:hyperlink r:id="rId24">
+            <w:hyperlink r:id="rId26">
               <w:r>
                 <w:rPr>
                   <w:rStyle w:val="Hyperlink"/>
@@ -726,6 +742,7 @@
           <w:p>
             <w:pPr>
               <w:pStyle w:val="Compact"/>
+              <w:jc w:val="left"/>
             </w:pPr>
             <w:r>
               <w:t xml:space="preserve">Per-process page tables, context switching, exception vectors, address spaces</w:t>
@@ -737,11 +754,12 @@
           <w:p>
             <w:pPr>
               <w:pStyle w:val="Compact"/>
+              <w:jc w:val="left"/>
             </w:pPr>
             <w:r>
               <w:rPr>
+                <w:bCs/>
                 <w:b/>
-                <w:bCs/>
               </w:rPr>
               <w:t xml:space="preserve">Write from scratch</w:t>
             </w:r>
@@ -752,6 +770,7 @@
           <w:p>
             <w:pPr>
               <w:pStyle w:val="Compact"/>
+              <w:jc w:val="left"/>
             </w:pPr>
             <w:r>
               <w:t xml:space="preserve">Doesn't exist in Circle.</w:t>
@@ -772,8 +791,8 @@
       </w:r>
       <w:r>
         <w:rPr>
-          <w:b/>
-          <w:bCs/>
+          <w:bCs/>
+          <w:b/>
         </w:rPr>
         <w:t xml:space="preserve">link</w:t>
       </w:r>
@@ -829,8 +848,8 @@
         <w:t xml:space="preserve">sources.</w:t>
       </w:r>
     </w:p>
-    <w:bookmarkEnd w:id="25"/>
-    <w:bookmarkStart w:id="31" w:name="Xf0d948a12025d44e9afbc6dcf23238f6e9c5d4e"/>
+    <w:bookmarkEnd w:id="27"/>
+    <w:bookmarkStart w:id="33" w:name="Xf0d948a12025d44e9afbc6dcf23238f6e9c5d4e"/>
     <w:p>
       <w:pPr>
         <w:pStyle w:val="Heading2"/>
@@ -841,16 +860,16 @@
     </w:p>
     <w:p>
       <w:pPr>
-        <w:pStyle w:val="Compact"/>
         <w:numPr>
           <w:ilvl w:val="0"/>
           <w:numId w:val="1001"/>
         </w:numPr>
-      </w:pPr>
-      <w:r>
-        <w:rPr>
-          <w:b/>
-          <w:bCs/>
+        <w:pStyle w:val="Compact"/>
+      </w:pPr>
+      <w:r>
+        <w:rPr>
+          <w:bCs/>
+          <w:b/>
         </w:rPr>
         <w:t xml:space="preserve">Per-process isolation via the MMU.</w:t>
       </w:r>
@@ -871,8 +890,8 @@
       </w:r>
       <w:r>
         <w:rPr>
-          <w:b/>
-          <w:bCs/>
+          <w:bCs/>
+          <w:b/>
         </w:rPr>
         <w:t xml:space="preserve">ASID</w:t>
       </w:r>
@@ -888,16 +907,16 @@
     </w:p>
     <w:p>
       <w:pPr>
-        <w:pStyle w:val="Compact"/>
         <w:numPr>
           <w:ilvl w:val="0"/>
           <w:numId w:val="1001"/>
         </w:numPr>
-      </w:pPr>
-      <w:r>
-        <w:rPr>
-          <w:b/>
-          <w:bCs/>
+        <w:pStyle w:val="Compact"/>
+      </w:pPr>
+      <w:r>
+        <w:rPr>
+          <w:bCs/>
+          <w:b/>
         </w:rPr>
         <w:t xml:space="preserve">Protected apps (EL0).</w:t>
       </w:r>
@@ -912,8 +931,8 @@
       </w:r>
       <w:r>
         <w:rPr>
-          <w:b/>
-          <w:bCs/>
+          <w:bCs/>
+          <w:b/>
         </w:rPr>
         <w:t xml:space="preserve">EL0</w:t>
       </w:r>
@@ -931,8 +950,8 @@
       </w:r>
       <w:r>
         <w:rPr>
-          <w:b/>
-          <w:bCs/>
+          <w:bCs/>
+          <w:b/>
         </w:rPr>
         <w:t xml:space="preserve">system calls</w:t>
       </w:r>
@@ -956,8 +975,8 @@
       </w:r>
       <w:r>
         <w:rPr>
-          <w:b/>
-          <w:bCs/>
+          <w:bCs/>
+          <w:b/>
         </w:rPr>
         <w:t xml:space="preserve">and</w:t>
       </w:r>
@@ -976,31 +995,31 @@
     </w:p>
     <w:p>
       <w:pPr>
-        <w:pStyle w:val="Compact"/>
         <w:numPr>
           <w:ilvl w:val="0"/>
           <w:numId w:val="1001"/>
         </w:numPr>
-      </w:pPr>
-      <w:r>
-        <w:rPr>
-          <w:b/>
-          <w:bCs/>
+        <w:pStyle w:val="Compact"/>
+      </w:pPr>
+      <w:r>
+        <w:rPr>
+          <w:bCs/>
+          <w:b/>
         </w:rPr>
         <w:t xml:space="preserve">Stable fixed-address ABI (</w:t>
       </w:r>
       <w:r>
         <w:rPr>
           <w:rStyle w:val="VerbatimChar"/>
-          <w:b/>
-          <w:bCs/>
+          <w:bCs/>
+          <w:b/>
         </w:rPr>
         <w:t xml:space="preserve">kapi</w:t>
       </w:r>
       <w:r>
         <w:rPr>
-          <w:b/>
-          <w:bCs/>
+          <w:bCs/>
+          <w:b/>
         </w:rPr>
         <w:t xml:space="preserve">).</w:t>
       </w:r>
@@ -1015,22 +1034,22 @@
       </w:r>
       <w:r>
         <w:rPr>
-          <w:b/>
-          <w:bCs/>
+          <w:bCs/>
+          <w:b/>
         </w:rPr>
         <w:t xml:space="preserve">table of function</w:t>
       </w:r>
       <w:r>
         <w:rPr>
-          <w:b/>
-          <w:bCs/>
-        </w:rPr>
-        <w:t xml:space="preserve"> </w:t>
-      </w:r>
-      <w:r>
-        <w:rPr>
-          <w:b/>
-          <w:bCs/>
+          <w:bCs/>
+          <w:b/>
+        </w:rPr>
+        <w:t xml:space="preserve"> </w:t>
+      </w:r>
+      <w:r>
+        <w:rPr>
+          <w:bCs/>
+          <w:b/>
         </w:rPr>
         <w:t xml:space="preserve">pointers</w:t>
       </w:r>
@@ -1051,8 +1070,8 @@
       </w:r>
       <w:r>
         <w:rPr>
-          <w:b/>
-          <w:bCs/>
+          <w:bCs/>
+          <w:b/>
         </w:rPr>
         <w:t xml:space="preserve">an application binary keeps working without recompilation</w:t>
       </w:r>
@@ -1073,8 +1092,8 @@
       </w:r>
       <w:r>
         <w:rPr>
-          <w:b/>
-          <w:bCs/>
+          <w:bCs/>
+          <w:b/>
         </w:rPr>
         <w:t xml:space="preserve">97</w:t>
       </w:r>
@@ -1105,16 +1124,16 @@
     </w:p>
     <w:p>
       <w:pPr>
-        <w:pStyle w:val="Compact"/>
         <w:numPr>
           <w:ilvl w:val="0"/>
           <w:numId w:val="1001"/>
         </w:numPr>
-      </w:pPr>
-      <w:r>
-        <w:rPr>
-          <w:b/>
-          <w:bCs/>
+        <w:pStyle w:val="Compact"/>
+      </w:pPr>
+      <w:r>
+        <w:rPr>
+          <w:bCs/>
+          <w:b/>
         </w:rPr>
         <w:t xml:space="preserve">Demand paging</w:t>
       </w:r>
@@ -1139,16 +1158,16 @@
     </w:p>
     <w:p>
       <w:pPr>
-        <w:pStyle w:val="Compact"/>
         <w:numPr>
           <w:ilvl w:val="0"/>
           <w:numId w:val="1001"/>
         </w:numPr>
-      </w:pPr>
-      <w:r>
-        <w:rPr>
-          <w:b/>
-          <w:bCs/>
+        <w:pStyle w:val="Compact"/>
+      </w:pPr>
+      <w:r>
+        <w:rPr>
+          <w:bCs/>
+          <w:b/>
         </w:rPr>
         <w:t xml:space="preserve">Shared images, shared libraries, preloading.</w:t>
       </w:r>
@@ -1163,8 +1182,8 @@
       </w:r>
       <w:r>
         <w:rPr>
-          <w:b/>
-          <w:bCs/>
+          <w:bCs/>
+          <w:b/>
         </w:rPr>
         <w:t xml:space="preserve">once</w:t>
       </w:r>
@@ -1203,8 +1222,8 @@
       </w:r>
       <w:r>
         <w:rPr>
-          <w:b/>
-          <w:bCs/>
+          <w:bCs/>
+          <w:b/>
         </w:rPr>
         <w:t xml:space="preserve">shared library</w:t>
       </w:r>
@@ -1234,8 +1253,8 @@
       </w:r>
       <w:r>
         <w:rPr>
-          <w:b/>
-          <w:bCs/>
+          <w:bCs/>
+          <w:b/>
         </w:rPr>
         <w:t xml:space="preserve">preloaded</w:t>
       </w:r>
@@ -1272,7 +1291,7 @@
       <w:r>
         <w:t xml:space="preserve">(</w:t>
       </w:r>
-      <w:hyperlink r:id="rId24">
+      <w:hyperlink r:id="rId26">
         <w:r>
           <w:rPr>
             <w:rStyle w:val="Hyperlink"/>
@@ -1288,24 +1307,24 @@
       </w:r>
       <w:r>
         <w:rPr>
+          <w:iCs/>
           <w:i/>
+        </w:rPr>
+        <w:t xml:space="preserve">Demand paging</w:t>
+      </w:r>
+      <w:r>
+        <w:t xml:space="preserve"> </w:t>
+      </w:r>
+      <w:r>
+        <w:t xml:space="preserve">and</w:t>
+      </w:r>
+      <w:r>
+        <w:t xml:space="preserve"> </w:t>
+      </w:r>
+      <w:r>
+        <w:rPr>
           <w:iCs/>
-        </w:rPr>
-        <w:t xml:space="preserve">Demand paging</w:t>
-      </w:r>
-      <w:r>
-        <w:t xml:space="preserve"> </w:t>
-      </w:r>
-      <w:r>
-        <w:t xml:space="preserve">and</w:t>
-      </w:r>
-      <w:r>
-        <w:t xml:space="preserve"> </w:t>
-      </w:r>
-      <w:r>
-        <w:rPr>
           <w:i/>
-          <w:iCs/>
         </w:rPr>
         <w:t xml:space="preserve">Shared libraries</w:t>
       </w:r>
@@ -1315,16 +1334,16 @@
     </w:p>
     <w:p>
       <w:pPr>
-        <w:pStyle w:val="Compact"/>
         <w:numPr>
           <w:ilvl w:val="0"/>
           <w:numId w:val="1001"/>
         </w:numPr>
-      </w:pPr>
-      <w:r>
-        <w:rPr>
-          <w:b/>
-          <w:bCs/>
+        <w:pStyle w:val="Compact"/>
+      </w:pPr>
+      <w:r>
+        <w:rPr>
+          <w:bCs/>
+          <w:b/>
         </w:rPr>
         <w:t xml:space="preserve">The kits.</w:t>
       </w:r>
@@ -1339,8 +1358,8 @@
       </w:r>
       <w:r>
         <w:rPr>
-          <w:b/>
-          <w:bCs/>
+          <w:bCs/>
+          <w:b/>
         </w:rPr>
         <w:t xml:space="preserve">kit per domain</w:t>
       </w:r>
@@ -1352,8 +1371,8 @@
       </w:r>
       <w:r>
         <w:rPr>
-          <w:b/>
-          <w:bCs/>
+          <w:bCs/>
+          <w:b/>
         </w:rPr>
         <w:t xml:space="preserve">AppKit</w:t>
       </w:r>
@@ -1374,8 +1393,8 @@
       </w:r>
       <w:r>
         <w:rPr>
-          <w:b/>
-          <w:bCs/>
+          <w:bCs/>
+          <w:b/>
         </w:rPr>
         <w:t xml:space="preserve">UIKit</w:t>
       </w:r>
@@ -1390,8 +1409,8 @@
       </w:r>
       <w:r>
         <w:rPr>
-          <w:b/>
-          <w:bCs/>
+          <w:bCs/>
+          <w:b/>
         </w:rPr>
         <w:t xml:space="preserve">SystemKit</w:t>
       </w:r>
@@ -1412,8 +1431,8 @@
       </w:r>
       <w:r>
         <w:rPr>
-          <w:b/>
-          <w:bCs/>
+          <w:bCs/>
+          <w:b/>
         </w:rPr>
         <w:t xml:space="preserve">NetKit</w:t>
       </w:r>
@@ -1425,8 +1444,8 @@
       </w:r>
       <w:r>
         <w:rPr>
-          <w:b/>
-          <w:bCs/>
+          <w:bCs/>
+          <w:b/>
         </w:rPr>
         <w:t xml:space="preserve">FileKit</w:t>
       </w:r>
@@ -1438,8 +1457,8 @@
       </w:r>
       <w:r>
         <w:rPr>
-          <w:b/>
-          <w:bCs/>
+          <w:bCs/>
+          <w:b/>
         </w:rPr>
         <w:t xml:space="preserve">ImageKit</w:t>
       </w:r>
@@ -1451,8 +1470,8 @@
       </w:r>
       <w:r>
         <w:rPr>
-          <w:b/>
-          <w:bCs/>
+          <w:bCs/>
+          <w:b/>
         </w:rPr>
         <w:t xml:space="preserve">AudioKit</w:t>
       </w:r>
@@ -1464,8 +1483,8 @@
       </w:r>
       <w:r>
         <w:rPr>
-          <w:b/>
-          <w:bCs/>
+          <w:bCs/>
+          <w:b/>
         </w:rPr>
         <w:t xml:space="preserve">FontKit</w:t>
       </w:r>
@@ -1477,8 +1496,8 @@
       </w:r>
       <w:r>
         <w:rPr>
-          <w:b/>
-          <w:bCs/>
+          <w:bCs/>
+          <w:b/>
         </w:rPr>
         <w:t xml:space="preserve">PrinterKit</w:t>
       </w:r>
@@ -1490,8 +1509,8 @@
       </w:r>
       <w:r>
         <w:rPr>
-          <w:b/>
-          <w:bCs/>
+          <w:bCs/>
+          <w:b/>
         </w:rPr>
         <w:t xml:space="preserve">GPIOKit</w:t>
       </w:r>
@@ -1503,8 +1522,8 @@
       </w:r>
       <w:r>
         <w:rPr>
-          <w:b/>
-          <w:bCs/>
+          <w:bCs/>
+          <w:b/>
         </w:rPr>
         <w:t xml:space="preserve">GameKit</w:t>
       </w:r>
@@ -1520,7 +1539,7 @@
       <w:r>
         <w:t xml:space="preserve">is replaced on the card, the programs are not rebuilt. (</w:t>
       </w:r>
-      <w:hyperlink r:id="rId26">
+      <w:hyperlink r:id="rId28">
         <w:r>
           <w:rPr>
             <w:rStyle w:val="Hyperlink"/>
@@ -1534,16 +1553,16 @@
     </w:p>
     <w:p>
       <w:pPr>
-        <w:pStyle w:val="Compact"/>
         <w:numPr>
           <w:ilvl w:val="0"/>
           <w:numId w:val="1001"/>
         </w:numPr>
-      </w:pPr>
-      <w:r>
-        <w:rPr>
-          <w:b/>
-          <w:bCs/>
+        <w:pStyle w:val="Compact"/>
+      </w:pPr>
+      <w:r>
+        <w:rPr>
+          <w:bCs/>
+          <w:b/>
         </w:rPr>
         <w:t xml:space="preserve">Threads, app cores, RAM volume.</w:t>
       </w:r>
@@ -1580,16 +1599,16 @@
     </w:p>
     <w:p>
       <w:pPr>
-        <w:pStyle w:val="Compact"/>
         <w:numPr>
           <w:ilvl w:val="0"/>
           <w:numId w:val="1001"/>
         </w:numPr>
-      </w:pPr>
-      <w:r>
-        <w:rPr>
-          <w:b/>
-          <w:bCs/>
+        <w:pStyle w:val="Compact"/>
+      </w:pPr>
+      <w:r>
+        <w:rPr>
+          <w:bCs/>
+          <w:b/>
         </w:rPr>
         <w:t xml:space="preserve">The GPU.</w:t>
       </w:r>
@@ -1623,16 +1642,16 @@
     </w:p>
     <w:p>
       <w:pPr>
-        <w:pStyle w:val="Compact"/>
         <w:numPr>
           <w:ilvl w:val="0"/>
           <w:numId w:val="1001"/>
         </w:numPr>
-      </w:pPr>
-      <w:r>
-        <w:rPr>
-          <w:b/>
-          <w:bCs/>
+        <w:pStyle w:val="Compact"/>
+      </w:pPr>
+      <w:r>
+        <w:rPr>
+          <w:bCs/>
+          <w:b/>
         </w:rPr>
         <w:t xml:space="preserve">The graphics server is a user process</w:t>
       </w:r>
@@ -1647,8 +1666,8 @@
       </w:r>
       <w:r>
         <w:rPr>
-          <w:b/>
-          <w:bCs/>
+          <w:bCs/>
+          <w:b/>
         </w:rPr>
         <w:t xml:space="preserve">Elegant</w:t>
       </w:r>
@@ -1688,16 +1707,16 @@
     </w:p>
     <w:p>
       <w:pPr>
-        <w:pStyle w:val="Compact"/>
         <w:numPr>
           <w:ilvl w:val="0"/>
           <w:numId w:val="1001"/>
         </w:numPr>
-      </w:pPr>
-      <w:r>
-        <w:rPr>
-          <w:b/>
-          <w:bCs/>
+        <w:pStyle w:val="Compact"/>
+      </w:pPr>
+      <w:r>
+        <w:rPr>
+          <w:bCs/>
+          <w:b/>
         </w:rPr>
         <w:t xml:space="preserve">Full graphical desktop.</w:t>
       </w:r>
@@ -1718,8 +1737,8 @@
       </w:r>
       <w:r>
         <w:rPr>
-          <w:b/>
-          <w:bCs/>
+          <w:bCs/>
+          <w:b/>
         </w:rPr>
         <w:t xml:space="preserve">UIKit</w:t>
       </w:r>
@@ -1735,16 +1754,16 @@
     </w:p>
     <w:p>
       <w:pPr>
-        <w:pStyle w:val="Compact"/>
         <w:numPr>
           <w:ilvl w:val="0"/>
           <w:numId w:val="1001"/>
         </w:numPr>
-      </w:pPr>
-      <w:r>
-        <w:rPr>
-          <w:b/>
-          <w:bCs/>
+        <w:pStyle w:val="Compact"/>
+      </w:pPr>
+      <w:r>
+        <w:rPr>
+          <w:bCs/>
+          <w:b/>
         </w:rPr>
         <w:t xml:space="preserve">Three interfaces, one binary per app.</w:t>
       </w:r>
@@ -1783,8 +1802,8 @@
       </w:r>
       <w:r>
         <w:rPr>
-          <w:b/>
-          <w:bCs/>
+          <w:bCs/>
+          <w:b/>
         </w:rPr>
         <w:t xml:space="preserve">Mode</w:t>
       </w:r>
@@ -1799,8 +1818,8 @@
       </w:r>
       <w:r>
         <w:rPr>
-          <w:b/>
-          <w:bCs/>
+          <w:bCs/>
+          <w:b/>
         </w:rPr>
         <w:t xml:space="preserve">desktop</w:t>
       </w:r>
@@ -1821,8 +1840,8 @@
       </w:r>
       <w:r>
         <w:rPr>
-          <w:b/>
-          <w:bCs/>
+          <w:bCs/>
+          <w:b/>
         </w:rPr>
         <w:t xml:space="preserve">pocket</w:t>
       </w:r>
@@ -1843,8 +1862,8 @@
       </w:r>
       <w:r>
         <w:rPr>
-          <w:b/>
-          <w:bCs/>
+          <w:bCs/>
+          <w:b/>
         </w:rPr>
         <w:t xml:space="preserve">console</w:t>
       </w:r>
@@ -1871,29 +1890,29 @@
       </w:r>
       <w:r>
         <w:rPr>
-          <w:b/>
-          <w:bCs/>
+          <w:bCs/>
+          <w:b/>
         </w:rPr>
         <w:t xml:space="preserve">an app is</w:t>
       </w:r>
       <w:r>
         <w:rPr>
-          <w:b/>
-          <w:bCs/>
-        </w:rPr>
-        <w:t xml:space="preserve"> </w:t>
-      </w:r>
-      <w:r>
-        <w:rPr>
-          <w:b/>
-          <w:bCs/>
+          <w:bCs/>
+          <w:b/>
+        </w:rPr>
+        <w:t xml:space="preserve"> </w:t>
+      </w:r>
+      <w:r>
+        <w:rPr>
+          <w:bCs/>
+          <w:b/>
         </w:rPr>
         <w:t xml:space="preserve">not rebuilt, and has no code per mode</w:t>
       </w:r>
       <w:r>
         <w:t xml:space="preserve">. (</w:t>
       </w:r>
-      <w:hyperlink r:id="rId27">
+      <w:hyperlink r:id="rId29">
         <w:r>
           <w:rPr>
             <w:rStyle w:val="Hyperlink"/>
@@ -1910,7 +1929,7 @@
       <w:r>
         <w:t xml:space="preserve"> </w:t>
       </w:r>
-      <w:hyperlink r:id="rId28">
+      <w:hyperlink r:id="rId30">
         <w:r>
           <w:rPr>
             <w:rStyle w:val="Hyperlink"/>
@@ -1924,16 +1943,16 @@
     </w:p>
     <w:p>
       <w:pPr>
-        <w:pStyle w:val="Compact"/>
         <w:numPr>
           <w:ilvl w:val="0"/>
           <w:numId w:val="1001"/>
         </w:numPr>
-      </w:pPr>
-      <w:r>
-        <w:rPr>
-          <w:b/>
-          <w:bCs/>
+        <w:pStyle w:val="Compact"/>
+      </w:pPr>
+      <w:r>
+        <w:rPr>
+          <w:bCs/>
+          <w:b/>
         </w:rPr>
         <w:t xml:space="preserve">English and French.</w:t>
       </w:r>
@@ -1946,16 +1965,16 @@
     </w:p>
     <w:p>
       <w:pPr>
-        <w:pStyle w:val="Compact"/>
         <w:numPr>
           <w:ilvl w:val="0"/>
           <w:numId w:val="1001"/>
         </w:numPr>
-      </w:pPr>
-      <w:r>
-        <w:rPr>
-          <w:b/>
-          <w:bCs/>
+        <w:pStyle w:val="Compact"/>
+      </w:pPr>
+      <w:r>
+        <w:rPr>
+          <w:bCs/>
+          <w:b/>
         </w:rPr>
         <w:t xml:space="preserve">Onyx shell.</w:t>
       </w:r>
@@ -1982,8 +2001,8 @@
       </w:r>
       <w:r>
         <w:rPr>
-          <w:b/>
-          <w:bCs/>
+          <w:bCs/>
+          <w:b/>
         </w:rPr>
         <w:t xml:space="preserve">pipes and redirection</w:t>
       </w:r>
@@ -2065,16 +2084,16 @@
     </w:p>
     <w:p>
       <w:pPr>
-        <w:pStyle w:val="Compact"/>
         <w:numPr>
           <w:ilvl w:val="0"/>
           <w:numId w:val="1001"/>
         </w:numPr>
-      </w:pPr>
-      <w:r>
-        <w:rPr>
-          <w:b/>
-          <w:bCs/>
+        <w:pStyle w:val="Compact"/>
+      </w:pPr>
+      <w:r>
+        <w:rPr>
+          <w:bCs/>
+          <w:b/>
         </w:rPr>
         <w:t xml:space="preserve">Application catalog</w:t>
       </w:r>
@@ -2084,7 +2103,7 @@
       <w:r>
         <w:t xml:space="preserve">(</w:t>
       </w:r>
-      <w:hyperlink r:id="rId29">
+      <w:hyperlink r:id="rId31">
         <w:r>
           <w:rPr>
             <w:rStyle w:val="Hyperlink"/>
@@ -2233,16 +2252,16 @@
     </w:p>
     <w:p>
       <w:pPr>
-        <w:pStyle w:val="Compact"/>
         <w:numPr>
           <w:ilvl w:val="0"/>
           <w:numId w:val="1001"/>
         </w:numPr>
-      </w:pPr>
-      <w:r>
-        <w:rPr>
-          <w:b/>
-          <w:bCs/>
+        <w:pStyle w:val="Compact"/>
+      </w:pPr>
+      <w:r>
+        <w:rPr>
+          <w:bCs/>
+          <w:b/>
         </w:rPr>
         <w:t xml:space="preserve">USB input devices.</w:t>
       </w:r>
@@ -2261,16 +2280,16 @@
     </w:p>
     <w:p>
       <w:pPr>
-        <w:pStyle w:val="Compact"/>
         <w:numPr>
           <w:ilvl w:val="0"/>
           <w:numId w:val="1001"/>
         </w:numPr>
-      </w:pPr>
-      <w:r>
-        <w:rPr>
-          <w:b/>
-          <w:bCs/>
+        <w:pStyle w:val="Compact"/>
+      </w:pPr>
+      <w:r>
+        <w:rPr>
+          <w:bCs/>
+          <w:b/>
         </w:rPr>
         <w:t xml:space="preserve">Networking (WLAN).</w:t>
       </w:r>
@@ -2334,16 +2353,16 @@
     </w:p>
     <w:p>
       <w:pPr>
-        <w:pStyle w:val="Compact"/>
         <w:numPr>
           <w:ilvl w:val="0"/>
           <w:numId w:val="1001"/>
         </w:numPr>
-      </w:pPr>
-      <w:r>
-        <w:rPr>
-          <w:b/>
-          <w:bCs/>
+        <w:pStyle w:val="Compact"/>
+      </w:pPr>
+      <w:r>
+        <w:rPr>
+          <w:bCs/>
+          <w:b/>
         </w:rPr>
         <w:t xml:space="preserve">Packages.</w:t>
       </w:r>
@@ -2389,16 +2408,16 @@
     </w:p>
     <w:p>
       <w:pPr>
-        <w:pStyle w:val="Compact"/>
         <w:numPr>
           <w:ilvl w:val="0"/>
           <w:numId w:val="1001"/>
         </w:numPr>
-      </w:pPr>
-      <w:r>
-        <w:rPr>
-          <w:b/>
-          <w:bCs/>
+        <w:pStyle w:val="Compact"/>
+      </w:pPr>
+      <w:r>
+        <w:rPr>
+          <w:bCs/>
+          <w:b/>
         </w:rPr>
         <w:t xml:space="preserve">A modern web browser.</w:t>
       </w:r>
@@ -2407,8 +2426,8 @@
       </w:r>
       <w:r>
         <w:rPr>
-          <w:b/>
-          <w:bCs/>
+          <w:bCs/>
+          <w:b/>
         </w:rPr>
         <w:t xml:space="preserve">Jet Browser</w:t>
       </w:r>
@@ -2432,8 +2451,8 @@
       </w:r>
       <w:r>
         <w:rPr>
-          <w:b/>
-          <w:bCs/>
+          <w:bCs/>
+          <w:b/>
         </w:rPr>
         <w:t xml:space="preserve">WebKit</w:t>
       </w:r>
@@ -2521,7 +2540,7 @@
       <w:r>
         <w:t xml:space="preserve"> </w:t>
       </w:r>
-      <w:hyperlink r:id="rId30">
+      <w:hyperlink r:id="rId32">
         <w:r>
           <w:rPr>
             <w:rStyle w:val="Hyperlink"/>
@@ -2533,8 +2552,8 @@
         <w:t xml:space="preserve">.</w:t>
       </w:r>
     </w:p>
-    <w:bookmarkEnd w:id="31"/>
-    <w:bookmarkStart w:id="32" w:name="X66f2bb71df6feea41223d9c271803389d6670e0"/>
+    <w:bookmarkEnd w:id="33"/>
+    <w:bookmarkStart w:id="34" w:name="X66f2bb71df6feea41223d9c271803389d6670e0"/>
     <w:p>
       <w:pPr>
         <w:pStyle w:val="Heading2"/>
@@ -2743,8 +2762,8 @@
         <w:t xml:space="preserve">└──────────────────────────────────────────────────────────────────┘</w:t>
       </w:r>
     </w:p>
-    <w:bookmarkEnd w:id="32"/>
-    <w:bookmarkStart w:id="34" w:name="Xe020df86a20dd184672bf24142e3014208d91a9"/>
+    <w:bookmarkEnd w:id="34"/>
+    <w:bookmarkStart w:id="36" w:name="Xe020df86a20dd184672bf24142e3014208d91a9"/>
     <w:p>
       <w:pPr>
         <w:pStyle w:val="Heading2"/>
@@ -2763,11 +2782,11 @@
     </w:p>
     <w:p>
       <w:pPr>
-        <w:pStyle w:val="Compact"/>
         <w:numPr>
           <w:ilvl w:val="0"/>
           <w:numId w:val="1002"/>
         </w:numPr>
+        <w:pStyle w:val="Compact"/>
       </w:pPr>
       <w:r>
         <w:t xml:space="preserve">Applications run at</w:t>
@@ -2777,8 +2796,8 @@
       </w:r>
       <w:r>
         <w:rPr>
-          <w:b/>
-          <w:bCs/>
+          <w:bCs/>
+          <w:b/>
         </w:rPr>
         <w:t xml:space="preserve">EL0</w:t>
       </w:r>
@@ -2790,8 +2809,8 @@
       </w:r>
       <w:r>
         <w:rPr>
-          <w:b/>
-          <w:bCs/>
+          <w:bCs/>
+          <w:b/>
         </w:rPr>
         <w:t xml:space="preserve">each in its own page table</w:t>
       </w:r>
@@ -2810,11 +2829,11 @@
     </w:p>
     <w:p>
       <w:pPr>
-        <w:pStyle w:val="Compact"/>
         <w:numPr>
           <w:ilvl w:val="0"/>
           <w:numId w:val="1002"/>
         </w:numPr>
+        <w:pStyle w:val="Compact"/>
       </w:pPr>
       <w:r>
         <w:t xml:space="preserve">They</w:t>
@@ -2824,37 +2843,37 @@
       </w:r>
       <w:r>
         <w:rPr>
-          <w:b/>
-          <w:bCs/>
+          <w:bCs/>
+          <w:b/>
         </w:rPr>
         <w:t xml:space="preserve">call the kernel through the</w:t>
       </w:r>
       <w:r>
         <w:rPr>
-          <w:b/>
-          <w:bCs/>
-        </w:rPr>
-        <w:t xml:space="preserve"> </w:t>
-      </w:r>
-      <w:r>
-        <w:rPr>
-          <w:rStyle w:val="VerbatimChar"/>
-          <w:b/>
-          <w:bCs/>
+          <w:bCs/>
+          <w:b/>
+        </w:rPr>
+        <w:t xml:space="preserve"> </w:t>
+      </w:r>
+      <w:r>
+        <w:rPr>
+          <w:rStyle w:val="VerbatimChar"/>
+          <w:bCs/>
+          <w:b/>
         </w:rPr>
         <w:t xml:space="preserve">kapi</w:t>
       </w:r>
       <w:r>
         <w:rPr>
-          <w:b/>
-          <w:bCs/>
-        </w:rPr>
-        <w:t xml:space="preserve"> </w:t>
-      </w:r>
-      <w:r>
-        <w:rPr>
-          <w:b/>
-          <w:bCs/>
+          <w:bCs/>
+          <w:b/>
+        </w:rPr>
+        <w:t xml:space="preserve"> </w:t>
+      </w:r>
+      <w:r>
+        <w:rPr>
+          <w:bCs/>
+          <w:b/>
         </w:rPr>
         <w:t xml:space="preserve">table</w:t>
       </w:r>
@@ -2884,8 +2903,8 @@
       </w:r>
       <w:r>
         <w:rPr>
-          <w:b/>
-          <w:bCs/>
+          <w:bCs/>
+          <w:b/>
         </w:rPr>
         <w:t xml:space="preserve">system call</w:t>
       </w:r>
@@ -2931,16 +2950,16 @@
     </w:p>
     <w:p>
       <w:pPr>
-        <w:pStyle w:val="Compact"/>
         <w:numPr>
           <w:ilvl w:val="0"/>
           <w:numId w:val="1002"/>
         </w:numPr>
-      </w:pPr>
-      <w:r>
-        <w:rPr>
-          <w:b/>
-          <w:bCs/>
+        <w:pStyle w:val="Compact"/>
+      </w:pPr>
+      <w:r>
+        <w:rPr>
+          <w:bCs/>
+          <w:b/>
         </w:rPr>
         <w:t xml:space="preserve">A fault in an app kills that app</w:t>
       </w:r>
@@ -2971,11 +2990,11 @@
     </w:p>
     <w:p>
       <w:pPr>
-        <w:pStyle w:val="Compact"/>
         <w:numPr>
           <w:ilvl w:val="0"/>
           <w:numId w:val="1002"/>
         </w:numPr>
+        <w:pStyle w:val="Compact"/>
       </w:pPr>
       <w:r>
         <w:t xml:space="preserve">History: the project first ran apps at EL1 with direct calls ("Option C",</w:t>
@@ -3001,7 +3020,7 @@
       <w:r>
         <w:t xml:space="preserve">steps (</w:t>
       </w:r>
-      <w:hyperlink r:id="rId33">
+      <w:hyperlink r:id="rId35">
         <w:r>
           <w:rPr>
             <w:rStyle w:val="Hyperlink"/>
@@ -3013,8 +3032,8 @@
         <w:t xml:space="preserve">) and the EL1 mode removed.</w:t>
       </w:r>
     </w:p>
-    <w:bookmarkEnd w:id="34"/>
-    <w:bookmarkStart w:id="35" w:name="Xd979bbb935ec2154d49de8f14f78dcb3ac81be6"/>
+    <w:bookmarkEnd w:id="36"/>
+    <w:bookmarkStart w:id="37" w:name="Xd979bbb935ec2154d49de8f14f78dcb3ac81be6"/>
     <w:p>
       <w:pPr>
         <w:pStyle w:val="Heading2"/>
@@ -3035,8 +3054,8 @@
       </w:r>
       <w:r>
         <w:rPr>
-          <w:b/>
-          <w:bCs/>
+          <w:bCs/>
+          <w:b/>
         </w:rPr>
         <w:t xml:space="preserve">100 Hz timer tick</w:t>
       </w:r>
@@ -3057,8 +3076,8 @@
       </w:r>
       <w:r>
         <w:rPr>
-          <w:b/>
-          <w:bCs/>
+          <w:bCs/>
+          <w:b/>
         </w:rPr>
         <w:t xml:space="preserve">preempts the application</w:t>
       </w:r>
@@ -3143,8 +3162,8 @@
       </w:r>
       <w:r>
         <w:rPr>
-          <w:b/>
-          <w:bCs/>
+          <w:bCs/>
+          <w:b/>
         </w:rPr>
         <w:t xml:space="preserve">application code</w:t>
       </w:r>
@@ -3180,8 +3199,8 @@
       </w:r>
       <w:r>
         <w:rPr>
-          <w:b/>
-          <w:bCs/>
+          <w:bCs/>
+          <w:b/>
         </w:rPr>
         <w:t xml:space="preserve">kernel is non-preemptive</w:t>
       </w:r>
@@ -3205,8 +3224,8 @@
       </w:r>
       <w:r>
         <w:rPr>
-          <w:b/>
-          <w:bCs/>
+          <w:bCs/>
+          <w:b/>
         </w:rPr>
         <w:t xml:space="preserve">voluntarily</w:t>
       </w:r>
@@ -3270,7 +3289,7 @@
       <w:r>
         <w:t xml:space="preserve"> </w:t>
       </w:r>
-      <w:hyperlink r:id="rId24">
+      <w:hyperlink r:id="rId26">
         <w:r>
           <w:rPr>
             <w:rStyle w:val="Hyperlink"/>
@@ -3297,8 +3316,8 @@
       </w:r>
       <w:r>
         <w:rPr>
-          <w:b/>
-          <w:bCs/>
+          <w:bCs/>
+          <w:b/>
         </w:rPr>
         <w:t xml:space="preserve">threads</w:t>
       </w:r>
@@ -3327,8 +3346,8 @@
         <w:t xml:space="preserve">kills them all. The scheduler's task list has no fixed limit.</w:t>
       </w:r>
     </w:p>
-    <w:bookmarkEnd w:id="35"/>
-    <w:bookmarkStart w:id="37" w:name="Xd53f7f34704294b1d13f3b775edea3ef231f3a2"/>
+    <w:bookmarkEnd w:id="37"/>
+    <w:bookmarkStart w:id="39" w:name="Xd53f7f34704294b1d13f3b775edea3ef231f3a2"/>
     <w:p>
       <w:pPr>
         <w:pStyle w:val="Heading2"/>
@@ -3339,16 +3358,16 @@
     </w:p>
     <w:p>
       <w:pPr>
-        <w:pStyle w:val="Compact"/>
         <w:numPr>
           <w:ilvl w:val="0"/>
           <w:numId w:val="1003"/>
         </w:numPr>
-      </w:pPr>
-      <w:r>
-        <w:rPr>
-          <w:b/>
-          <w:bCs/>
+        <w:pStyle w:val="Compact"/>
+      </w:pPr>
+      <w:r>
+        <w:rPr>
+          <w:bCs/>
+          <w:b/>
         </w:rPr>
         <w:t xml:space="preserve">Raspberry Pi 4</w:t>
       </w:r>
@@ -3361,16 +3380,16 @@
     </w:p>
     <w:p>
       <w:pPr>
-        <w:pStyle w:val="Compact"/>
         <w:numPr>
           <w:ilvl w:val="0"/>
           <w:numId w:val="1003"/>
         </w:numPr>
-      </w:pPr>
-      <w:r>
-        <w:rPr>
-          <w:b/>
-          <w:bCs/>
+        <w:pStyle w:val="Compact"/>
+      </w:pPr>
+      <w:r>
+        <w:rPr>
+          <w:bCs/>
+          <w:b/>
         </w:rPr>
         <w:t xml:space="preserve">HDMI</w:t>
       </w:r>
@@ -3383,16 +3402,16 @@
     </w:p>
     <w:p>
       <w:pPr>
-        <w:pStyle w:val="Compact"/>
         <w:numPr>
           <w:ilvl w:val="0"/>
           <w:numId w:val="1003"/>
         </w:numPr>
-      </w:pPr>
-      <w:r>
-        <w:rPr>
-          <w:b/>
-          <w:bCs/>
+        <w:pStyle w:val="Compact"/>
+      </w:pPr>
+      <w:r>
+        <w:rPr>
+          <w:bCs/>
+          <w:b/>
         </w:rPr>
         <w:t xml:space="preserve">USB keyboard + mouse</w:t>
       </w:r>
@@ -3402,11 +3421,11 @@
     </w:p>
     <w:p>
       <w:pPr>
-        <w:pStyle w:val="Compact"/>
         <w:numPr>
           <w:ilvl w:val="0"/>
           <w:numId w:val="1003"/>
         </w:numPr>
+        <w:pStyle w:val="Compact"/>
       </w:pPr>
       <w:r>
         <w:t xml:space="preserve">Optional</w:t>
@@ -3416,8 +3435,8 @@
       </w:r>
       <w:r>
         <w:rPr>
-          <w:b/>
-          <w:bCs/>
+          <w:bCs/>
+          <w:b/>
         </w:rPr>
         <w:t xml:space="preserve">serial console</w:t>
       </w:r>
@@ -3436,16 +3455,16 @@
     </w:p>
     <w:p>
       <w:pPr>
-        <w:pStyle w:val="Compact"/>
         <w:numPr>
           <w:ilvl w:val="0"/>
           <w:numId w:val="1003"/>
         </w:numPr>
-      </w:pPr>
-      <w:r>
-        <w:rPr>
-          <w:b/>
-          <w:bCs/>
+        <w:pStyle w:val="Compact"/>
+      </w:pPr>
+      <w:r>
+        <w:rPr>
+          <w:bCs/>
+          <w:b/>
         </w:rPr>
         <w:t xml:space="preserve">The four cores, used asymmetrically by design</w:t>
       </w:r>
@@ -3460,8 +3479,8 @@
       </w:r>
       <w:r>
         <w:rPr>
-          <w:b/>
-          <w:bCs/>
+          <w:bCs/>
+          <w:b/>
         </w:rPr>
         <w:t xml:space="preserve">core 0</w:t>
       </w:r>
@@ -3476,8 +3495,8 @@
       </w:r>
       <w:r>
         <w:rPr>
-          <w:b/>
-          <w:bCs/>
+          <w:bCs/>
+          <w:b/>
         </w:rPr>
         <w:t xml:space="preserve">core 1</w:t>
       </w:r>
@@ -3498,8 +3517,8 @@
       </w:r>
       <w:r>
         <w:rPr>
-          <w:b/>
-          <w:bCs/>
+          <w:bCs/>
+          <w:b/>
         </w:rPr>
         <w:t xml:space="preserve">cores 2 and 3</w:t>
       </w:r>
@@ -3514,8 +3533,8 @@
       </w:r>
       <w:r>
         <w:rPr>
-          <w:b/>
-          <w:bCs/>
+          <w:bCs/>
+          <w:b/>
         </w:rPr>
         <w:t xml:space="preserve">app cores</w:t>
       </w:r>
@@ -3542,8 +3561,8 @@
       </w:r>
       <w:r>
         <w:rPr>
-          <w:b/>
-          <w:bCs/>
+          <w:bCs/>
+          <w:b/>
         </w:rPr>
         <w:t xml:space="preserve">core 3</w:t>
       </w:r>
@@ -3562,11 +3581,11 @@
     </w:p>
     <w:p>
       <w:pPr>
-        <w:pStyle w:val="Compact"/>
         <w:numPr>
           <w:ilvl w:val="0"/>
           <w:numId w:val="1003"/>
         </w:numPr>
+        <w:pStyle w:val="Compact"/>
       </w:pPr>
       <w:r>
         <w:t xml:space="preserve">The RPi 5 is not supported yet (I/O behind the RP1 chip via PCIe — heavier bring-up;</w:t>
@@ -3580,7 +3599,7 @@
       <w:r>
         <w:t xml:space="preserve"> </w:t>
       </w:r>
-      <w:hyperlink r:id="rId36">
+      <w:hyperlink r:id="rId38">
         <w:r>
           <w:rPr>
             <w:rStyle w:val="Hyperlink"/>
@@ -3592,8 +3611,8 @@
         <w:t xml:space="preserve">).</w:t>
       </w:r>
     </w:p>
-    <w:bookmarkEnd w:id="37"/>
-    <w:bookmarkStart w:id="38" w:name="Xaeb7f2a1a29ce6f3d3f3f6655afd64b5919cb4f"/>
+    <w:bookmarkEnd w:id="39"/>
+    <w:bookmarkStart w:id="40" w:name="Xaeb7f2a1a29ce6f3d3f3f6655afd64b5919cb4f"/>
     <w:p>
       <w:pPr>
         <w:pStyle w:val="Heading2"/>
@@ -3718,8 +3737,8 @@
       </w:pPr>
       <w:r>
         <w:rPr>
-          <w:b/>
-          <w:bCs/>
+          <w:bCs/>
+          <w:b/>
         </w:rPr>
         <w:t xml:space="preserve">Legacy docs.</w:t>
       </w:r>
@@ -3750,22 +3769,22 @@
       <w:r>
         <w:rPr>
           <w:rStyle w:val="VerbatimChar"/>
-          <w:b/>
-          <w:bCs/>
+          <w:bCs/>
+          <w:b/>
         </w:rPr>
         <w:t xml:space="preserve">docs/</w:t>
       </w:r>
       <w:r>
         <w:rPr>
-          <w:b/>
-          <w:bCs/>
-        </w:rPr>
-        <w:t xml:space="preserve"> </w:t>
-      </w:r>
-      <w:r>
-        <w:rPr>
-          <w:b/>
-          <w:bCs/>
+          <w:bCs/>
+          <w:b/>
+        </w:rPr>
+        <w:t xml:space="preserve"> </w:t>
+      </w:r>
+      <w:r>
+        <w:rPr>
+          <w:bCs/>
+          <w:b/>
         </w:rPr>
         <w:t xml:space="preserve">is authoritative</w:t>
       </w:r>
@@ -3783,8 +3802,8 @@
       </w:r>
       <w:r>
         <w:rPr>
+          <w:iCs/>
           <w:i/>
-          <w:iCs/>
         </w:rPr>
         <w:t xml:space="preserve">why</w:t>
       </w:r>
@@ -3801,8 +3820,8 @@
         <w:t xml:space="preserve">EL1) was chosen; apps run at EL0 since kapi v74 (§5).</w:t>
       </w:r>
     </w:p>
-    <w:bookmarkEnd w:id="38"/>
-    <w:bookmarkStart w:id="42" w:name="X647cdcd38a19e7cb40f403bab2abebd96e480e2"/>
+    <w:bookmarkEnd w:id="40"/>
+    <w:bookmarkStart w:id="44" w:name="X647cdcd38a19e7cb40f403bab2abebd96e480e2"/>
     <w:p>
       <w:pPr>
         <w:pStyle w:val="Heading2"/>
@@ -3816,6 +3835,7 @@
         <w:tblStyle w:val="Table"/>
         <w:tblW w:type="auto" w:w="0"/>
         <w:tblLook w:firstRow="1" w:lastRow="0" w:firstColumn="0" w:lastColumn="0" w:noHBand="0" w:noVBand="0" w:val="0020"/>
+        <w:jc w:val="start"/>
       </w:tblPr>
       <w:tblGrid>
         <w:gridCol w:w="2640"/>
@@ -3824,13 +3844,14 @@
       </w:tblGrid>
       <w:tr>
         <w:trPr>
-          <w:tblHeader w:val="on"/>
+          <w:tblHeader w:val="true"/>
         </w:trPr>
         <w:tc>
           <w:tcPr/>
           <w:p>
             <w:pPr>
               <w:pStyle w:val="Compact"/>
+              <w:jc w:val="left"/>
             </w:pPr>
             <w:r>
               <w:t xml:space="preserve">Document</w:t>
@@ -3842,6 +3863,7 @@
           <w:p>
             <w:pPr>
               <w:pStyle w:val="Compact"/>
+              <w:jc w:val="left"/>
             </w:pPr>
             <w:r>
               <w:t xml:space="preserve">For whom</w:t>
@@ -3853,6 +3875,7 @@
           <w:p>
             <w:pPr>
               <w:pStyle w:val="Compact"/>
+              <w:jc w:val="left"/>
             </w:pPr>
             <w:r>
               <w:t xml:space="preserve">Contents</w:t>
@@ -3866,13 +3889,14 @@
           <w:p>
             <w:pPr>
               <w:pStyle w:val="Compact"/>
+              <w:jc w:val="left"/>
             </w:pPr>
-            <w:hyperlink r:id="rId24">
+            <w:hyperlink r:id="rId26">
               <w:r>
                 <w:rPr>
                   <w:rStyle w:val="Hyperlink"/>
+                  <w:bCs/>
                   <w:b/>
-                  <w:bCs/>
                 </w:rPr>
                 <w:t xml:space="preserve">02 — Kernel Internals</w:t>
               </w:r>
@@ -3884,6 +3908,7 @@
           <w:p>
             <w:pPr>
               <w:pStyle w:val="Compact"/>
+              <w:jc w:val="left"/>
             </w:pPr>
             <w:r>
               <w:t xml:space="preserve">anyone who wants to understand the kernel</w:t>
@@ -3895,6 +3920,7 @@
           <w:p>
             <w:pPr>
               <w:pStyle w:val="Compact"/>
+              <w:jc w:val="left"/>
             </w:pPr>
             <w:r>
               <w:t xml:space="preserve">boot, memory/MMU, scheduling, exceptions, ABI, GUI, streams</w:t>
@@ -3908,13 +3934,14 @@
           <w:p>
             <w:pPr>
               <w:pStyle w:val="Compact"/>
+              <w:jc w:val="left"/>
             </w:pPr>
-            <w:hyperlink r:id="rId39">
+            <w:hyperlink r:id="rId41">
               <w:r>
                 <w:rPr>
                   <w:rStyle w:val="Hyperlink"/>
+                  <w:bCs/>
                   <w:b/>
-                  <w:bCs/>
                 </w:rPr>
                 <w:t xml:space="preserve">03 — Developer Guide</w:t>
               </w:r>
@@ -3926,6 +3953,7 @@
           <w:p>
             <w:pPr>
               <w:pStyle w:val="Compact"/>
+              <w:jc w:val="left"/>
             </w:pPr>
             <w:r>
               <w:t xml:space="preserve">anyone who wants to build/compile/extend</w:t>
@@ -3937,6 +3965,7 @@
           <w:p>
             <w:pPr>
               <w:pStyle w:val="Compact"/>
+              <w:jc w:val="left"/>
             </w:pPr>
             <w:r>
               <w:t xml:space="preserve">toolchain, build, app model, extending the ABI, conventions, debugging</w:t>
@@ -3950,13 +3979,14 @@
           <w:p>
             <w:pPr>
               <w:pStyle w:val="Compact"/>
+              <w:jc w:val="left"/>
             </w:pPr>
-            <w:hyperlink r:id="rId27">
+            <w:hyperlink r:id="rId29">
               <w:r>
                 <w:rPr>
                   <w:rStyle w:val="Hyperlink"/>
+                  <w:bCs/>
                   <w:b/>
-                  <w:bCs/>
                 </w:rPr>
                 <w:t xml:space="preserve">04 — User Guide</w:t>
               </w:r>
@@ -3968,6 +3998,7 @@
           <w:p>
             <w:pPr>
               <w:pStyle w:val="Compact"/>
+              <w:jc w:val="left"/>
             </w:pPr>
             <w:r>
               <w:t xml:space="preserve">anyone who wants to use it</w:t>
@@ -3979,6 +4010,7 @@
           <w:p>
             <w:pPr>
               <w:pStyle w:val="Compact"/>
+              <w:jc w:val="left"/>
             </w:pPr>
             <w:r>
               <w:t xml:space="preserve">SD card, desktop, terminal, files, applications, customization</w:t>
@@ -3992,13 +4024,14 @@
           <w:p>
             <w:pPr>
               <w:pStyle w:val="Compact"/>
+              <w:jc w:val="left"/>
             </w:pPr>
-            <w:hyperlink r:id="rId26">
+            <w:hyperlink r:id="rId28">
               <w:r>
                 <w:rPr>
                   <w:rStyle w:val="Hyperlink"/>
+                  <w:bCs/>
                   <w:b/>
-                  <w:bCs/>
                 </w:rPr>
                 <w:t xml:space="preserve">06 — The kits</w:t>
               </w:r>
@@ -4010,6 +4043,7 @@
           <w:p>
             <w:pPr>
               <w:pStyle w:val="Compact"/>
+              <w:jc w:val="left"/>
             </w:pPr>
             <w:r>
               <w:t xml:space="preserve">anyone writing a program</w:t>
@@ -4021,6 +4055,7 @@
           <w:p>
             <w:pPr>
               <w:pStyle w:val="Compact"/>
+              <w:jc w:val="left"/>
             </w:pPr>
             <w:r>
               <w:t xml:space="preserve">one kit per domain, how a program uses them (their references: 10 to 19)</w:t>
@@ -4034,8 +4069,9 @@
           <w:p>
             <w:pPr>
               <w:pStyle w:val="Compact"/>
+              <w:jc w:val="left"/>
             </w:pPr>
-            <w:hyperlink r:id="rId40">
+            <w:hyperlink r:id="rId42">
               <w:r>
                 <w:rPr>
                   <w:rStyle w:val="Hyperlink"/>
@@ -4050,6 +4086,7 @@
           <w:p>
             <w:pPr>
               <w:pStyle w:val="Compact"/>
+              <w:jc w:val="left"/>
             </w:pPr>
             <w:r>
               <w:t xml:space="preserve">anyone touching</w:t>
@@ -4070,6 +4107,7 @@
           <w:p>
             <w:pPr>
               <w:pStyle w:val="Compact"/>
+              <w:jc w:val="left"/>
             </w:pPr>
             <w:r>
               <w:t xml:space="preserve">the patches of our Circle fork vs upstream</w:t>
@@ -4092,8 +4130,9 @@
           <w:p>
             <w:pPr>
               <w:pStyle w:val="Compact"/>
+              <w:jc w:val="left"/>
             </w:pPr>
-            <w:hyperlink r:id="rId30">
+            <w:hyperlink r:id="rId32">
               <w:r>
                 <w:rPr>
                   <w:rStyle w:val="Hyperlink"/>
@@ -4108,6 +4147,7 @@
           <w:p>
             <w:pPr>
               <w:pStyle w:val="Compact"/>
+              <w:jc w:val="left"/>
             </w:pPr>
             <w:r>
               <w:t xml:space="preserve">the browser</w:t>
@@ -4119,6 +4159,7 @@
           <w:p>
             <w:pPr>
               <w:pStyle w:val="Compact"/>
+              <w:jc w:val="left"/>
             </w:pPr>
             <w:r>
               <w:t xml:space="preserve">the port of WebKit to Onyx: its status, the patch series, how to build</w:t>
@@ -4132,8 +4173,9 @@
           <w:p>
             <w:pPr>
               <w:pStyle w:val="Compact"/>
+              <w:jc w:val="left"/>
             </w:pPr>
-            <w:hyperlink r:id="rId33">
+            <w:hyperlink r:id="rId35">
               <w:r>
                 <w:rPr>
                   <w:rStyle w:val="Hyperlink"/>
@@ -4148,6 +4190,7 @@
           <w:p>
             <w:pPr>
               <w:pStyle w:val="Compact"/>
+              <w:jc w:val="left"/>
             </w:pPr>
             <w:r>
               <w:t xml:space="preserve">the execution model</w:t>
@@ -4159,6 +4202,7 @@
           <w:p>
             <w:pPr>
               <w:pStyle w:val="Compact"/>
+              <w:jc w:val="left"/>
             </w:pPr>
             <w:r>
               <w:t xml:space="preserve">how apps moved to EL0, the design</w:t>
@@ -4172,8 +4216,9 @@
           <w:p>
             <w:pPr>
               <w:pStyle w:val="Compact"/>
+              <w:jc w:val="left"/>
             </w:pPr>
-            <w:hyperlink r:id="rId19">
+            <w:hyperlink r:id="rId21">
               <w:r>
                 <w:rPr>
                   <w:rStyle w:val="Hyperlink"/>
@@ -4188,6 +4233,7 @@
           <w:p>
             <w:pPr>
               <w:pStyle w:val="Compact"/>
+              <w:jc w:val="left"/>
             </w:pPr>
             <w:r>
               <w:t xml:space="preserve">distributors</w:t>
@@ -4199,6 +4245,7 @@
           <w:p>
             <w:pPr>
               <w:pStyle w:val="Compact"/>
+              <w:jc w:val="left"/>
             </w:pPr>
             <w:r>
               <w:t xml:space="preserve">the licences of everything Onyx contains</w:t>
@@ -4212,8 +4259,9 @@
           <w:p>
             <w:pPr>
               <w:pStyle w:val="Compact"/>
+              <w:jc w:val="left"/>
             </w:pPr>
-            <w:hyperlink r:id="rId41">
+            <w:hyperlink r:id="rId43">
               <w:r>
                 <w:rPr>
                   <w:rStyle w:val="Hyperlink"/>
@@ -4228,6 +4276,7 @@
           <w:p>
             <w:pPr>
               <w:pStyle w:val="Compact"/>
+              <w:jc w:val="left"/>
             </w:pPr>
             <w:r>
               <w:t xml:space="preserve">the next session</w:t>
@@ -4239,6 +4288,7 @@
           <w:p>
             <w:pPr>
               <w:pStyle w:val="Compact"/>
+              <w:jc w:val="left"/>
             </w:pPr>
             <w:r>
               <w:t xml:space="preserve">where the work stands, the next tasks</w:t>
@@ -4247,8 +4297,8 @@
         </w:tc>
       </w:tr>
     </w:tbl>
-    <w:bookmarkEnd w:id="42"/>
-    <w:bookmarkStart w:id="43" w:name="Xb3ffec909c2b52aab1f5b06d59da0ddab14a9e8"/>
+    <w:bookmarkEnd w:id="44"/>
+    <w:bookmarkStart w:id="45" w:name="Xb3ffec909c2b52aab1f5b06d59da0ddab14a9e8"/>
     <w:p>
       <w:pPr>
         <w:pStyle w:val="Heading2"/>
@@ -4259,11 +4309,11 @@
     </w:p>
     <w:p>
       <w:pPr>
-        <w:pStyle w:val="Compact"/>
         <w:numPr>
           <w:ilvl w:val="0"/>
           <w:numId w:val="1004"/>
         </w:numPr>
+        <w:pStyle w:val="Compact"/>
       </w:pPr>
       <w:r>
         <w:t xml:space="preserve">Taking control of</w:t>
@@ -4298,11 +4348,11 @@
     </w:p>
     <w:p>
       <w:pPr>
-        <w:pStyle w:val="Compact"/>
         <w:numPr>
           <w:ilvl w:val="0"/>
           <w:numId w:val="1004"/>
         </w:numPr>
+        <w:pStyle w:val="Compact"/>
       </w:pPr>
       <w:r>
         <w:t xml:space="preserve">Replacement scheduler ("shadow" header for</w:t>
@@ -4322,11 +4372,11 @@
     </w:p>
     <w:p>
       <w:pPr>
-        <w:pStyle w:val="Compact"/>
         <w:numPr>
           <w:ilvl w:val="0"/>
           <w:numId w:val="1004"/>
         </w:numPr>
+        <w:pStyle w:val="Compact"/>
       </w:pPr>
       <w:r>
         <w:rPr>
@@ -4343,11 +4393,11 @@
     </w:p>
     <w:p>
       <w:pPr>
-        <w:pStyle w:val="Compact"/>
         <w:numPr>
           <w:ilvl w:val="0"/>
           <w:numId w:val="1004"/>
         </w:numPr>
+        <w:pStyle w:val="Compact"/>
       </w:pPr>
       <w:r>
         <w:t xml:space="preserve">Per-process page tables (</w:t>
@@ -4364,11 +4414,11 @@
     </w:p>
     <w:p>
       <w:pPr>
-        <w:pStyle w:val="Compact"/>
         <w:numPr>
           <w:ilvl w:val="0"/>
           <w:numId w:val="1004"/>
         </w:numPr>
+        <w:pStyle w:val="Compact"/>
       </w:pPr>
       <w:r>
         <w:t xml:space="preserve">ELF64 loader → process.</w:t>
@@ -4376,11 +4426,11 @@
     </w:p>
     <w:p>
       <w:pPr>
-        <w:pStyle w:val="Compact"/>
         <w:numPr>
           <w:ilvl w:val="0"/>
           <w:numId w:val="1004"/>
         </w:numPr>
+        <w:pStyle w:val="Compact"/>
       </w:pPr>
       <w:r>
         <w:t xml:space="preserve">Framebuffer (</w:t>
@@ -4430,11 +4480,11 @@
     </w:p>
     <w:p>
       <w:pPr>
-        <w:pStyle w:val="Compact"/>
         <w:numPr>
           <w:ilvl w:val="0"/>
           <w:numId w:val="1004"/>
         </w:numPr>
+        <w:pStyle w:val="Compact"/>
       </w:pPr>
       <w:r>
         <w:t xml:space="preserve">Compositor + window manager; two animated demos running simultaneously.</w:t>
@@ -4442,16 +4492,16 @@
     </w:p>
     <w:p>
       <w:pPr>
-        <w:pStyle w:val="Compact"/>
         <w:numPr>
           <w:ilvl w:val="0"/>
           <w:numId w:val="1004"/>
         </w:numPr>
-      </w:pPr>
-      <w:r>
-        <w:rPr>
-          <w:b/>
-          <w:bCs/>
+        <w:pStyle w:val="Compact"/>
+      </w:pPr>
+      <w:r>
+        <w:rPr>
+          <w:bCs/>
+          <w:b/>
         </w:rPr>
         <w:t xml:space="preserve">Switch to Option C</w:t>
       </w:r>
@@ -4466,8 +4516,8 @@
       </w:r>
       <w:r>
         <w:rPr>
-          <w:b/>
-          <w:bCs/>
+          <w:bCs/>
+          <w:b/>
         </w:rPr>
         <w:t xml:space="preserve">fixed-table ABI</w:t>
       </w:r>
@@ -4477,11 +4527,11 @@
     </w:p>
     <w:p>
       <w:pPr>
-        <w:pStyle w:val="Compact"/>
         <w:numPr>
           <w:ilvl w:val="0"/>
           <w:numId w:val="1004"/>
         </w:numPr>
+        <w:pStyle w:val="Compact"/>
       </w:pPr>
       <w:r>
         <w:t xml:space="preserve">Onyx desktop (panel + applist), stream/stdio subsystem, terminal +</w:t>
@@ -4507,11 +4557,11 @@
     </w:p>
     <w:p>
       <w:pPr>
-        <w:pStyle w:val="Compact"/>
         <w:numPr>
           <w:ilvl w:val="0"/>
           <w:numId w:val="1004"/>
         </w:numPr>
+        <w:pStyle w:val="Compact"/>
       </w:pPr>
       <w:r>
         <w:t xml:space="preserve">Modal dialogs, themes, app-drawn wallpaper, PID management, keyboard layouts,</w:t>
@@ -4525,11 +4575,11 @@
     </w:p>
     <w:p>
       <w:pPr>
-        <w:pStyle w:val="Compact"/>
         <w:numPr>
           <w:ilvl w:val="0"/>
           <w:numId w:val="1004"/>
         </w:numPr>
+        <w:pStyle w:val="Compact"/>
       </w:pPr>
       <w:r>
         <w:t xml:space="preserve">Networking: WLAN bring-up + TCP/IP on the primary core, TCP socket calls</w:t>
@@ -4558,11 +4608,11 @@
     </w:p>
     <w:p>
       <w:pPr>
-        <w:pStyle w:val="Compact"/>
         <w:numPr>
           <w:ilvl w:val="0"/>
           <w:numId w:val="1004"/>
         </w:numPr>
+        <w:pStyle w:val="Compact"/>
       </w:pPr>
       <w:r>
         <w:t xml:space="preserve">The modernised CDE desktop (v64: menu bar, dock, workspaces), the uikit toolkit; the</w:t>
@@ -4603,16 +4653,16 @@
     </w:p>
     <w:p>
       <w:pPr>
-        <w:pStyle w:val="Compact"/>
         <w:numPr>
           <w:ilvl w:val="0"/>
           <w:numId w:val="1004"/>
         </w:numPr>
-      </w:pPr>
-      <w:r>
-        <w:rPr>
-          <w:b/>
-          <w:bCs/>
+        <w:pStyle w:val="Compact"/>
+      </w:pPr>
+      <w:r>
+        <w:rPr>
+          <w:bCs/>
+          <w:b/>
         </w:rPr>
         <w:t xml:space="preserve">Every app at EL0</w:t>
       </w:r>
@@ -4631,16 +4681,16 @@
     </w:p>
     <w:p>
       <w:pPr>
-        <w:pStyle w:val="Compact"/>
         <w:numPr>
           <w:ilvl w:val="0"/>
           <w:numId w:val="1004"/>
         </w:numPr>
-      </w:pPr>
-      <w:r>
-        <w:rPr>
-          <w:b/>
-          <w:bCs/>
+        <w:pStyle w:val="Compact"/>
+      </w:pPr>
+      <w:r>
+        <w:rPr>
+          <w:bCs/>
+          <w:b/>
         </w:rPr>
         <w:t xml:space="preserve">Demand paging</w:t>
       </w:r>
@@ -4655,8 +4705,8 @@
       </w:r>
       <w:r>
         <w:rPr>
-          <w:b/>
-          <w:bCs/>
+          <w:bCs/>
+          <w:b/>
         </w:rPr>
         <w:t xml:space="preserve">shared libraries</w:t>
       </w:r>
@@ -4671,8 +4721,8 @@
       </w:r>
       <w:r>
         <w:rPr>
-          <w:b/>
-          <w:bCs/>
+          <w:bCs/>
+          <w:b/>
         </w:rPr>
         <w:t xml:space="preserve">kits</w:t>
       </w:r>
@@ -4693,8 +4743,8 @@
       </w:r>
       <w:r>
         <w:rPr>
-          <w:b/>
-          <w:bCs/>
+          <w:bCs/>
+          <w:b/>
         </w:rPr>
         <w:t xml:space="preserve">Elegant</w:t>
       </w:r>
@@ -4710,16 +4760,16 @@
     </w:p>
     <w:p>
       <w:pPr>
-        <w:pStyle w:val="Compact"/>
         <w:numPr>
           <w:ilvl w:val="0"/>
           <w:numId w:val="1004"/>
         </w:numPr>
-      </w:pPr>
-      <w:r>
-        <w:rPr>
-          <w:b/>
-          <w:bCs/>
+        <w:pStyle w:val="Compact"/>
+      </w:pPr>
+      <w:r>
+        <w:rPr>
+          <w:bCs/>
+          <w:b/>
         </w:rPr>
         <w:t xml:space="preserve">PocketUI</w:t>
       </w:r>
@@ -4736,8 +4786,8 @@
         <w:t xml:space="preserve">apps in all three.</w:t>
       </w:r>
     </w:p>
-    <w:bookmarkEnd w:id="43"/>
-    <w:bookmarkStart w:id="46" w:name="X29842c42cadd97bf2b875ac65d2a73721b4de86"/>
+    <w:bookmarkEnd w:id="45"/>
+    <w:bookmarkStart w:id="48" w:name="X29842c42cadd97bf2b875ac65d2a73721b4de86"/>
     <w:p>
       <w:pPr>
         <w:pStyle w:val="Heading2"/>
@@ -4752,22 +4802,22 @@
       </w:pPr>
       <w:r>
         <w:rPr>
+          <w:iCs/>
           <w:i/>
+        </w:rPr>
+        <w:t xml:space="preserve">Written on 2026-10-09. A comparison of designs and of what each system offers — nothing here was</w:t>
+      </w:r>
+      <w:r>
+        <w:rPr>
           <w:iCs/>
-        </w:rPr>
-        <w:t xml:space="preserve">Written on 2026-10-09. A comparison of designs and of what each system offers — nothing here was</w:t>
-      </w:r>
-      <w:r>
-        <w:rPr>
           <w:i/>
+        </w:rPr>
+        <w:t xml:space="preserve"> </w:t>
+      </w:r>
+      <w:r>
+        <w:rPr>
           <w:iCs/>
-        </w:rPr>
-        <w:t xml:space="preserve"> </w:t>
-      </w:r>
-      <w:r>
-        <w:rPr>
           <w:i/>
-          <w:iCs/>
         </w:rPr>
         <w:t xml:space="preserve">measured, and the other systems move: check their own sites.</w:t>
       </w:r>
@@ -4778,8 +4828,8 @@
       </w:pPr>
       <w:r>
         <w:rPr>
-          <w:b/>
-          <w:bCs/>
+          <w:bCs/>
+          <w:b/>
         </w:rPr>
         <w:t xml:space="preserve">What Onyx is for.</w:t>
       </w:r>
@@ -4813,6 +4863,7 @@
         <w:tblStyle w:val="Table"/>
         <w:tblW w:type="auto" w:w="0"/>
         <w:tblLook w:firstRow="1" w:lastRow="0" w:firstColumn="0" w:lastColumn="0" w:noHBand="0" w:noVBand="0" w:val="0020"/>
+        <w:jc w:val="start"/>
       </w:tblPr>
       <w:tblGrid>
         <w:gridCol w:w="2640"/>
@@ -4821,13 +4872,14 @@
       </w:tblGrid>
       <w:tr>
         <w:trPr>
-          <w:tblHeader w:val="on"/>
+          <w:tblHeader w:val="true"/>
         </w:trPr>
         <w:tc>
           <w:tcPr/>
           <w:p>
             <w:pPr>
               <w:pStyle w:val="Compact"/>
+              <w:jc w:val="left"/>
             </w:pPr>
             <w:r>
               <w:t xml:space="preserve">System</w:t>
@@ -4839,6 +4891,7 @@
           <w:p>
             <w:pPr>
               <w:pStyle w:val="Compact"/>
+              <w:jc w:val="left"/>
             </w:pPr>
             <w:r>
               <w:t xml:space="preserve">What it is</w:t>
@@ -4850,6 +4903,7 @@
           <w:p>
             <w:pPr>
               <w:pStyle w:val="Compact"/>
+              <w:jc w:val="left"/>
             </w:pPr>
             <w:r>
               <w:t xml:space="preserve">Beside it, Onyx…</w:t>
@@ -4863,11 +4917,12 @@
           <w:p>
             <w:pPr>
               <w:pStyle w:val="Compact"/>
+              <w:jc w:val="left"/>
             </w:pPr>
             <w:r>
               <w:rPr>
+                <w:bCs/>
                 <w:b/>
-                <w:bCs/>
               </w:rPr>
               <w:t xml:space="preserve">Raspberry Pi OS</w:t>
             </w:r>
@@ -4881,6 +4936,7 @@
           <w:p>
             <w:pPr>
               <w:pStyle w:val="Compact"/>
+              <w:jc w:val="left"/>
             </w:pPr>
             <w:r>
               <w:t xml:space="preserve">a complete general-purpose system, every Pi, tens of thousands of packages</w:t>
@@ -4892,6 +4948,7 @@
           <w:p>
             <w:pPr>
               <w:pStyle w:val="Compact"/>
+              <w:jc w:val="left"/>
             </w:pPr>
             <w:r>
               <w:t xml:space="preserve">is small enough to be read whole, comes with its apps, shares and preloads their images, changes of interface without changing of apps; it has far fewer programs, one board, no symmetric multiprocessing</w:t>
@@ -4905,11 +4962,12 @@
           <w:p>
             <w:pPr>
               <w:pStyle w:val="Compact"/>
+              <w:jc w:val="left"/>
             </w:pPr>
             <w:r>
               <w:rPr>
+                <w:bCs/>
                 <w:b/>
-                <w:bCs/>
               </w:rPr>
               <w:t xml:space="preserve">LibreELEC</w:t>
             </w:r>
@@ -4921,8 +4979,8 @@
             </w:r>
             <w:r>
               <w:rPr>
+                <w:bCs/>
                 <w:b/>
-                <w:bCs/>
               </w:rPr>
               <w:t xml:space="preserve">RetroPie</w:t>
             </w:r>
@@ -4936,6 +4994,7 @@
           <w:p>
             <w:pPr>
               <w:pStyle w:val="Compact"/>
+              <w:jc w:val="left"/>
             </w:pPr>
             <w:r>
               <w:t xml:space="preserve">Linux reduced to one use (a media centre, emulation)</w:t>
@@ -4947,6 +5006,7 @@
           <w:p>
             <w:pPr>
               <w:pStyle w:val="Compact"/>
+              <w:jc w:val="left"/>
             </w:pPr>
             <w:r>
               <w:t xml:space="preserve">has the media player and the emulators</w:t>
@@ -4956,8 +5016,8 @@
             </w:r>
             <w:r>
               <w:rPr>
+                <w:bCs/>
                 <w:b/>
-                <w:bCs/>
               </w:rPr>
               <w:t xml:space="preserve">and</w:t>
             </w:r>
@@ -4976,11 +5036,12 @@
           <w:p>
             <w:pPr>
               <w:pStyle w:val="Compact"/>
+              <w:jc w:val="left"/>
             </w:pPr>
             <w:r>
               <w:rPr>
+                <w:bCs/>
                 <w:b/>
-                <w:bCs/>
               </w:rPr>
               <w:t xml:space="preserve">Android</w:t>
             </w:r>
@@ -4997,6 +5058,7 @@
           <w:p>
             <w:pPr>
               <w:pStyle w:val="Compact"/>
+              <w:jc w:val="left"/>
             </w:pPr>
             <w:r>
               <w:t xml:space="preserve">a touch system with its own vast catalogue of apps</w:t>
@@ -5008,6 +5070,7 @@
           <w:p>
             <w:pPr>
               <w:pStyle w:val="Compact"/>
+              <w:jc w:val="left"/>
             </w:pPr>
             <w:r>
               <w:t xml:space="preserve">has a windowed desktop as well as the pocket mode; no Android app runs on it</w:t>
@@ -5021,11 +5084,12 @@
           <w:p>
             <w:pPr>
               <w:pStyle w:val="Compact"/>
+              <w:jc w:val="left"/>
             </w:pPr>
             <w:r>
               <w:rPr>
+                <w:bCs/>
                 <w:b/>
-                <w:bCs/>
               </w:rPr>
               <w:t xml:space="preserve">RISC OS</w:t>
             </w:r>
@@ -5036,6 +5100,7 @@
           <w:p>
             <w:pPr>
               <w:pStyle w:val="Compact"/>
+              <w:jc w:val="left"/>
             </w:pPr>
             <w:r>
               <w:t xml:space="preserve">Acorn's system: 32-bit, cooperative multitasking, a long-lived catalogue</w:t>
@@ -5047,6 +5112,7 @@
           <w:p>
             <w:pPr>
               <w:pStyle w:val="Compact"/>
+              <w:jc w:val="left"/>
             </w:pPr>
             <w:r>
               <w:t xml:space="preserve">is 64-bit, preemptive, with every app isolated at EL0 (a faulty app is ended, not the machine); RISC OS has decades of software and of users</w:t>
@@ -5060,11 +5126,12 @@
           <w:p>
             <w:pPr>
               <w:pStyle w:val="Compact"/>
+              <w:jc w:val="left"/>
             </w:pPr>
             <w:r>
               <w:rPr>
+                <w:bCs/>
                 <w:b/>
-                <w:bCs/>
               </w:rPr>
               <w:t xml:space="preserve">Haiku</w:t>
             </w:r>
@@ -5076,8 +5143,8 @@
             </w:r>
             <w:r>
               <w:rPr>
+                <w:bCs/>
                 <w:b/>
-                <w:bCs/>
               </w:rPr>
               <w:t xml:space="preserve">Plan 9 / 9front</w:t>
             </w:r>
@@ -5091,6 +5158,7 @@
           <w:p>
             <w:pPr>
               <w:pStyle w:val="Compact"/>
+              <w:jc w:val="left"/>
             </w:pPr>
             <w:r>
               <w:t xml:space="preserve">other independent systems, whose support of the Pi varies</w:t>
@@ -5102,6 +5170,7 @@
           <w:p>
             <w:pPr>
               <w:pStyle w:val="Compact"/>
+              <w:jc w:val="left"/>
             </w:pPr>
             <w:r>
               <w:t xml:space="preserve">was written for the Pi 4, with its GPU, its Wi-Fi and a WebKit browser with the JIT and video; they are self-hosted, the BSDs and Plan 9 multi-user, and all far more tested</w:t>
@@ -5115,11 +5184,12 @@
           <w:p>
             <w:pPr>
               <w:pStyle w:val="Compact"/>
+              <w:jc w:val="left"/>
             </w:pPr>
             <w:r>
               <w:rPr>
+                <w:bCs/>
                 <w:b/>
-                <w:bCs/>
               </w:rPr>
               <w:t xml:space="preserve">Circle</w:t>
             </w:r>
@@ -5133,6 +5203,7 @@
           <w:p>
             <w:pPr>
               <w:pStyle w:val="Compact"/>
+              <w:jc w:val="left"/>
             </w:pPr>
             <w:r>
               <w:t xml:space="preserve">bare-metal frameworks: the application</w:t>
@@ -5142,8 +5213,8 @@
             </w:r>
             <w:r>
               <w:rPr>
+                <w:iCs/>
                 <w:i/>
-                <w:iCs/>
               </w:rPr>
               <w:t xml:space="preserve">is</w:t>
             </w:r>
@@ -5160,6 +5231,7 @@
           <w:p>
             <w:pPr>
               <w:pStyle w:val="Compact"/>
+              <w:jc w:val="left"/>
             </w:pPr>
             <w:r>
               <w:t xml:space="preserve">is an operating system on top of one (Circle): processes, protection, a desktop, packages</w:t>
@@ -5174,24 +5246,24 @@
       </w:pPr>
       <w:r>
         <w:rPr>
-          <w:b/>
-          <w:bCs/>
+          <w:bCs/>
+          <w:b/>
         </w:rPr>
         <w:t xml:space="preserve">What Onyx has that is its own.</w:t>
       </w:r>
     </w:p>
     <w:p>
       <w:pPr>
-        <w:pStyle w:val="Compact"/>
         <w:numPr>
           <w:ilvl w:val="0"/>
           <w:numId w:val="1005"/>
         </w:numPr>
-      </w:pPr>
-      <w:r>
-        <w:rPr>
-          <w:b/>
-          <w:bCs/>
+        <w:pStyle w:val="Compact"/>
+      </w:pPr>
+      <w:r>
+        <w:rPr>
+          <w:bCs/>
+          <w:b/>
         </w:rPr>
         <w:t xml:space="preserve">One binary, three interfaces</w:t>
       </w:r>
@@ -5216,16 +5288,16 @@
     </w:p>
     <w:p>
       <w:pPr>
-        <w:pStyle w:val="Compact"/>
         <w:numPr>
           <w:ilvl w:val="0"/>
           <w:numId w:val="1005"/>
         </w:numPr>
-      </w:pPr>
-      <w:r>
-        <w:rPr>
-          <w:b/>
-          <w:bCs/>
+        <w:pStyle w:val="Compact"/>
+      </w:pPr>
+      <w:r>
+        <w:rPr>
+          <w:bCs/>
+          <w:b/>
         </w:rPr>
         <w:t xml:space="preserve">Images as templates.</w:t>
       </w:r>
@@ -5246,8 +5318,8 @@
       </w:r>
       <w:r>
         <w:rPr>
+          <w:iCs/>
           <w:i/>
-          <w:iCs/>
         </w:rPr>
         <w:t xml:space="preserve">zygote</w:t>
       </w:r>
@@ -5263,16 +5335,16 @@
     </w:p>
     <w:p>
       <w:pPr>
-        <w:pStyle w:val="Compact"/>
         <w:numPr>
           <w:ilvl w:val="0"/>
           <w:numId w:val="1005"/>
         </w:numPr>
-      </w:pPr>
-      <w:r>
-        <w:rPr>
-          <w:b/>
-          <w:bCs/>
+        <w:pStyle w:val="Compact"/>
+      </w:pPr>
+      <w:r>
+        <w:rPr>
+          <w:bCs/>
+          <w:b/>
         </w:rPr>
         <w:t xml:space="preserve">Whole cores for a program.</w:t>
       </w:r>
@@ -5291,16 +5363,16 @@
     </w:p>
     <w:p>
       <w:pPr>
-        <w:pStyle w:val="Compact"/>
         <w:numPr>
           <w:ilvl w:val="0"/>
           <w:numId w:val="1005"/>
         </w:numPr>
-      </w:pPr>
-      <w:r>
-        <w:rPr>
-          <w:b/>
-          <w:bCs/>
+        <w:pStyle w:val="Compact"/>
+      </w:pPr>
+      <w:r>
+        <w:rPr>
+          <w:bCs/>
+          <w:b/>
         </w:rPr>
         <w:t xml:space="preserve">A graphics server that can end.</w:t>
       </w:r>
@@ -5319,16 +5391,16 @@
     </w:p>
     <w:p>
       <w:pPr>
-        <w:pStyle w:val="Compact"/>
         <w:numPr>
           <w:ilvl w:val="0"/>
           <w:numId w:val="1005"/>
         </w:numPr>
-      </w:pPr>
-      <w:r>
-        <w:rPr>
-          <w:b/>
-          <w:bCs/>
+        <w:pStyle w:val="Compact"/>
+      </w:pPr>
+      <w:r>
+        <w:rPr>
+          <w:bCs/>
+          <w:b/>
         </w:rPr>
         <w:t xml:space="preserve">One hand.</w:t>
       </w:r>
@@ -5351,24 +5423,24 @@
       </w:pPr>
       <w:r>
         <w:rPr>
-          <w:b/>
-          <w:bCs/>
+          <w:bCs/>
+          <w:b/>
         </w:rPr>
         <w:t xml:space="preserve">What it does not have — by choice.</w:t>
       </w:r>
     </w:p>
     <w:p>
       <w:pPr>
-        <w:pStyle w:val="Compact"/>
         <w:numPr>
           <w:ilvl w:val="0"/>
           <w:numId w:val="1006"/>
         </w:numPr>
-      </w:pPr>
-      <w:r>
-        <w:rPr>
-          <w:b/>
-          <w:bCs/>
+        <w:pStyle w:val="Compact"/>
+      </w:pPr>
+      <w:r>
+        <w:rPr>
+          <w:bCs/>
+          <w:b/>
         </w:rPr>
         <w:t xml:space="preserve">One user.</w:t>
       </w:r>
@@ -5381,16 +5453,16 @@
     </w:p>
     <w:p>
       <w:pPr>
-        <w:pStyle w:val="Compact"/>
         <w:numPr>
           <w:ilvl w:val="0"/>
           <w:numId w:val="1006"/>
         </w:numPr>
-      </w:pPr>
-      <w:r>
-        <w:rPr>
-          <w:b/>
-          <w:bCs/>
+        <w:pStyle w:val="Compact"/>
+      </w:pPr>
+      <w:r>
+        <w:rPr>
+          <w:bCs/>
+          <w:b/>
         </w:rPr>
         <w:t xml:space="preserve">Cross-developed.</w:t>
       </w:r>
@@ -5403,16 +5475,16 @@
     </w:p>
     <w:p>
       <w:pPr>
-        <w:pStyle w:val="Compact"/>
         <w:numPr>
           <w:ilvl w:val="0"/>
           <w:numId w:val="1006"/>
         </w:numPr>
-      </w:pPr>
-      <w:r>
-        <w:rPr>
-          <w:b/>
-          <w:bCs/>
+        <w:pStyle w:val="Compact"/>
+      </w:pPr>
+      <w:r>
+        <w:rPr>
+          <w:bCs/>
+          <w:b/>
         </w:rPr>
         <w:t xml:space="preserve">Not binary compatible with anything.</w:t>
       </w:r>
@@ -5428,7 +5500,7 @@
       <w:r>
         <w:t xml:space="preserve">from another system (</w:t>
       </w:r>
-      <w:hyperlink r:id="rId44">
+      <w:hyperlink r:id="rId46">
         <w:r>
           <w:rPr>
             <w:rStyle w:val="Hyperlink"/>
@@ -5445,16 +5517,16 @@
     </w:p>
     <w:p>
       <w:pPr>
-        <w:pStyle w:val="Compact"/>
         <w:numPr>
           <w:ilvl w:val="0"/>
           <w:numId w:val="1006"/>
         </w:numPr>
-      </w:pPr>
-      <w:r>
-        <w:rPr>
-          <w:b/>
-          <w:bCs/>
+        <w:pStyle w:val="Compact"/>
+      </w:pPr>
+      <w:r>
+        <w:rPr>
+          <w:bCs/>
+          <w:b/>
         </w:rPr>
         <w:t xml:space="preserve">Asymmetric cores.</w:t>
       </w:r>
@@ -5483,31 +5555,31 @@
       </w:pPr>
       <w:r>
         <w:rPr>
-          <w:b/>
-          <w:bCs/>
+          <w:bCs/>
+          <w:b/>
         </w:rPr>
         <w:t xml:space="preserve">What it does not have — yet, or simply not.</w:t>
       </w:r>
     </w:p>
     <w:p>
       <w:pPr>
-        <w:pStyle w:val="Compact"/>
         <w:numPr>
           <w:ilvl w:val="0"/>
           <w:numId w:val="1007"/>
         </w:numPr>
-      </w:pPr>
-      <w:r>
-        <w:rPr>
-          <w:b/>
-          <w:bCs/>
+        <w:pStyle w:val="Compact"/>
+      </w:pPr>
+      <w:r>
+        <w:rPr>
+          <w:bCs/>
+          <w:b/>
         </w:rPr>
         <w:t xml:space="preserve">Hardware</w:t>
       </w:r>
       <w:r>
         <w:t xml:space="preserve">: the Raspberry Pi 4 and 400 only — the Pi 5 is a plan (</w:t>
       </w:r>
-      <w:hyperlink r:id="rId36">
+      <w:hyperlink r:id="rId38">
         <w:r>
           <w:rPr>
             <w:rStyle w:val="Hyperlink"/>
@@ -5524,7 +5596,7 @@
       <w:r>
         <w:t xml:space="preserve">no Bluetooth (</w:t>
       </w:r>
-      <w:hyperlink r:id="rId45">
+      <w:hyperlink r:id="rId47">
         <w:r>
           <w:rPr>
             <w:rStyle w:val="Hyperlink"/>
@@ -5538,16 +5610,16 @@
     </w:p>
     <w:p>
       <w:pPr>
-        <w:pStyle w:val="Compact"/>
         <w:numPr>
           <w:ilvl w:val="0"/>
           <w:numId w:val="1007"/>
         </w:numPr>
-      </w:pPr>
-      <w:r>
-        <w:rPr>
-          <w:b/>
-          <w:bCs/>
+        <w:pStyle w:val="Compact"/>
+      </w:pPr>
+      <w:r>
+        <w:rPr>
+          <w:bCs/>
+          <w:b/>
         </w:rPr>
         <w:t xml:space="preserve">Security</w:t>
       </w:r>
@@ -5569,16 +5641,16 @@
     </w:p>
     <w:p>
       <w:pPr>
-        <w:pStyle w:val="Compact"/>
         <w:numPr>
           <w:ilvl w:val="0"/>
           <w:numId w:val="1007"/>
         </w:numPr>
-      </w:pPr>
-      <w:r>
-        <w:rPr>
-          <w:b/>
-          <w:bCs/>
+        <w:pStyle w:val="Compact"/>
+      </w:pPr>
+      <w:r>
+        <w:rPr>
+          <w:bCs/>
+          <w:b/>
         </w:rPr>
         <w:t xml:space="preserve">Beyond the ordinary user</w:t>
       </w:r>
@@ -5594,16 +5666,16 @@
     </w:p>
     <w:p>
       <w:pPr>
-        <w:pStyle w:val="Compact"/>
         <w:numPr>
           <w:ilvl w:val="0"/>
           <w:numId w:val="1007"/>
         </w:numPr>
-      </w:pPr>
-      <w:r>
-        <w:rPr>
-          <w:b/>
-          <w:bCs/>
+        <w:pStyle w:val="Compact"/>
+      </w:pPr>
+      <w:r>
+        <w:rPr>
+          <w:bCs/>
+          <w:b/>
         </w:rPr>
         <w:t xml:space="preserve">Maturity</w:t>
       </w:r>
@@ -5619,16 +5691,16 @@
     </w:p>
     <w:p>
       <w:pPr>
-        <w:pStyle w:val="Compact"/>
         <w:numPr>
           <w:ilvl w:val="0"/>
           <w:numId w:val="1007"/>
         </w:numPr>
-      </w:pPr>
-      <w:r>
-        <w:rPr>
-          <w:b/>
-          <w:bCs/>
+        <w:pStyle w:val="Compact"/>
+      </w:pPr>
+      <w:r>
+        <w:rPr>
+          <w:bCs/>
+          <w:b/>
         </w:rPr>
         <w:t xml:space="preserve">Languages</w:t>
       </w:r>
@@ -5636,7 +5708,7 @@
         <w:t xml:space="preserve">: English and French; no screen reader.</w:t>
       </w:r>
     </w:p>
-    <w:bookmarkEnd w:id="46"/>
+    <w:bookmarkEnd w:id="48"/>
     <w:sectPr>
       <w:footerReference r:id="rId9" w:type="default"/>
       <w:footnotePr>
@@ -5718,14 +5790,14 @@
 <file path=word/numbering.xml><?xml version="1.0" encoding="utf-8"?>
 <w:numbering xmlns:w="http://schemas.openxmlformats.org/wordprocessingml/2006/main">
   <w:abstractNum w:abstractNumId="990">
-    <w:nsid w:val="0000A990"/>
+    <w:nsid w:val="A990"/>
     <w:multiLevelType w:val="multilevel"/>
     <w:lvl w:ilvl="0">
       <w:numFmt w:val="bullet"/>
       <w:lvlText w:val=" "/>
       <w:lvlJc w:val="left"/>
       <w:pPr>
-        <w:ind w:left="720" w:hanging="360"/>
+        <w:ind w:left="720" w:hanging="480"/>
       </w:pPr>
     </w:lvl>
     <w:lvl w:ilvl="1">
@@ -5733,7 +5805,7 @@
       <w:lvlText w:val=" "/>
       <w:lvlJc w:val="left"/>
       <w:pPr>
-        <w:ind w:left="1440" w:hanging="360"/>
+        <w:ind w:left="1440" w:hanging="480"/>
       </w:pPr>
     </w:lvl>
     <w:lvl w:ilvl="2">
@@ -5741,7 +5813,7 @@
       <w:lvlText w:val=" "/>
       <w:lvlJc w:val="left"/>
       <w:pPr>
-        <w:ind w:left="2160" w:hanging="360"/>
+        <w:ind w:left="2160" w:hanging="480"/>
       </w:pPr>
     </w:lvl>
     <w:lvl w:ilvl="3">
@@ -5749,7 +5821,7 @@
       <w:lvlText w:val=" "/>
       <w:lvlJc w:val="left"/>
       <w:pPr>
-        <w:ind w:left="2880" w:hanging="360"/>
+        <w:ind w:left="2880" w:hanging="480"/>
       </w:pPr>
     </w:lvl>
     <w:lvl w:ilvl="4">
@@ -5757,7 +5829,7 @@
       <w:lvlText w:val=" "/>
       <w:lvlJc w:val="left"/>
       <w:pPr>
-        <w:ind w:left="3600" w:hanging="360"/>
+        <w:ind w:left="3600" w:hanging="480"/>
       </w:pPr>
     </w:lvl>
     <w:lvl w:ilvl="5">
@@ -5765,7 +5837,7 @@
       <w:lvlText w:val=" "/>
       <w:lvlJc w:val="left"/>
       <w:pPr>
-        <w:ind w:left="4320" w:hanging="360"/>
+        <w:ind w:left="4320" w:hanging="480"/>
       </w:pPr>
     </w:lvl>
     <w:lvl w:ilvl="6">
@@ -5773,7 +5845,7 @@
       <w:lvlText w:val=" "/>
       <w:lvlJc w:val="left"/>
       <w:pPr>
-        <w:ind w:left="5040" w:hanging="360"/>
+        <w:ind w:left="5040" w:hanging="480"/>
       </w:pPr>
     </w:lvl>
     <w:lvl w:ilvl="7">
@@ -5781,7 +5853,7 @@
       <w:lvlText w:val=" "/>
       <w:lvlJc w:val="left"/>
       <w:pPr>
-        <w:ind w:left="5760" w:hanging="360"/>
+        <w:ind w:left="5760" w:hanging="480"/>
       </w:pPr>
     </w:lvl>
     <w:lvl w:ilvl="8">
@@ -5789,115 +5861,88 @@
       <w:lvlText w:val=" "/>
       <w:lvlJc w:val="left"/>
       <w:pPr>
-        <w:ind w:left="6480" w:hanging="360"/>
+        <w:ind w:left="6480" w:hanging="480"/>
       </w:pPr>
     </w:lvl>
   </w:abstractNum>
   <w:abstractNum w:abstractNumId="991">
-    <w:nsid w:val="0000A991"/>
+    <w:nsid w:val="A991"/>
     <w:multiLevelType w:val="multilevel"/>
     <w:lvl w:ilvl="0">
       <w:numFmt w:val="bullet"/>
-      <w:lvlText w:val=""/>
+      <w:lvlText w:val="•"/>
       <w:lvlJc w:val="left"/>
       <w:pPr>
-        <w:ind w:left="720" w:hanging="360"/>
-      </w:pPr>
-      <w:rPr>
-        <w:rFonts w:ascii="Symbol" w:hAnsi="Symbol" w:cs="Symbol" w:hint="default"/>
-      </w:rPr>
+        <w:ind w:left="720" w:hanging="480"/>
+      </w:pPr>
     </w:lvl>
     <w:lvl w:ilvl="1">
       <w:numFmt w:val="bullet"/>
-      <w:lvlText w:val="o"/>
+      <w:lvlText w:val="–"/>
       <w:lvlJc w:val="left"/>
       <w:pPr>
-        <w:ind w:left="1440" w:hanging="360"/>
-      </w:pPr>
-      <w:rPr>
-        <w:rFonts w:ascii="Courier New" w:hAnsi="Courier New" w:cs="Courier New" w:hint="default"/>
-      </w:rPr>
+        <w:ind w:left="1440" w:hanging="480"/>
+      </w:pPr>
     </w:lvl>
     <w:lvl w:ilvl="2">
       <w:numFmt w:val="bullet"/>
-      <w:lvlText w:val=""/>
+      <w:lvlText w:val="•"/>
       <w:lvlJc w:val="left"/>
       <w:pPr>
-        <w:ind w:left="2160" w:hanging="360"/>
-      </w:pPr>
-      <w:rPr>
-        <w:rFonts w:ascii="Wingdings" w:hAnsi="Wingdings" w:cs="Wingdings" w:hint="default"/>
-      </w:rPr>
+        <w:ind w:left="2160" w:hanging="480"/>
+      </w:pPr>
     </w:lvl>
     <w:lvl w:ilvl="3">
       <w:numFmt w:val="bullet"/>
-      <w:lvlText w:val=""/>
+      <w:lvlText w:val="–"/>
       <w:lvlJc w:val="left"/>
       <w:pPr>
-        <w:ind w:left="2880" w:hanging="360"/>
-      </w:pPr>
-      <w:rPr>
-        <w:rFonts w:ascii="Symbol" w:hAnsi="Symbol" w:cs="Symbol" w:hint="default"/>
-      </w:rPr>
+        <w:ind w:left="2880" w:hanging="480"/>
+      </w:pPr>
     </w:lvl>
     <w:lvl w:ilvl="4">
       <w:numFmt w:val="bullet"/>
-      <w:lvlText w:val="o"/>
+      <w:lvlText w:val="•"/>
       <w:lvlJc w:val="left"/>
       <w:pPr>
-        <w:ind w:left="3600" w:hanging="360"/>
-      </w:pPr>
-      <w:rPr>
-        <w:rFonts w:ascii="Courier New" w:hAnsi="Courier New" w:cs="Courier New" w:hint="default"/>
-      </w:rPr>
+        <w:ind w:left="3600" w:hanging="480"/>
+      </w:pPr>
     </w:lvl>
     <w:lvl w:ilvl="5">
       <w:numFmt w:val="bullet"/>
-      <w:lvlText w:val=""/>
+      <w:lvlText w:val="–"/>
       <w:lvlJc w:val="left"/>
       <w:pPr>
-        <w:ind w:left="4320" w:hanging="360"/>
-      </w:pPr>
-      <w:rPr>
-        <w:rFonts w:ascii="Wingdings" w:hAnsi="Wingdings" w:cs="Wingdings" w:hint="default"/>
-      </w:rPr>
+        <w:ind w:left="4320" w:hanging="480"/>
+      </w:pPr>
     </w:lvl>
     <w:lvl w:ilvl="6">
       <w:numFmt w:val="bullet"/>
-      <w:lvlText w:val=""/>
+      <w:lvlText w:val="•"/>
       <w:lvlJc w:val="left"/>
       <w:pPr>
-        <w:ind w:left="5040" w:hanging="360"/>
-      </w:pPr>
-      <w:rPr>
-        <w:rFonts w:ascii="Symbol" w:hAnsi="Symbol" w:cs="Symbol" w:hint="default"/>
-      </w:rPr>
+        <w:ind w:left="5040" w:hanging="480"/>
+      </w:pPr>
     </w:lvl>
     <w:lvl w:ilvl="7">
       <w:numFmt w:val="bullet"/>
-      <w:lvlText w:val="o"/>
+      <w:lvlText w:val="–"/>
       <w:lvlJc w:val="left"/>
       <w:pPr>
-        <w:ind w:left="5760" w:hanging="360"/>
-      </w:pPr>
-      <w:rPr>
-        <w:rFonts w:ascii="Courier New" w:hAnsi="Courier New" w:cs="Courier New" w:hint="default"/>
-      </w:rPr>
+        <w:ind w:left="5760" w:hanging="480"/>
+      </w:pPr>
     </w:lvl>
     <w:lvl w:ilvl="8">
       <w:numFmt w:val="bullet"/>
-      <w:lvlText w:val=""/>
+      <w:lvlText w:val="•"/>
       <w:lvlJc w:val="left"/>
       <w:pPr>
-        <w:ind w:left="6480" w:hanging="360"/>
-      </w:pPr>
-      <w:rPr>
-        <w:rFonts w:ascii="Wingdings" w:hAnsi="Wingdings" w:cs="Wingdings" w:hint="default"/>
-      </w:rPr>
+        <w:ind w:left="6480" w:hanging="480"/>
+      </w:pPr>
     </w:lvl>
   </w:abstractNum>
   <w:abstractNum w:abstractNumId="99411">
-    <w:nsid w:val="00A99411"/>
+    <w:nsid w:val="A99411"/>
     <w:multiLevelType w:val="multilevel"/>
     <w:lvl w:ilvl="0">
       <w:start w:val="1"/>
@@ -5905,7 +5950,7 @@
       <w:lvlText w:val="%1."/>
       <w:lvlJc w:val="left"/>
       <w:pPr>
-        <w:ind w:left="720" w:hanging="360"/>
+        <w:ind w:left="720" w:hanging="480"/>
       </w:pPr>
     </w:lvl>
     <w:lvl w:ilvl="1">
@@ -5914,7 +5959,7 @@
       <w:lvlText w:val="%2."/>
       <w:lvlJc w:val="left"/>
       <w:pPr>
-        <w:ind w:left="1440" w:hanging="360"/>
+        <w:ind w:left="1440" w:hanging="480"/>
       </w:pPr>
     </w:lvl>
     <w:lvl w:ilvl="2">
@@ -5923,7 +5968,7 @@
       <w:lvlText w:val="%3."/>
       <w:lvlJc w:val="left"/>
       <w:pPr>
-        <w:ind w:left="2160" w:hanging="360"/>
+        <w:ind w:left="2160" w:hanging="480"/>
       </w:pPr>
     </w:lvl>
     <w:lvl w:ilvl="3">
@@ -5932,7 +5977,7 @@
       <w:lvlText w:val="%4."/>
       <w:lvlJc w:val="left"/>
       <w:pPr>
-        <w:ind w:left="2880" w:hanging="360"/>
+        <w:ind w:left="2880" w:hanging="480"/>
       </w:pPr>
     </w:lvl>
     <w:lvl w:ilvl="4">
@@ -5941,7 +5986,7 @@
       <w:lvlText w:val="%5."/>
       <w:lvlJc w:val="left"/>
       <w:pPr>
-        <w:ind w:left="3600" w:hanging="360"/>
+        <w:ind w:left="3600" w:hanging="480"/>
       </w:pPr>
     </w:lvl>
     <w:lvl w:ilvl="5">
@@ -5950,7 +5995,7 @@
       <w:lvlText w:val="%6."/>
       <w:lvlJc w:val="left"/>
       <w:pPr>
-        <w:ind w:left="4320" w:hanging="360"/>
+        <w:ind w:left="4320" w:hanging="480"/>
       </w:pPr>
     </w:lvl>
     <w:lvl w:ilvl="6">
@@ -5959,7 +6004,7 @@
       <w:lvlText w:val="%7."/>
       <w:lvlJc w:val="left"/>
       <w:pPr>
-        <w:ind w:left="5040" w:hanging="360"/>
+        <w:ind w:left="5040" w:hanging="480"/>
       </w:pPr>
     </w:lvl>
     <w:lvl w:ilvl="7">
@@ -5968,7 +6013,7 @@
       <w:lvlText w:val="%8."/>
       <w:lvlJc w:val="left"/>
       <w:pPr>
-        <w:ind w:left="5760" w:hanging="360"/>
+        <w:ind w:left="5760" w:hanging="480"/>
       </w:pPr>
     </w:lvl>
     <w:lvl w:ilvl="8">
@@ -5977,7 +6022,7 @@
       <w:lvlText w:val="%9."/>
       <w:lvlJc w:val="left"/>
       <w:pPr>
-        <w:ind w:left="6480" w:hanging="360"/>
+        <w:ind w:left="6480" w:hanging="480"/>
       </w:pPr>
     </w:lvl>
   </w:abstractNum>
@@ -6733,8 +6778,8 @@
     <w:name w:val="KeywordTok"/>
     <w:basedOn w:val="VerbatimChar"/>
     <w:rPr>
+      <w:color w:val="007020"/>
       <w:b/>
-      <w:color w:val="007020"/>
     </w:rPr>
   </w:style>
   <w:style w:type="character" w:customStyle="1" w:styleId="DataTypeTok">
@@ -6811,42 +6856,42 @@
     <w:name w:val="ImportTok"/>
     <w:basedOn w:val="VerbatimChar"/>
     <w:rPr>
+      <w:color w:val="008000"/>
       <w:b/>
-      <w:color w:val="008000"/>
     </w:rPr>
   </w:style>
   <w:style w:type="character" w:customStyle="1" w:styleId="CommentTok">
     <w:name w:val="CommentTok"/>
     <w:basedOn w:val="VerbatimChar"/>
     <w:rPr>
+      <w:color w:val="60a0b0"/>
       <w:i/>
-      <w:color w:val="60a0b0"/>
     </w:rPr>
   </w:style>
   <w:style w:type="character" w:customStyle="1" w:styleId="DocumentationTok">
     <w:name w:val="DocumentationTok"/>
     <w:basedOn w:val="VerbatimChar"/>
     <w:rPr>
+      <w:color w:val="ba2121"/>
       <w:i/>
-      <w:color w:val="ba2121"/>
     </w:rPr>
   </w:style>
   <w:style w:type="character" w:customStyle="1" w:styleId="AnnotationTok">
     <w:name w:val="AnnotationTok"/>
     <w:basedOn w:val="VerbatimChar"/>
     <w:rPr>
+      <w:color w:val="60a0b0"/>
       <w:b/>
       <w:i/>
-      <w:color w:val="60a0b0"/>
     </w:rPr>
   </w:style>
   <w:style w:type="character" w:customStyle="1" w:styleId="CommentVarTok">
     <w:name w:val="CommentVarTok"/>
     <w:basedOn w:val="VerbatimChar"/>
     <w:rPr>
+      <w:color w:val="60a0b0"/>
       <w:b/>
       <w:i/>
-      <w:color w:val="60a0b0"/>
     </w:rPr>
   </w:style>
   <w:style w:type="character" w:customStyle="1" w:styleId="OtherTok">
@@ -6874,8 +6919,8 @@
     <w:name w:val="ControlFlowTok"/>
     <w:basedOn w:val="VerbatimChar"/>
     <w:rPr>
+      <w:color w:val="007020"/>
       <w:b/>
-      <w:color w:val="007020"/>
     </w:rPr>
   </w:style>
   <w:style w:type="character" w:customStyle="1" w:styleId="OperatorTok">
@@ -6920,34 +6965,34 @@
     <w:name w:val="InformationTok"/>
     <w:basedOn w:val="VerbatimChar"/>
     <w:rPr>
+      <w:color w:val="60a0b0"/>
       <w:b/>
       <w:i/>
-      <w:color w:val="60a0b0"/>
     </w:rPr>
   </w:style>
   <w:style w:type="character" w:customStyle="1" w:styleId="WarningTok">
     <w:name w:val="WarningTok"/>
     <w:basedOn w:val="VerbatimChar"/>
     <w:rPr>
+      <w:color w:val="60a0b0"/>
       <w:b/>
       <w:i/>
-      <w:color w:val="60a0b0"/>
     </w:rPr>
   </w:style>
   <w:style w:type="character" w:customStyle="1" w:styleId="AlertTok">
     <w:name w:val="AlertTok"/>
     <w:basedOn w:val="VerbatimChar"/>
     <w:rPr>
+      <w:color w:val="ff0000"/>
       <w:b/>
-      <w:color w:val="ff0000"/>
     </w:rPr>
   </w:style>
   <w:style w:type="character" w:customStyle="1" w:styleId="ErrorTok">
     <w:name w:val="ErrorTok"/>
     <w:basedOn w:val="VerbatimChar"/>
     <w:rPr>
+      <w:color w:val="ff0000"/>
       <w:b/>
-      <w:color w:val="ff0000"/>
     </w:rPr>
   </w:style>
   <w:style w:type="character" w:customStyle="1" w:styleId="NormalTok">

</xml_diff>